<commit_message>
Created the Classes: RandomNumberGenerator, MersenneTwister and Movement to start implementing the movement of the enemies. Created a header file enums.h to keep there all the enums that we probably going to need for the game.
</commit_message>
<xml_diff>
--- a/documentation/Game_Design_Document.docx
+++ b/documentation/Game_Design_Document.docx
@@ -1,6 +1,6 @@
 
 <file path=word/document.xml><?xml version="1.0" encoding="utf-8"?>
-<w:document xmlns:wpc="http://schemas.microsoft.com/office/word/2010/wordprocessingCanvas" xmlns:mc="http://schemas.openxmlformats.org/markup-compatibility/2006" xmlns:o="urn:schemas-microsoft-com:office:office" xmlns:r="http://schemas.openxmlformats.org/officeDocument/2006/relationships" xmlns:m="http://schemas.openxmlformats.org/officeDocument/2006/math" xmlns:v="urn:schemas-microsoft-com:vml" xmlns:wp14="http://schemas.microsoft.com/office/word/2010/wordprocessingDrawing" xmlns:wp="http://schemas.openxmlformats.org/drawingml/2006/wordprocessingDrawing" xmlns:w10="urn:schemas-microsoft-com:office:word" xmlns:w="http://schemas.openxmlformats.org/wordprocessingml/2006/main" xmlns:w14="http://schemas.microsoft.com/office/word/2010/wordml" xmlns:wpg="http://schemas.microsoft.com/office/word/2010/wordprocessingGroup" xmlns:wpi="http://schemas.microsoft.com/office/word/2010/wordprocessingInk" xmlns:wne="http://schemas.microsoft.com/office/word/2006/wordml" xmlns:wps="http://schemas.microsoft.com/office/word/2010/wordprocessingShape" mc:Ignorable="w14 wp14">
+<w:document xmlns:wpc="http://schemas.microsoft.com/office/word/2010/wordprocessingCanvas" xmlns:cx="http://schemas.microsoft.com/office/drawing/2014/chartex" xmlns:cx1="http://schemas.microsoft.com/office/drawing/2015/9/8/chartex" xmlns:cx2="http://schemas.microsoft.com/office/drawing/2015/10/21/chartex" xmlns:cx3="http://schemas.microsoft.com/office/drawing/2016/5/9/chartex" xmlns:cx4="http://schemas.microsoft.com/office/drawing/2016/5/10/chartex" xmlns:cx5="http://schemas.microsoft.com/office/drawing/2016/5/11/chartex" xmlns:cx6="http://schemas.microsoft.com/office/drawing/2016/5/12/chartex" xmlns:cx7="http://schemas.microsoft.com/office/drawing/2016/5/13/chartex" xmlns:cx8="http://schemas.microsoft.com/office/drawing/2016/5/14/chartex" xmlns:mc="http://schemas.openxmlformats.org/markup-compatibility/2006" xmlns:aink="http://schemas.microsoft.com/office/drawing/2016/ink" xmlns:am3d="http://schemas.microsoft.com/office/drawing/2017/model3d" xmlns:o="urn:schemas-microsoft-com:office:office" xmlns:oel="http://schemas.microsoft.com/office/2019/extlst" xmlns:r="http://schemas.openxmlformats.org/officeDocument/2006/relationships" xmlns:m="http://schemas.openxmlformats.org/officeDocument/2006/math" xmlns:v="urn:schemas-microsoft-com:vml" xmlns:wp14="http://schemas.microsoft.com/office/word/2010/wordprocessingDrawing" xmlns:wp="http://schemas.openxmlformats.org/drawingml/2006/wordprocessingDrawing" xmlns:w10="urn:schemas-microsoft-com:office:word" xmlns:w="http://schemas.openxmlformats.org/wordprocessingml/2006/main" xmlns:w14="http://schemas.microsoft.com/office/word/2010/wordml" xmlns:w15="http://schemas.microsoft.com/office/word/2012/wordml" xmlns:w16cex="http://schemas.microsoft.com/office/word/2018/wordml/cex" xmlns:w16cid="http://schemas.microsoft.com/office/word/2016/wordml/cid" xmlns:w16="http://schemas.microsoft.com/office/word/2018/wordml" xmlns:w16du="http://schemas.microsoft.com/office/word/2023/wordml/word16du" xmlns:w16sdtdh="http://schemas.microsoft.com/office/word/2020/wordml/sdtdatahash" xmlns:w16sdtfl="http://schemas.microsoft.com/office/word/2024/wordml/sdtformatlock" xmlns:w16se="http://schemas.microsoft.com/office/word/2015/wordml/symex" xmlns:wpg="http://schemas.microsoft.com/office/word/2010/wordprocessingGroup" xmlns:wpi="http://schemas.microsoft.com/office/word/2010/wordprocessingInk" xmlns:wne="http://schemas.microsoft.com/office/word/2006/wordml" xmlns:wps="http://schemas.microsoft.com/office/word/2010/wordprocessingShape" mc:Ignorable="w14 w15 w16se w16cid w16 w16cex w16sdtdh w16sdtfl w16du wp14">
   <w:body>
     <w:p>
       <w:pPr>
@@ -137,7 +137,6 @@
           <w:lang w:val="en-US"/>
         </w:rPr>
       </w:pPr>
-      <w:proofErr w:type="spellStart"/>
       <w:r>
         <w:rPr>
           <w:rFonts w:asciiTheme="majorHAnsi" w:hAnsiTheme="majorHAnsi" w:cstheme="majorHAnsi"/>
@@ -145,37 +144,7 @@
           <w:szCs w:val="28"/>
           <w:lang w:val="en-US"/>
         </w:rPr>
-        <w:t>Elmin</w:t>
-      </w:r>
-      <w:proofErr w:type="spellEnd"/>
-      <w:r>
-        <w:rPr>
-          <w:rFonts w:asciiTheme="majorHAnsi" w:hAnsiTheme="majorHAnsi" w:cstheme="majorHAnsi"/>
-          <w:sz w:val="28"/>
-          <w:szCs w:val="28"/>
-          <w:lang w:val="en-US"/>
-        </w:rPr>
-        <w:t xml:space="preserve"> </w:t>
-      </w:r>
-      <w:proofErr w:type="spellStart"/>
-      <w:r>
-        <w:rPr>
-          <w:rFonts w:asciiTheme="majorHAnsi" w:hAnsiTheme="majorHAnsi" w:cstheme="majorHAnsi"/>
-          <w:sz w:val="28"/>
-          <w:szCs w:val="28"/>
-          <w:lang w:val="en-US"/>
-        </w:rPr>
-        <w:t>Smajlovic</w:t>
-      </w:r>
-      <w:proofErr w:type="spellEnd"/>
-      <w:r>
-        <w:rPr>
-          <w:rFonts w:asciiTheme="majorHAnsi" w:hAnsiTheme="majorHAnsi" w:cstheme="majorHAnsi"/>
-          <w:sz w:val="28"/>
-          <w:szCs w:val="28"/>
-          <w:lang w:val="en-US"/>
-        </w:rPr>
-        <w:t>, MSc.</w:t>
+        <w:t>Elmin Smajlovic, MSc.</w:t>
       </w:r>
     </w:p>
     <w:p>
@@ -251,7 +220,6 @@
           <w:lang w:val="en-US"/>
         </w:rPr>
       </w:pPr>
-      <w:proofErr w:type="spellStart"/>
       <w:r>
         <w:rPr>
           <w:rFonts w:asciiTheme="majorHAnsi" w:hAnsiTheme="majorHAnsi" w:cstheme="majorHAnsi"/>
@@ -259,39 +227,9 @@
           <w:szCs w:val="28"/>
           <w:lang w:val="en-US"/>
         </w:rPr>
-        <w:t>Antonios</w:t>
-      </w:r>
-      <w:proofErr w:type="spellEnd"/>
-      <w:r>
-        <w:rPr>
-          <w:rFonts w:asciiTheme="majorHAnsi" w:hAnsiTheme="majorHAnsi" w:cstheme="majorHAnsi"/>
-          <w:sz w:val="28"/>
-          <w:szCs w:val="28"/>
-          <w:lang w:val="en-US"/>
-        </w:rPr>
-        <w:t xml:space="preserve"> </w:t>
-      </w:r>
-      <w:proofErr w:type="spellStart"/>
-      <w:r>
-        <w:rPr>
-          <w:rFonts w:asciiTheme="majorHAnsi" w:hAnsiTheme="majorHAnsi" w:cstheme="majorHAnsi"/>
-          <w:sz w:val="28"/>
-          <w:szCs w:val="28"/>
-          <w:lang w:val="en-US"/>
-        </w:rPr>
-        <w:t>Sotiriou</w:t>
-      </w:r>
-      <w:proofErr w:type="spellEnd"/>
-      <w:r>
-        <w:rPr>
-          <w:rFonts w:asciiTheme="majorHAnsi" w:hAnsiTheme="majorHAnsi" w:cstheme="majorHAnsi"/>
-          <w:sz w:val="28"/>
-          <w:szCs w:val="28"/>
-          <w:lang w:val="en-US"/>
-        </w:rPr>
-        <w:t xml:space="preserve"> </w:t>
-      </w:r>
-      <w:hyperlink r:id="rId6" w:history="1">
+        <w:t xml:space="preserve">Antonios Sotiriou </w:t>
+      </w:r>
+      <w:hyperlink r:id="rId5" w:history="1">
         <w:r>
           <w:rPr>
             <w:rFonts w:asciiTheme="majorHAnsi" w:hAnsiTheme="majorHAnsi" w:cstheme="majorHAnsi"/>
@@ -383,29 +321,9 @@
           <w:szCs w:val="28"/>
           <w:lang w:val="en-US"/>
         </w:rPr>
-        <w:t xml:space="preserve">Julian </w:t>
-      </w:r>
-      <w:proofErr w:type="spellStart"/>
-      <w:r>
-        <w:rPr>
-          <w:rFonts w:asciiTheme="majorHAnsi" w:hAnsiTheme="majorHAnsi" w:cstheme="majorHAnsi"/>
-          <w:sz w:val="28"/>
-          <w:szCs w:val="28"/>
-          <w:lang w:val="en-US"/>
-        </w:rPr>
-        <w:t>Döberl</w:t>
-      </w:r>
-      <w:proofErr w:type="spellEnd"/>
-      <w:r>
-        <w:rPr>
-          <w:rFonts w:asciiTheme="majorHAnsi" w:hAnsiTheme="majorHAnsi" w:cstheme="majorHAnsi"/>
-          <w:sz w:val="28"/>
-          <w:szCs w:val="28"/>
-          <w:lang w:val="en-US"/>
-        </w:rPr>
-        <w:t xml:space="preserve"> </w:t>
-      </w:r>
-      <w:hyperlink r:id="rId7" w:history="1">
+        <w:t xml:space="preserve">Julian Döberl </w:t>
+      </w:r>
+      <w:hyperlink r:id="rId6" w:history="1">
         <w:r>
           <w:rPr>
             <w:rFonts w:asciiTheme="majorHAnsi" w:hAnsiTheme="majorHAnsi" w:cstheme="majorHAnsi"/>
@@ -425,6 +343,15 @@
           <w:lang w:val="en-US"/>
         </w:rPr>
       </w:pPr>
+      <w:r>
+        <w:rPr>
+          <w:rFonts w:asciiTheme="majorHAnsi" w:hAnsiTheme="majorHAnsi" w:cstheme="majorHAnsi"/>
+          <w:sz w:val="28"/>
+          <w:szCs w:val="28"/>
+          <w:lang w:val="en-US"/>
+        </w:rPr>
+        <w:t>Karabacek-</w:t>
+      </w:r>
       <w:proofErr w:type="spellStart"/>
       <w:r>
         <w:rPr>
@@ -433,7 +360,7 @@
           <w:szCs w:val="28"/>
           <w:lang w:val="en-US"/>
         </w:rPr>
-        <w:t>Karabacek-Shahri</w:t>
+        <w:t>Shahri</w:t>
       </w:r>
       <w:proofErr w:type="spellEnd"/>
       <w:r>
@@ -443,19 +370,19 @@
           <w:szCs w:val="28"/>
           <w:lang w:val="en-US"/>
         </w:rPr>
-        <w:t xml:space="preserve"> </w:t>
-      </w:r>
-      <w:proofErr w:type="spellStart"/>
-      <w:r>
+        <w:t xml:space="preserve"> Niloufar if25b137@technikum-wien.at</w:t>
+      </w:r>
+    </w:p>
+    <w:p>
+      <w:pPr>
+        <w:pStyle w:val="KeinLeerraum"/>
         <w:rPr>
           <w:rFonts w:asciiTheme="majorHAnsi" w:hAnsiTheme="majorHAnsi" w:cstheme="majorHAnsi"/>
           <w:sz w:val="28"/>
           <w:szCs w:val="28"/>
           <w:lang w:val="en-US"/>
         </w:rPr>
-        <w:t>Niloufar</w:t>
-      </w:r>
-      <w:proofErr w:type="spellEnd"/>
+      </w:pPr>
       <w:r>
         <w:rPr>
           <w:rFonts w:asciiTheme="majorHAnsi" w:hAnsiTheme="majorHAnsi" w:cstheme="majorHAnsi"/>
@@ -463,60 +390,9 @@
           <w:szCs w:val="28"/>
           <w:lang w:val="en-US"/>
         </w:rPr>
-        <w:t xml:space="preserve"> if25b137@technikum-wien.at</w:t>
-      </w:r>
-    </w:p>
-    <w:p>
-      <w:pPr>
-        <w:pStyle w:val="KeinLeerraum"/>
-        <w:rPr>
-          <w:rFonts w:asciiTheme="majorHAnsi" w:hAnsiTheme="majorHAnsi" w:cstheme="majorHAnsi"/>
-          <w:sz w:val="28"/>
-          <w:szCs w:val="28"/>
-          <w:lang w:val="en-US"/>
-        </w:rPr>
-      </w:pPr>
-      <w:proofErr w:type="spellStart"/>
-      <w:r>
-        <w:rPr>
-          <w:rFonts w:asciiTheme="majorHAnsi" w:hAnsiTheme="majorHAnsi" w:cstheme="majorHAnsi"/>
-          <w:sz w:val="28"/>
-          <w:szCs w:val="28"/>
-          <w:lang w:val="en-US"/>
-        </w:rPr>
-        <w:t>Karadeniz</w:t>
-      </w:r>
-      <w:proofErr w:type="spellEnd"/>
-      <w:r>
-        <w:rPr>
-          <w:rFonts w:asciiTheme="majorHAnsi" w:hAnsiTheme="majorHAnsi" w:cstheme="majorHAnsi"/>
-          <w:sz w:val="28"/>
-          <w:szCs w:val="28"/>
-          <w:lang w:val="en-US"/>
-        </w:rPr>
-        <w:t xml:space="preserve"> </w:t>
-      </w:r>
-      <w:proofErr w:type="spellStart"/>
-      <w:r>
-        <w:rPr>
-          <w:rFonts w:asciiTheme="majorHAnsi" w:hAnsiTheme="majorHAnsi" w:cstheme="majorHAnsi"/>
-          <w:sz w:val="28"/>
-          <w:szCs w:val="28"/>
-          <w:lang w:val="en-US"/>
-        </w:rPr>
-        <w:t>Alev</w:t>
-      </w:r>
-      <w:proofErr w:type="spellEnd"/>
-      <w:r>
-        <w:rPr>
-          <w:rFonts w:asciiTheme="majorHAnsi" w:hAnsiTheme="majorHAnsi" w:cstheme="majorHAnsi"/>
-          <w:sz w:val="28"/>
-          <w:szCs w:val="28"/>
-          <w:lang w:val="en-US"/>
-        </w:rPr>
-        <w:t xml:space="preserve"> </w:t>
-      </w:r>
-      <w:hyperlink r:id="rId8" w:history="1">
+        <w:t xml:space="preserve">Karadeniz Alev </w:t>
+      </w:r>
+      <w:hyperlink r:id="rId7" w:history="1">
         <w:r>
           <w:rPr>
             <w:rFonts w:asciiTheme="majorHAnsi" w:hAnsiTheme="majorHAnsi" w:cstheme="majorHAnsi"/>
@@ -553,25 +429,7 @@
           <w:sz w:val="28"/>
           <w:szCs w:val="28"/>
         </w:rPr>
-        <w:t xml:space="preserve"> </w:t>
-      </w:r>
-      <w:proofErr w:type="spellStart"/>
-      <w:r>
-        <w:rPr>
-          <w:rFonts w:asciiTheme="majorHAnsi" w:hAnsiTheme="majorHAnsi" w:cstheme="majorHAnsi"/>
-          <w:sz w:val="28"/>
-          <w:szCs w:val="28"/>
-        </w:rPr>
-        <w:t>Schubart</w:t>
-      </w:r>
-      <w:proofErr w:type="spellEnd"/>
-      <w:r>
-        <w:rPr>
-          <w:rFonts w:asciiTheme="majorHAnsi" w:hAnsiTheme="majorHAnsi" w:cstheme="majorHAnsi"/>
-          <w:sz w:val="28"/>
-          <w:szCs w:val="28"/>
-        </w:rPr>
-        <w:t xml:space="preserve"> </w:t>
+        <w:t xml:space="preserve"> Schubart </w:t>
       </w:r>
       <w:r>
         <w:rPr>
@@ -2776,18 +2634,454 @@
     </w:p>
     <w:p>
       <w:pPr>
-        <w:tabs>
-          <w:tab w:val="left" w:pos="6156"/>
-        </w:tabs>
-        <w:rPr>
-          <w:rFonts w:asciiTheme="majorHAnsi" w:hAnsiTheme="majorHAnsi" w:cstheme="majorHAnsi"/>
-        </w:rPr>
-      </w:pPr>
-      <w:r>
-        <w:rPr>
-          <w:rFonts w:asciiTheme="majorHAnsi" w:hAnsiTheme="majorHAnsi" w:cstheme="majorHAnsi"/>
-        </w:rPr>
-        <w:tab/>
+        <w:pStyle w:val="berschrift4"/>
+        <w:rPr>
+          <w:rFonts w:asciiTheme="majorHAnsi" w:hAnsiTheme="majorHAnsi" w:cstheme="majorHAnsi"/>
+          <w:color w:val="auto"/>
+          <w:sz w:val="28"/>
+          <w:szCs w:val="28"/>
+          <w:u w:val="single"/>
+        </w:rPr>
+      </w:pPr>
+      <w:proofErr w:type="spellStart"/>
+      <w:r>
+        <w:rPr>
+          <w:rStyle w:val="Fett"/>
+          <w:rFonts w:asciiTheme="majorHAnsi" w:hAnsiTheme="majorHAnsi" w:cstheme="majorHAnsi"/>
+          <w:b w:val="0"/>
+          <w:bCs w:val="0"/>
+          <w:color w:val="auto"/>
+          <w:sz w:val="28"/>
+          <w:szCs w:val="28"/>
+          <w:u w:val="single"/>
+        </w:rPr>
+        <w:t>RandomNumberGenerator</w:t>
+      </w:r>
+      <w:proofErr w:type="spellEnd"/>
+    </w:p>
+    <w:p>
+      <w:pPr>
+        <w:pStyle w:val="StandardWeb"/>
+        <w:rPr>
+          <w:rFonts w:asciiTheme="majorHAnsi" w:hAnsiTheme="majorHAnsi" w:cstheme="majorHAnsi"/>
+          <w:sz w:val="28"/>
+          <w:szCs w:val="28"/>
+        </w:rPr>
+      </w:pPr>
+      <w:r>
+        <w:rPr>
+          <w:rFonts w:asciiTheme="majorHAnsi" w:hAnsiTheme="majorHAnsi" w:cstheme="majorHAnsi"/>
+          <w:sz w:val="28"/>
+          <w:szCs w:val="28"/>
+        </w:rPr>
+        <w:t>Basis Klasse für das Generieren von zufälligen Zahlen.</w:t>
+      </w:r>
+      <w:r>
+        <w:rPr>
+          <w:rFonts w:asciiTheme="majorHAnsi" w:hAnsiTheme="majorHAnsi" w:cstheme="majorHAnsi"/>
+          <w:sz w:val="28"/>
+          <w:szCs w:val="28"/>
+        </w:rPr>
+        <w:t xml:space="preserve"> Deklariert nur reine virtuelle Methoden, die von Kindklassen deklariert werden</w:t>
+      </w:r>
+    </w:p>
+    <w:p>
+      <w:pPr>
+        <w:pStyle w:val="StandardWeb"/>
+        <w:numPr>
+          <w:ilvl w:val="0"/>
+          <w:numId w:val="18"/>
+        </w:numPr>
+        <w:rPr>
+          <w:rFonts w:asciiTheme="majorHAnsi" w:hAnsiTheme="majorHAnsi" w:cstheme="majorHAnsi"/>
+          <w:sz w:val="28"/>
+          <w:szCs w:val="28"/>
+        </w:rPr>
+      </w:pPr>
+      <w:proofErr w:type="spellStart"/>
+      <w:proofErr w:type="gramStart"/>
+      <w:r>
+        <w:rPr>
+          <w:rFonts w:asciiTheme="majorHAnsi" w:hAnsiTheme="majorHAnsi" w:cstheme="majorHAnsi"/>
+          <w:sz w:val="28"/>
+          <w:szCs w:val="28"/>
+        </w:rPr>
+        <w:t>getRandomNumber</w:t>
+      </w:r>
+      <w:proofErr w:type="spellEnd"/>
+      <w:r>
+        <w:rPr>
+          <w:rFonts w:asciiTheme="majorHAnsi" w:hAnsiTheme="majorHAnsi" w:cstheme="majorHAnsi"/>
+          <w:sz w:val="28"/>
+          <w:szCs w:val="28"/>
+        </w:rPr>
+        <w:t>(</w:t>
+      </w:r>
+      <w:proofErr w:type="spellStart"/>
+      <w:proofErr w:type="gramEnd"/>
+      <w:r>
+        <w:rPr>
+          <w:rFonts w:asciiTheme="majorHAnsi" w:hAnsiTheme="majorHAnsi" w:cstheme="majorHAnsi"/>
+          <w:sz w:val="28"/>
+          <w:szCs w:val="28"/>
+        </w:rPr>
+        <w:t>int</w:t>
+      </w:r>
+      <w:proofErr w:type="spellEnd"/>
+      <w:r>
+        <w:rPr>
+          <w:rFonts w:asciiTheme="majorHAnsi" w:hAnsiTheme="majorHAnsi" w:cstheme="majorHAnsi"/>
+          <w:sz w:val="28"/>
+          <w:szCs w:val="28"/>
+        </w:rPr>
+        <w:t xml:space="preserve"> von, </w:t>
+      </w:r>
+      <w:proofErr w:type="spellStart"/>
+      <w:r>
+        <w:rPr>
+          <w:rFonts w:asciiTheme="majorHAnsi" w:hAnsiTheme="majorHAnsi" w:cstheme="majorHAnsi"/>
+          <w:sz w:val="28"/>
+          <w:szCs w:val="28"/>
+        </w:rPr>
+        <w:t>int</w:t>
+      </w:r>
+      <w:proofErr w:type="spellEnd"/>
+      <w:r>
+        <w:rPr>
+          <w:rFonts w:asciiTheme="majorHAnsi" w:hAnsiTheme="majorHAnsi" w:cstheme="majorHAnsi"/>
+          <w:sz w:val="28"/>
+          <w:szCs w:val="28"/>
+        </w:rPr>
+        <w:t xml:space="preserve"> bis);</w:t>
+      </w:r>
+    </w:p>
+    <w:p>
+      <w:pPr>
+        <w:pStyle w:val="berschrift4"/>
+        <w:rPr>
+          <w:rStyle w:val="Fett"/>
+          <w:rFonts w:asciiTheme="majorHAnsi" w:hAnsiTheme="majorHAnsi" w:cstheme="majorHAnsi"/>
+          <w:b w:val="0"/>
+          <w:bCs w:val="0"/>
+          <w:color w:val="auto"/>
+          <w:sz w:val="28"/>
+          <w:szCs w:val="28"/>
+          <w:u w:val="single"/>
+        </w:rPr>
+      </w:pPr>
+      <w:proofErr w:type="spellStart"/>
+      <w:r>
+        <w:rPr>
+          <w:rStyle w:val="Fett"/>
+          <w:rFonts w:asciiTheme="majorHAnsi" w:hAnsiTheme="majorHAnsi" w:cstheme="majorHAnsi"/>
+          <w:b w:val="0"/>
+          <w:bCs w:val="0"/>
+          <w:color w:val="auto"/>
+          <w:sz w:val="28"/>
+          <w:szCs w:val="28"/>
+          <w:u w:val="single"/>
+        </w:rPr>
+        <w:lastRenderedPageBreak/>
+        <w:t>MersenneTwister</w:t>
+      </w:r>
+      <w:proofErr w:type="spellEnd"/>
+    </w:p>
+    <w:p>
+      <w:pPr>
+        <w:pStyle w:val="StandardWeb"/>
+        <w:rPr>
+          <w:rFonts w:asciiTheme="majorHAnsi" w:hAnsiTheme="majorHAnsi" w:cstheme="majorHAnsi"/>
+          <w:sz w:val="28"/>
+          <w:szCs w:val="28"/>
+        </w:rPr>
+      </w:pPr>
+      <w:r>
+        <w:rPr>
+          <w:rFonts w:asciiTheme="majorHAnsi" w:hAnsiTheme="majorHAnsi" w:cstheme="majorHAnsi"/>
+          <w:sz w:val="28"/>
+          <w:szCs w:val="28"/>
+        </w:rPr>
+        <w:t xml:space="preserve">Vererbt von der </w:t>
+      </w:r>
+      <w:proofErr w:type="spellStart"/>
+      <w:r>
+        <w:rPr>
+          <w:rFonts w:asciiTheme="majorHAnsi" w:hAnsiTheme="majorHAnsi" w:cstheme="majorHAnsi"/>
+          <w:sz w:val="28"/>
+          <w:szCs w:val="28"/>
+        </w:rPr>
+        <w:t>RandomNumberGenerator</w:t>
+      </w:r>
+      <w:proofErr w:type="spellEnd"/>
+      <w:r>
+        <w:rPr>
+          <w:rFonts w:asciiTheme="majorHAnsi" w:hAnsiTheme="majorHAnsi" w:cstheme="majorHAnsi"/>
+          <w:sz w:val="28"/>
+          <w:szCs w:val="28"/>
+        </w:rPr>
+        <w:t xml:space="preserve"> Klasse und deklariert die Methode </w:t>
+      </w:r>
+      <w:proofErr w:type="spellStart"/>
+      <w:proofErr w:type="gramStart"/>
+      <w:r>
+        <w:rPr>
+          <w:rFonts w:asciiTheme="majorHAnsi" w:hAnsiTheme="majorHAnsi" w:cstheme="majorHAnsi"/>
+          <w:sz w:val="28"/>
+          <w:szCs w:val="28"/>
+        </w:rPr>
+        <w:t>getRandomNumber</w:t>
+      </w:r>
+      <w:proofErr w:type="spellEnd"/>
+      <w:r>
+        <w:rPr>
+          <w:rFonts w:asciiTheme="majorHAnsi" w:hAnsiTheme="majorHAnsi" w:cstheme="majorHAnsi"/>
+          <w:sz w:val="28"/>
+          <w:szCs w:val="28"/>
+        </w:rPr>
+        <w:t>(</w:t>
+      </w:r>
+      <w:proofErr w:type="spellStart"/>
+      <w:proofErr w:type="gramEnd"/>
+      <w:r>
+        <w:rPr>
+          <w:rFonts w:asciiTheme="majorHAnsi" w:hAnsiTheme="majorHAnsi" w:cstheme="majorHAnsi"/>
+          <w:sz w:val="28"/>
+          <w:szCs w:val="28"/>
+        </w:rPr>
+        <w:t>int</w:t>
+      </w:r>
+      <w:proofErr w:type="spellEnd"/>
+      <w:r>
+        <w:rPr>
+          <w:rFonts w:asciiTheme="majorHAnsi" w:hAnsiTheme="majorHAnsi" w:cstheme="majorHAnsi"/>
+          <w:sz w:val="28"/>
+          <w:szCs w:val="28"/>
+        </w:rPr>
+        <w:t xml:space="preserve"> min, </w:t>
+      </w:r>
+      <w:proofErr w:type="spellStart"/>
+      <w:r>
+        <w:rPr>
+          <w:rFonts w:asciiTheme="majorHAnsi" w:hAnsiTheme="majorHAnsi" w:cstheme="majorHAnsi"/>
+          <w:sz w:val="28"/>
+          <w:szCs w:val="28"/>
+        </w:rPr>
+        <w:t>int</w:t>
+      </w:r>
+      <w:proofErr w:type="spellEnd"/>
+      <w:r>
+        <w:rPr>
+          <w:rFonts w:asciiTheme="majorHAnsi" w:hAnsiTheme="majorHAnsi" w:cstheme="majorHAnsi"/>
+          <w:sz w:val="28"/>
+          <w:szCs w:val="28"/>
+        </w:rPr>
+        <w:t xml:space="preserve"> </w:t>
+      </w:r>
+      <w:proofErr w:type="spellStart"/>
+      <w:r>
+        <w:rPr>
+          <w:rFonts w:asciiTheme="majorHAnsi" w:hAnsiTheme="majorHAnsi" w:cstheme="majorHAnsi"/>
+          <w:sz w:val="28"/>
+          <w:szCs w:val="28"/>
+        </w:rPr>
+        <w:t>max</w:t>
+      </w:r>
+      <w:proofErr w:type="spellEnd"/>
+      <w:r>
+        <w:rPr>
+          <w:rFonts w:asciiTheme="majorHAnsi" w:hAnsiTheme="majorHAnsi" w:cstheme="majorHAnsi"/>
+          <w:sz w:val="28"/>
+          <w:szCs w:val="28"/>
+        </w:rPr>
+        <w:t xml:space="preserve">). Gibt ein </w:t>
+      </w:r>
+      <w:proofErr w:type="gramStart"/>
+      <w:r>
+        <w:rPr>
+          <w:rFonts w:asciiTheme="majorHAnsi" w:hAnsiTheme="majorHAnsi" w:cstheme="majorHAnsi"/>
+          <w:sz w:val="28"/>
+          <w:szCs w:val="28"/>
+        </w:rPr>
+        <w:t>Integer</w:t>
+      </w:r>
+      <w:proofErr w:type="gramEnd"/>
+      <w:r>
+        <w:rPr>
+          <w:rFonts w:asciiTheme="majorHAnsi" w:hAnsiTheme="majorHAnsi" w:cstheme="majorHAnsi"/>
+          <w:sz w:val="28"/>
+          <w:szCs w:val="28"/>
+        </w:rPr>
+        <w:t xml:space="preserve"> zwischen min und </w:t>
+      </w:r>
+      <w:proofErr w:type="spellStart"/>
+      <w:r>
+        <w:rPr>
+          <w:rFonts w:asciiTheme="majorHAnsi" w:hAnsiTheme="majorHAnsi" w:cstheme="majorHAnsi"/>
+          <w:sz w:val="28"/>
+          <w:szCs w:val="28"/>
+        </w:rPr>
+        <w:t>max</w:t>
+      </w:r>
+      <w:proofErr w:type="spellEnd"/>
+      <w:r>
+        <w:rPr>
+          <w:rFonts w:asciiTheme="majorHAnsi" w:hAnsiTheme="majorHAnsi" w:cstheme="majorHAnsi"/>
+          <w:sz w:val="28"/>
+          <w:szCs w:val="28"/>
+        </w:rPr>
+        <w:t xml:space="preserve"> </w:t>
+      </w:r>
+      <w:proofErr w:type="spellStart"/>
+      <w:r>
+        <w:rPr>
+          <w:rFonts w:asciiTheme="majorHAnsi" w:hAnsiTheme="majorHAnsi" w:cstheme="majorHAnsi"/>
+          <w:sz w:val="28"/>
+          <w:szCs w:val="28"/>
+        </w:rPr>
+        <w:t>zur</w:t>
+      </w:r>
+      <w:r>
+        <w:rPr>
+          <w:rFonts w:asciiTheme="majorHAnsi" w:hAnsiTheme="majorHAnsi" w:cstheme="majorHAnsi"/>
+          <w:sz w:val="28"/>
+          <w:szCs w:val="28"/>
+        </w:rPr>
+        <w:t>r</w:t>
+      </w:r>
+      <w:r>
+        <w:rPr>
+          <w:rFonts w:asciiTheme="majorHAnsi" w:hAnsiTheme="majorHAnsi" w:cstheme="majorHAnsi"/>
+          <w:sz w:val="28"/>
+          <w:szCs w:val="28"/>
+        </w:rPr>
+        <w:t>ück</w:t>
+      </w:r>
+      <w:proofErr w:type="spellEnd"/>
+      <w:r>
+        <w:rPr>
+          <w:rFonts w:asciiTheme="majorHAnsi" w:hAnsiTheme="majorHAnsi" w:cstheme="majorHAnsi"/>
+          <w:sz w:val="28"/>
+          <w:szCs w:val="28"/>
+        </w:rPr>
+        <w:t xml:space="preserve">, mit min und </w:t>
+      </w:r>
+      <w:proofErr w:type="spellStart"/>
+      <w:r>
+        <w:rPr>
+          <w:rFonts w:asciiTheme="majorHAnsi" w:hAnsiTheme="majorHAnsi" w:cstheme="majorHAnsi"/>
+          <w:sz w:val="28"/>
+          <w:szCs w:val="28"/>
+        </w:rPr>
+        <w:t>max</w:t>
+      </w:r>
+      <w:proofErr w:type="spellEnd"/>
+      <w:r>
+        <w:rPr>
+          <w:rFonts w:asciiTheme="majorHAnsi" w:hAnsiTheme="majorHAnsi" w:cstheme="majorHAnsi"/>
+          <w:sz w:val="28"/>
+          <w:szCs w:val="28"/>
+        </w:rPr>
+        <w:t xml:space="preserve"> auch inbegriffen.</w:t>
+      </w:r>
+    </w:p>
+    <w:p>
+      <w:pPr>
+        <w:pStyle w:val="berschrift4"/>
+        <w:rPr>
+          <w:rStyle w:val="Fett"/>
+          <w:rFonts w:asciiTheme="majorHAnsi" w:hAnsiTheme="majorHAnsi" w:cstheme="majorHAnsi"/>
+          <w:b w:val="0"/>
+          <w:bCs w:val="0"/>
+          <w:color w:val="auto"/>
+          <w:sz w:val="28"/>
+          <w:szCs w:val="28"/>
+          <w:u w:val="single"/>
+        </w:rPr>
+      </w:pPr>
+      <w:r>
+        <w:rPr>
+          <w:rStyle w:val="Fett"/>
+          <w:rFonts w:asciiTheme="majorHAnsi" w:hAnsiTheme="majorHAnsi" w:cstheme="majorHAnsi"/>
+          <w:b w:val="0"/>
+          <w:bCs w:val="0"/>
+          <w:color w:val="auto"/>
+          <w:sz w:val="28"/>
+          <w:szCs w:val="28"/>
+          <w:u w:val="single"/>
+        </w:rPr>
+        <w:t>Movement</w:t>
+      </w:r>
+    </w:p>
+    <w:p>
+      <w:pPr>
+        <w:pStyle w:val="StandardWeb"/>
+        <w:rPr>
+          <w:rFonts w:asciiTheme="majorHAnsi" w:hAnsiTheme="majorHAnsi" w:cstheme="majorHAnsi"/>
+          <w:sz w:val="28"/>
+          <w:szCs w:val="28"/>
+        </w:rPr>
+      </w:pPr>
+      <w:r>
+        <w:rPr>
+          <w:rFonts w:asciiTheme="majorHAnsi" w:hAnsiTheme="majorHAnsi" w:cstheme="majorHAnsi"/>
+          <w:sz w:val="28"/>
+          <w:szCs w:val="28"/>
+        </w:rPr>
+        <w:t xml:space="preserve">Basis Klasse um verschiedene Bewegungen zu </w:t>
+      </w:r>
+      <w:proofErr w:type="spellStart"/>
+      <w:r>
+        <w:rPr>
+          <w:rFonts w:asciiTheme="majorHAnsi" w:hAnsiTheme="majorHAnsi" w:cstheme="majorHAnsi"/>
+          <w:sz w:val="28"/>
+          <w:szCs w:val="28"/>
+        </w:rPr>
+        <w:t>kapsulieren</w:t>
+      </w:r>
+      <w:proofErr w:type="spellEnd"/>
+      <w:r>
+        <w:rPr>
+          <w:rFonts w:asciiTheme="majorHAnsi" w:hAnsiTheme="majorHAnsi" w:cstheme="majorHAnsi"/>
+          <w:sz w:val="28"/>
+          <w:szCs w:val="28"/>
+        </w:rPr>
+        <w:t xml:space="preserve">. Alle die Bewegungen erben von dieser Klasse. Enthält eine </w:t>
+      </w:r>
+      <w:proofErr w:type="spellStart"/>
+      <w:r>
+        <w:rPr>
+          <w:rFonts w:asciiTheme="majorHAnsi" w:hAnsiTheme="majorHAnsi" w:cstheme="majorHAnsi"/>
+          <w:sz w:val="28"/>
+          <w:szCs w:val="28"/>
+        </w:rPr>
+        <w:t>MerseneTwister</w:t>
+      </w:r>
+      <w:proofErr w:type="spellEnd"/>
+      <w:r>
+        <w:rPr>
+          <w:rFonts w:asciiTheme="majorHAnsi" w:hAnsiTheme="majorHAnsi" w:cstheme="majorHAnsi"/>
+          <w:sz w:val="28"/>
+          <w:szCs w:val="28"/>
+        </w:rPr>
+        <w:t xml:space="preserve"> </w:t>
+      </w:r>
+      <w:proofErr w:type="gramStart"/>
+      <w:r>
+        <w:rPr>
+          <w:rFonts w:asciiTheme="majorHAnsi" w:hAnsiTheme="majorHAnsi" w:cstheme="majorHAnsi"/>
+          <w:sz w:val="28"/>
+          <w:szCs w:val="28"/>
+        </w:rPr>
+        <w:t>Klasse</w:t>
+      </w:r>
+      <w:proofErr w:type="gramEnd"/>
+      <w:r>
+        <w:rPr>
+          <w:rFonts w:asciiTheme="majorHAnsi" w:hAnsiTheme="majorHAnsi" w:cstheme="majorHAnsi"/>
+          <w:sz w:val="28"/>
+          <w:szCs w:val="28"/>
+        </w:rPr>
+        <w:t xml:space="preserve"> um zufällige Werte für die Kindklassen verfügbar zu stellen.</w:t>
       </w:r>
     </w:p>
     <w:p>
@@ -2920,7 +3214,6 @@
           <w:sz w:val="28"/>
           <w:szCs w:val="28"/>
         </w:rPr>
-        <w:lastRenderedPageBreak/>
         <w:t>Wird genutzt für:</w:t>
       </w:r>
     </w:p>
@@ -3194,6 +3487,7 @@
       <w:r>
         <w:rPr>
           <w:rFonts w:asciiTheme="majorHAnsi" w:hAnsiTheme="majorHAnsi" w:cstheme="majorHAnsi"/>
+          <w:noProof/>
           <w:sz w:val="28"/>
           <w:szCs w:val="28"/>
         </w:rPr>
@@ -3213,7 +3507,7 @@
                     <pic:cNvPicPr/>
                   </pic:nvPicPr>
                   <pic:blipFill>
-                    <a:blip r:embed="rId9"/>
+                    <a:blip r:embed="rId8"/>
                     <a:stretch>
                       <a:fillRect/>
                     </a:stretch>
@@ -3251,8 +3545,6 @@
           <w:szCs w:val="28"/>
         </w:rPr>
       </w:pPr>
-      <w:bookmarkStart w:id="0" w:name="_GoBack"/>
-      <w:bookmarkEnd w:id="0"/>
     </w:p>
     <w:p>
       <w:pPr>
@@ -3365,8 +3657,8 @@
 </file>
 
 <file path=word/numbering.xml><?xml version="1.0" encoding="utf-8"?>
-<w:numbering xmlns:wpc="http://schemas.microsoft.com/office/word/2010/wordprocessingCanvas" xmlns:mc="http://schemas.openxmlformats.org/markup-compatibility/2006" xmlns:o="urn:schemas-microsoft-com:office:office" xmlns:r="http://schemas.openxmlformats.org/officeDocument/2006/relationships" xmlns:m="http://schemas.openxmlformats.org/officeDocument/2006/math" xmlns:v="urn:schemas-microsoft-com:vml" xmlns:wp14="http://schemas.microsoft.com/office/word/2010/wordprocessingDrawing" xmlns:wp="http://schemas.openxmlformats.org/drawingml/2006/wordprocessingDrawing" xmlns:w10="urn:schemas-microsoft-com:office:word" xmlns:w="http://schemas.openxmlformats.org/wordprocessingml/2006/main" xmlns:w14="http://schemas.microsoft.com/office/word/2010/wordml" xmlns:wpg="http://schemas.microsoft.com/office/word/2010/wordprocessingGroup" xmlns:wpi="http://schemas.microsoft.com/office/word/2010/wordprocessingInk" xmlns:wne="http://schemas.microsoft.com/office/word/2006/wordml" xmlns:wps="http://schemas.microsoft.com/office/word/2010/wordprocessingShape" mc:Ignorable="w14 wp14">
-  <w:abstractNum w:abstractNumId="0">
+<w:numbering xmlns:wpc="http://schemas.microsoft.com/office/word/2010/wordprocessingCanvas" xmlns:cx="http://schemas.microsoft.com/office/drawing/2014/chartex" xmlns:cx1="http://schemas.microsoft.com/office/drawing/2015/9/8/chartex" xmlns:cx2="http://schemas.microsoft.com/office/drawing/2015/10/21/chartex" xmlns:cx3="http://schemas.microsoft.com/office/drawing/2016/5/9/chartex" xmlns:cx4="http://schemas.microsoft.com/office/drawing/2016/5/10/chartex" xmlns:cx5="http://schemas.microsoft.com/office/drawing/2016/5/11/chartex" xmlns:cx6="http://schemas.microsoft.com/office/drawing/2016/5/12/chartex" xmlns:cx7="http://schemas.microsoft.com/office/drawing/2016/5/13/chartex" xmlns:cx8="http://schemas.microsoft.com/office/drawing/2016/5/14/chartex" xmlns:mc="http://schemas.openxmlformats.org/markup-compatibility/2006" xmlns:aink="http://schemas.microsoft.com/office/drawing/2016/ink" xmlns:am3d="http://schemas.microsoft.com/office/drawing/2017/model3d" xmlns:o="urn:schemas-microsoft-com:office:office" xmlns:oel="http://schemas.microsoft.com/office/2019/extlst" xmlns:r="http://schemas.openxmlformats.org/officeDocument/2006/relationships" xmlns:m="http://schemas.openxmlformats.org/officeDocument/2006/math" xmlns:v="urn:schemas-microsoft-com:vml" xmlns:wp14="http://schemas.microsoft.com/office/word/2010/wordprocessingDrawing" xmlns:wp="http://schemas.openxmlformats.org/drawingml/2006/wordprocessingDrawing" xmlns:w10="urn:schemas-microsoft-com:office:word" xmlns:w="http://schemas.openxmlformats.org/wordprocessingml/2006/main" xmlns:w14="http://schemas.microsoft.com/office/word/2010/wordml" xmlns:w15="http://schemas.microsoft.com/office/word/2012/wordml" xmlns:w16cex="http://schemas.microsoft.com/office/word/2018/wordml/cex" xmlns:w16cid="http://schemas.microsoft.com/office/word/2016/wordml/cid" xmlns:w16="http://schemas.microsoft.com/office/word/2018/wordml" xmlns:w16du="http://schemas.microsoft.com/office/word/2023/wordml/word16du" xmlns:w16sdtdh="http://schemas.microsoft.com/office/word/2020/wordml/sdtdatahash" xmlns:w16sdtfl="http://schemas.microsoft.com/office/word/2024/wordml/sdtformatlock" xmlns:w16se="http://schemas.microsoft.com/office/word/2015/wordml/symex" xmlns:wpg="http://schemas.microsoft.com/office/word/2010/wordprocessingGroup" xmlns:wpi="http://schemas.microsoft.com/office/word/2010/wordprocessingInk" xmlns:wne="http://schemas.microsoft.com/office/word/2006/wordml" xmlns:wps="http://schemas.microsoft.com/office/word/2010/wordprocessingShape" mc:Ignorable="w14 w15 w16se w16cid w16 w16cex w16sdtdh w16sdtfl w16du wp14">
+  <w:abstractNum w:abstractNumId="0" w15:restartNumberingAfterBreak="0">
     <w:nsid w:val="0E6B5316"/>
     <w:multiLevelType w:val="multilevel"/>
     <w:tmpl w:val="549099A2"/>
@@ -3515,7 +3807,120 @@
       </w:rPr>
     </w:lvl>
   </w:abstractNum>
-  <w:abstractNum w:abstractNumId="1">
+  <w:abstractNum w:abstractNumId="1" w15:restartNumberingAfterBreak="0">
+    <w:nsid w:val="0E812694"/>
+    <w:multiLevelType w:val="hybridMultilevel"/>
+    <w:tmpl w:val="8C1EBE38"/>
+    <w:lvl w:ilvl="0" w:tplc="0C070001">
+      <w:start w:val="1"/>
+      <w:numFmt w:val="bullet"/>
+      <w:lvlText w:val=""/>
+      <w:lvlJc w:val="left"/>
+      <w:pPr>
+        <w:ind w:left="720" w:hanging="360"/>
+      </w:pPr>
+      <w:rPr>
+        <w:rFonts w:ascii="Symbol" w:hAnsi="Symbol" w:hint="default"/>
+      </w:rPr>
+    </w:lvl>
+    <w:lvl w:ilvl="1" w:tplc="0C070003" w:tentative="1">
+      <w:start w:val="1"/>
+      <w:numFmt w:val="bullet"/>
+      <w:lvlText w:val="o"/>
+      <w:lvlJc w:val="left"/>
+      <w:pPr>
+        <w:ind w:left="1440" w:hanging="360"/>
+      </w:pPr>
+      <w:rPr>
+        <w:rFonts w:ascii="Courier New" w:hAnsi="Courier New" w:cs="Courier New" w:hint="default"/>
+      </w:rPr>
+    </w:lvl>
+    <w:lvl w:ilvl="2" w:tplc="0C070005" w:tentative="1">
+      <w:start w:val="1"/>
+      <w:numFmt w:val="bullet"/>
+      <w:lvlText w:val=""/>
+      <w:lvlJc w:val="left"/>
+      <w:pPr>
+        <w:ind w:left="2160" w:hanging="360"/>
+      </w:pPr>
+      <w:rPr>
+        <w:rFonts w:ascii="Wingdings" w:hAnsi="Wingdings" w:hint="default"/>
+      </w:rPr>
+    </w:lvl>
+    <w:lvl w:ilvl="3" w:tplc="0C070001" w:tentative="1">
+      <w:start w:val="1"/>
+      <w:numFmt w:val="bullet"/>
+      <w:lvlText w:val=""/>
+      <w:lvlJc w:val="left"/>
+      <w:pPr>
+        <w:ind w:left="2880" w:hanging="360"/>
+      </w:pPr>
+      <w:rPr>
+        <w:rFonts w:ascii="Symbol" w:hAnsi="Symbol" w:hint="default"/>
+      </w:rPr>
+    </w:lvl>
+    <w:lvl w:ilvl="4" w:tplc="0C070003" w:tentative="1">
+      <w:start w:val="1"/>
+      <w:numFmt w:val="bullet"/>
+      <w:lvlText w:val="o"/>
+      <w:lvlJc w:val="left"/>
+      <w:pPr>
+        <w:ind w:left="3600" w:hanging="360"/>
+      </w:pPr>
+      <w:rPr>
+        <w:rFonts w:ascii="Courier New" w:hAnsi="Courier New" w:cs="Courier New" w:hint="default"/>
+      </w:rPr>
+    </w:lvl>
+    <w:lvl w:ilvl="5" w:tplc="0C070005" w:tentative="1">
+      <w:start w:val="1"/>
+      <w:numFmt w:val="bullet"/>
+      <w:lvlText w:val=""/>
+      <w:lvlJc w:val="left"/>
+      <w:pPr>
+        <w:ind w:left="4320" w:hanging="360"/>
+      </w:pPr>
+      <w:rPr>
+        <w:rFonts w:ascii="Wingdings" w:hAnsi="Wingdings" w:hint="default"/>
+      </w:rPr>
+    </w:lvl>
+    <w:lvl w:ilvl="6" w:tplc="0C070001" w:tentative="1">
+      <w:start w:val="1"/>
+      <w:numFmt w:val="bullet"/>
+      <w:lvlText w:val=""/>
+      <w:lvlJc w:val="left"/>
+      <w:pPr>
+        <w:ind w:left="5040" w:hanging="360"/>
+      </w:pPr>
+      <w:rPr>
+        <w:rFonts w:ascii="Symbol" w:hAnsi="Symbol" w:hint="default"/>
+      </w:rPr>
+    </w:lvl>
+    <w:lvl w:ilvl="7" w:tplc="0C070003" w:tentative="1">
+      <w:start w:val="1"/>
+      <w:numFmt w:val="bullet"/>
+      <w:lvlText w:val="o"/>
+      <w:lvlJc w:val="left"/>
+      <w:pPr>
+        <w:ind w:left="5760" w:hanging="360"/>
+      </w:pPr>
+      <w:rPr>
+        <w:rFonts w:ascii="Courier New" w:hAnsi="Courier New" w:cs="Courier New" w:hint="default"/>
+      </w:rPr>
+    </w:lvl>
+    <w:lvl w:ilvl="8" w:tplc="0C070005" w:tentative="1">
+      <w:start w:val="1"/>
+      <w:numFmt w:val="bullet"/>
+      <w:lvlText w:val=""/>
+      <w:lvlJc w:val="left"/>
+      <w:pPr>
+        <w:ind w:left="6480" w:hanging="360"/>
+      </w:pPr>
+      <w:rPr>
+        <w:rFonts w:ascii="Wingdings" w:hAnsi="Wingdings" w:hint="default"/>
+      </w:rPr>
+    </w:lvl>
+  </w:abstractNum>
+  <w:abstractNum w:abstractNumId="2" w15:restartNumberingAfterBreak="0">
     <w:nsid w:val="16F8581A"/>
     <w:multiLevelType w:val="multilevel"/>
     <w:tmpl w:val="4606DF70"/>
@@ -3664,7 +4069,7 @@
       </w:rPr>
     </w:lvl>
   </w:abstractNum>
-  <w:abstractNum w:abstractNumId="2">
+  <w:abstractNum w:abstractNumId="3" w15:restartNumberingAfterBreak="0">
     <w:nsid w:val="1C786954"/>
     <w:multiLevelType w:val="multilevel"/>
     <w:tmpl w:val="09CC29BA"/>
@@ -3813,7 +4218,7 @@
       </w:rPr>
     </w:lvl>
   </w:abstractNum>
-  <w:abstractNum w:abstractNumId="3">
+  <w:abstractNum w:abstractNumId="4" w15:restartNumberingAfterBreak="0">
     <w:nsid w:val="1F1F2858"/>
     <w:multiLevelType w:val="multilevel"/>
     <w:tmpl w:val="0576F1DA"/>
@@ -3962,7 +4367,7 @@
       </w:rPr>
     </w:lvl>
   </w:abstractNum>
-  <w:abstractNum w:abstractNumId="4">
+  <w:abstractNum w:abstractNumId="5" w15:restartNumberingAfterBreak="0">
     <w:nsid w:val="1FB11133"/>
     <w:multiLevelType w:val="multilevel"/>
     <w:tmpl w:val="0BBA40A0"/>
@@ -4111,7 +4516,7 @@
       </w:rPr>
     </w:lvl>
   </w:abstractNum>
-  <w:abstractNum w:abstractNumId="5">
+  <w:abstractNum w:abstractNumId="6" w15:restartNumberingAfterBreak="0">
     <w:nsid w:val="21FE38C5"/>
     <w:multiLevelType w:val="multilevel"/>
     <w:tmpl w:val="38D474A4"/>
@@ -4260,7 +4665,7 @@
       </w:rPr>
     </w:lvl>
   </w:abstractNum>
-  <w:abstractNum w:abstractNumId="6">
+  <w:abstractNum w:abstractNumId="7" w15:restartNumberingAfterBreak="0">
     <w:nsid w:val="24976606"/>
     <w:multiLevelType w:val="multilevel"/>
     <w:tmpl w:val="5E5A3F9A"/>
@@ -4409,7 +4814,7 @@
       </w:rPr>
     </w:lvl>
   </w:abstractNum>
-  <w:abstractNum w:abstractNumId="7">
+  <w:abstractNum w:abstractNumId="8" w15:restartNumberingAfterBreak="0">
     <w:nsid w:val="24DC4C7A"/>
     <w:multiLevelType w:val="hybridMultilevel"/>
     <w:tmpl w:val="6D72084E"/>
@@ -4522,7 +4927,7 @@
       </w:rPr>
     </w:lvl>
   </w:abstractNum>
-  <w:abstractNum w:abstractNumId="8">
+  <w:abstractNum w:abstractNumId="9" w15:restartNumberingAfterBreak="0">
     <w:nsid w:val="272F6064"/>
     <w:multiLevelType w:val="multilevel"/>
     <w:tmpl w:val="3CC23E46"/>
@@ -4671,7 +5076,7 @@
       </w:rPr>
     </w:lvl>
   </w:abstractNum>
-  <w:abstractNum w:abstractNumId="9">
+  <w:abstractNum w:abstractNumId="10" w15:restartNumberingAfterBreak="0">
     <w:nsid w:val="29B71396"/>
     <w:multiLevelType w:val="multilevel"/>
     <w:tmpl w:val="4086CE42"/>
@@ -4820,7 +5225,7 @@
       </w:rPr>
     </w:lvl>
   </w:abstractNum>
-  <w:abstractNum w:abstractNumId="10">
+  <w:abstractNum w:abstractNumId="11" w15:restartNumberingAfterBreak="0">
     <w:nsid w:val="2CA32DC0"/>
     <w:multiLevelType w:val="multilevel"/>
     <w:tmpl w:val="B028925C"/>
@@ -4969,7 +5374,7 @@
       </w:rPr>
     </w:lvl>
   </w:abstractNum>
-  <w:abstractNum w:abstractNumId="11">
+  <w:abstractNum w:abstractNumId="12" w15:restartNumberingAfterBreak="0">
     <w:nsid w:val="390E0A35"/>
     <w:multiLevelType w:val="multilevel"/>
     <w:tmpl w:val="956CC45A"/>
@@ -5118,7 +5523,7 @@
       </w:rPr>
     </w:lvl>
   </w:abstractNum>
-  <w:abstractNum w:abstractNumId="12">
+  <w:abstractNum w:abstractNumId="13" w15:restartNumberingAfterBreak="0">
     <w:nsid w:val="3A7B47AC"/>
     <w:multiLevelType w:val="multilevel"/>
     <w:tmpl w:val="ACA0EE6A"/>
@@ -5267,7 +5672,7 @@
       </w:rPr>
     </w:lvl>
   </w:abstractNum>
-  <w:abstractNum w:abstractNumId="13">
+  <w:abstractNum w:abstractNumId="14" w15:restartNumberingAfterBreak="0">
     <w:nsid w:val="60FF6CBE"/>
     <w:multiLevelType w:val="multilevel"/>
     <w:tmpl w:val="14C29780"/>
@@ -5416,7 +5821,7 @@
       </w:rPr>
     </w:lvl>
   </w:abstractNum>
-  <w:abstractNum w:abstractNumId="14">
+  <w:abstractNum w:abstractNumId="15" w15:restartNumberingAfterBreak="0">
     <w:nsid w:val="63283014"/>
     <w:multiLevelType w:val="multilevel"/>
     <w:tmpl w:val="52F86486"/>
@@ -5565,7 +5970,7 @@
       </w:rPr>
     </w:lvl>
   </w:abstractNum>
-  <w:abstractNum w:abstractNumId="15">
+  <w:abstractNum w:abstractNumId="16" w15:restartNumberingAfterBreak="0">
     <w:nsid w:val="6A5042A6"/>
     <w:multiLevelType w:val="multilevel"/>
     <w:tmpl w:val="311A3EEC"/>
@@ -5714,7 +6119,7 @@
       </w:rPr>
     </w:lvl>
   </w:abstractNum>
-  <w:abstractNum w:abstractNumId="16">
+  <w:abstractNum w:abstractNumId="17" w15:restartNumberingAfterBreak="0">
     <w:nsid w:val="7F814B37"/>
     <w:multiLevelType w:val="hybridMultilevel"/>
     <w:tmpl w:val="64267058"/>
@@ -5827,62 +6232,65 @@
       </w:rPr>
     </w:lvl>
   </w:abstractNum>
-  <w:num w:numId="1">
+  <w:num w:numId="1" w16cid:durableId="889152929">
+    <w:abstractNumId w:val="17"/>
+  </w:num>
+  <w:num w:numId="2" w16cid:durableId="1550409964">
+    <w:abstractNumId w:val="8"/>
+  </w:num>
+  <w:num w:numId="3" w16cid:durableId="2097358045">
+    <w:abstractNumId w:val="3"/>
+  </w:num>
+  <w:num w:numId="4" w16cid:durableId="971667355">
+    <w:abstractNumId w:val="15"/>
+  </w:num>
+  <w:num w:numId="5" w16cid:durableId="1725375104">
+    <w:abstractNumId w:val="14"/>
+  </w:num>
+  <w:num w:numId="6" w16cid:durableId="1469082097">
+    <w:abstractNumId w:val="4"/>
+  </w:num>
+  <w:num w:numId="7" w16cid:durableId="1355577372">
     <w:abstractNumId w:val="16"/>
   </w:num>
-  <w:num w:numId="2">
+  <w:num w:numId="8" w16cid:durableId="1080446848">
+    <w:abstractNumId w:val="11"/>
+  </w:num>
+  <w:num w:numId="9" w16cid:durableId="1706440483">
     <w:abstractNumId w:val="7"/>
   </w:num>
-  <w:num w:numId="3">
+  <w:num w:numId="10" w16cid:durableId="1984388956">
+    <w:abstractNumId w:val="9"/>
+  </w:num>
+  <w:num w:numId="11" w16cid:durableId="417408391">
+    <w:abstractNumId w:val="10"/>
+  </w:num>
+  <w:num w:numId="12" w16cid:durableId="1224489640">
+    <w:abstractNumId w:val="6"/>
+  </w:num>
+  <w:num w:numId="13" w16cid:durableId="644941892">
     <w:abstractNumId w:val="2"/>
   </w:num>
-  <w:num w:numId="4">
-    <w:abstractNumId w:val="14"/>
+  <w:num w:numId="14" w16cid:durableId="764229486">
+    <w:abstractNumId w:val="12"/>
   </w:num>
-  <w:num w:numId="5">
+  <w:num w:numId="15" w16cid:durableId="1734810680">
+    <w:abstractNumId w:val="5"/>
+  </w:num>
+  <w:num w:numId="16" w16cid:durableId="968317319">
     <w:abstractNumId w:val="13"/>
   </w:num>
-  <w:num w:numId="6">
-    <w:abstractNumId w:val="3"/>
+  <w:num w:numId="17" w16cid:durableId="768697466">
+    <w:abstractNumId w:val="0"/>
   </w:num>
-  <w:num w:numId="7">
-    <w:abstractNumId w:val="15"/>
-  </w:num>
-  <w:num w:numId="8">
-    <w:abstractNumId w:val="10"/>
-  </w:num>
-  <w:num w:numId="9">
-    <w:abstractNumId w:val="6"/>
-  </w:num>
-  <w:num w:numId="10">
-    <w:abstractNumId w:val="8"/>
-  </w:num>
-  <w:num w:numId="11">
-    <w:abstractNumId w:val="9"/>
-  </w:num>
-  <w:num w:numId="12">
-    <w:abstractNumId w:val="5"/>
-  </w:num>
-  <w:num w:numId="13">
+  <w:num w:numId="18" w16cid:durableId="1420909237">
     <w:abstractNumId w:val="1"/>
-  </w:num>
-  <w:num w:numId="14">
-    <w:abstractNumId w:val="11"/>
-  </w:num>
-  <w:num w:numId="15">
-    <w:abstractNumId w:val="4"/>
-  </w:num>
-  <w:num w:numId="16">
-    <w:abstractNumId w:val="12"/>
-  </w:num>
-  <w:num w:numId="17">
-    <w:abstractNumId w:val="0"/>
   </w:num>
 </w:numbering>
 </file>
 
 <file path=word/styles.xml><?xml version="1.0" encoding="utf-8"?>
-<w:styles xmlns:mc="http://schemas.openxmlformats.org/markup-compatibility/2006" xmlns:r="http://schemas.openxmlformats.org/officeDocument/2006/relationships" xmlns:w="http://schemas.openxmlformats.org/wordprocessingml/2006/main" xmlns:w14="http://schemas.microsoft.com/office/word/2010/wordml" mc:Ignorable="w14">
+<w:styles xmlns:mc="http://schemas.openxmlformats.org/markup-compatibility/2006" xmlns:r="http://schemas.openxmlformats.org/officeDocument/2006/relationships" xmlns:w="http://schemas.openxmlformats.org/wordprocessingml/2006/main" xmlns:w14="http://schemas.microsoft.com/office/word/2010/wordml" xmlns:w15="http://schemas.microsoft.com/office/word/2012/wordml" xmlns:w16cex="http://schemas.microsoft.com/office/word/2018/wordml/cex" xmlns:w16cid="http://schemas.microsoft.com/office/word/2016/wordml/cid" xmlns:w16="http://schemas.microsoft.com/office/word/2018/wordml" xmlns:w16du="http://schemas.microsoft.com/office/word/2023/wordml/word16du" xmlns:w16sdtdh="http://schemas.microsoft.com/office/word/2020/wordml/sdtdatahash" xmlns:w16sdtfl="http://schemas.microsoft.com/office/word/2024/wordml/sdtformatlock" xmlns:w16se="http://schemas.microsoft.com/office/word/2015/wordml/symex" mc:Ignorable="w14 w15 w16se w16cid w16 w16cex w16sdtdh w16sdtfl w16du">
   <w:docDefaults>
     <w:rPrDefault>
       <w:rPr>
@@ -5898,144 +6306,383 @@
       </w:pPr>
     </w:pPrDefault>
   </w:docDefaults>
-  <w:latentStyles w:defLockedState="0" w:defUIPriority="99" w:defSemiHidden="1" w:defUnhideWhenUsed="1" w:defQFormat="0" w:count="267">
-    <w:lsdException w:name="Normal" w:semiHidden="0" w:uiPriority="0" w:unhideWhenUsed="0" w:qFormat="1"/>
-    <w:lsdException w:name="heading 1" w:semiHidden="0" w:uiPriority="9" w:unhideWhenUsed="0" w:qFormat="1"/>
-    <w:lsdException w:name="heading 2" w:uiPriority="9" w:qFormat="1"/>
-    <w:lsdException w:name="heading 3" w:uiPriority="9" w:qFormat="1"/>
-    <w:lsdException w:name="heading 4" w:uiPriority="9" w:qFormat="1"/>
-    <w:lsdException w:name="heading 5" w:uiPriority="9" w:qFormat="1"/>
-    <w:lsdException w:name="heading 6" w:uiPriority="9" w:qFormat="1"/>
-    <w:lsdException w:name="heading 7" w:uiPriority="9" w:qFormat="1"/>
-    <w:lsdException w:name="heading 8" w:uiPriority="9" w:qFormat="1"/>
-    <w:lsdException w:name="heading 9" w:uiPriority="9" w:qFormat="1"/>
-    <w:lsdException w:name="toc 1" w:uiPriority="39"/>
-    <w:lsdException w:name="toc 2" w:uiPriority="39"/>
-    <w:lsdException w:name="toc 3" w:uiPriority="39"/>
-    <w:lsdException w:name="toc 4" w:uiPriority="39"/>
-    <w:lsdException w:name="toc 5" w:uiPriority="39"/>
-    <w:lsdException w:name="toc 6" w:uiPriority="39"/>
-    <w:lsdException w:name="toc 7" w:uiPriority="39"/>
-    <w:lsdException w:name="toc 8" w:uiPriority="39"/>
-    <w:lsdException w:name="toc 9" w:uiPriority="39"/>
-    <w:lsdException w:name="caption" w:uiPriority="35" w:qFormat="1"/>
-    <w:lsdException w:name="Title" w:semiHidden="0" w:uiPriority="10" w:unhideWhenUsed="0" w:qFormat="1"/>
-    <w:lsdException w:name="Default Paragraph Font" w:uiPriority="1"/>
-    <w:lsdException w:name="Subtitle" w:semiHidden="0" w:uiPriority="11" w:unhideWhenUsed="0" w:qFormat="1"/>
-    <w:lsdException w:name="Strong" w:semiHidden="0" w:uiPriority="22" w:unhideWhenUsed="0" w:qFormat="1"/>
-    <w:lsdException w:name="Emphasis" w:semiHidden="0" w:uiPriority="20" w:unhideWhenUsed="0" w:qFormat="1"/>
-    <w:lsdException w:name="Table Grid" w:semiHidden="0" w:uiPriority="39" w:unhideWhenUsed="0"/>
-    <w:lsdException w:name="Placeholder Text" w:unhideWhenUsed="0"/>
-    <w:lsdException w:name="No Spacing" w:semiHidden="0" w:uiPriority="1" w:unhideWhenUsed="0" w:qFormat="1"/>
-    <w:lsdException w:name="Light Shading" w:semiHidden="0" w:uiPriority="60" w:unhideWhenUsed="0"/>
-    <w:lsdException w:name="Light List" w:semiHidden="0" w:uiPriority="61" w:unhideWhenUsed="0"/>
-    <w:lsdException w:name="Light Grid" w:semiHidden="0" w:uiPriority="62" w:unhideWhenUsed="0"/>
-    <w:lsdException w:name="Medium Shading 1" w:semiHidden="0" w:uiPriority="63" w:unhideWhenUsed="0"/>
-    <w:lsdException w:name="Medium Shading 2" w:semiHidden="0" w:uiPriority="64" w:unhideWhenUsed="0"/>
-    <w:lsdException w:name="Medium List 1" w:semiHidden="0" w:uiPriority="65" w:unhideWhenUsed="0"/>
-    <w:lsdException w:name="Medium List 2" w:semiHidden="0" w:uiPriority="66" w:unhideWhenUsed="0"/>
-    <w:lsdException w:name="Medium Grid 1" w:semiHidden="0" w:uiPriority="67" w:unhideWhenUsed="0"/>
-    <w:lsdException w:name="Medium Grid 2" w:semiHidden="0" w:uiPriority="68" w:unhideWhenUsed="0"/>
-    <w:lsdException w:name="Medium Grid 3" w:semiHidden="0" w:uiPriority="69" w:unhideWhenUsed="0"/>
-    <w:lsdException w:name="Dark List" w:semiHidden="0" w:uiPriority="70" w:unhideWhenUsed="0"/>
-    <w:lsdException w:name="Colorful Shading" w:semiHidden="0" w:uiPriority="71" w:unhideWhenUsed="0"/>
-    <w:lsdException w:name="Colorful List" w:semiHidden="0" w:uiPriority="72" w:unhideWhenUsed="0"/>
-    <w:lsdException w:name="Colorful Grid" w:semiHidden="0" w:uiPriority="73" w:unhideWhenUsed="0"/>
-    <w:lsdException w:name="Light Shading Accent 1" w:semiHidden="0" w:uiPriority="60" w:unhideWhenUsed="0"/>
-    <w:lsdException w:name="Light List Accent 1" w:semiHidden="0" w:uiPriority="61" w:unhideWhenUsed="0"/>
-    <w:lsdException w:name="Light Grid Accent 1" w:semiHidden="0" w:uiPriority="62" w:unhideWhenUsed="0"/>
-    <w:lsdException w:name="Medium Shading 1 Accent 1" w:semiHidden="0" w:uiPriority="63" w:unhideWhenUsed="0"/>
-    <w:lsdException w:name="Medium Shading 2 Accent 1" w:semiHidden="0" w:uiPriority="64" w:unhideWhenUsed="0"/>
-    <w:lsdException w:name="Medium List 1 Accent 1" w:semiHidden="0" w:uiPriority="65" w:unhideWhenUsed="0"/>
-    <w:lsdException w:name="Revision" w:unhideWhenUsed="0"/>
-    <w:lsdException w:name="List Paragraph" w:semiHidden="0" w:uiPriority="34" w:unhideWhenUsed="0" w:qFormat="1"/>
-    <w:lsdException w:name="Quote" w:semiHidden="0" w:uiPriority="29" w:unhideWhenUsed="0" w:qFormat="1"/>
-    <w:lsdException w:name="Intense Quote" w:semiHidden="0" w:uiPriority="30" w:unhideWhenUsed="0" w:qFormat="1"/>
-    <w:lsdException w:name="Medium List 2 Accent 1" w:semiHidden="0" w:uiPriority="66" w:unhideWhenUsed="0"/>
-    <w:lsdException w:name="Medium Grid 1 Accent 1" w:semiHidden="0" w:uiPriority="67" w:unhideWhenUsed="0"/>
-    <w:lsdException w:name="Medium Grid 2 Accent 1" w:semiHidden="0" w:uiPriority="68" w:unhideWhenUsed="0"/>
-    <w:lsdException w:name="Medium Grid 3 Accent 1" w:semiHidden="0" w:uiPriority="69" w:unhideWhenUsed="0"/>
-    <w:lsdException w:name="Dark List Accent 1" w:semiHidden="0" w:uiPriority="70" w:unhideWhenUsed="0"/>
-    <w:lsdException w:name="Colorful Shading Accent 1" w:semiHidden="0" w:uiPriority="71" w:unhideWhenUsed="0"/>
-    <w:lsdException w:name="Colorful List Accent 1" w:semiHidden="0" w:uiPriority="72" w:unhideWhenUsed="0"/>
-    <w:lsdException w:name="Colorful Grid Accent 1" w:semiHidden="0" w:uiPriority="73" w:unhideWhenUsed="0"/>
-    <w:lsdException w:name="Light Shading Accent 2" w:semiHidden="0" w:uiPriority="60" w:unhideWhenUsed="0"/>
-    <w:lsdException w:name="Light List Accent 2" w:semiHidden="0" w:uiPriority="61" w:unhideWhenUsed="0"/>
-    <w:lsdException w:name="Light Grid Accent 2" w:semiHidden="0" w:uiPriority="62" w:unhideWhenUsed="0"/>
-    <w:lsdException w:name="Medium Shading 1 Accent 2" w:semiHidden="0" w:uiPriority="63" w:unhideWhenUsed="0"/>
-    <w:lsdException w:name="Medium Shading 2 Accent 2" w:semiHidden="0" w:uiPriority="64" w:unhideWhenUsed="0"/>
-    <w:lsdException w:name="Medium List 1 Accent 2" w:semiHidden="0" w:uiPriority="65" w:unhideWhenUsed="0"/>
-    <w:lsdException w:name="Medium List 2 Accent 2" w:semiHidden="0" w:uiPriority="66" w:unhideWhenUsed="0"/>
-    <w:lsdException w:name="Medium Grid 1 Accent 2" w:semiHidden="0" w:uiPriority="67" w:unhideWhenUsed="0"/>
-    <w:lsdException w:name="Medium Grid 2 Accent 2" w:semiHidden="0" w:uiPriority="68" w:unhideWhenUsed="0"/>
-    <w:lsdException w:name="Medium Grid 3 Accent 2" w:semiHidden="0" w:uiPriority="69" w:unhideWhenUsed="0"/>
-    <w:lsdException w:name="Dark List Accent 2" w:semiHidden="0" w:uiPriority="70" w:unhideWhenUsed="0"/>
-    <w:lsdException w:name="Colorful Shading Accent 2" w:semiHidden="0" w:uiPriority="71" w:unhideWhenUsed="0"/>
-    <w:lsdException w:name="Colorful List Accent 2" w:semiHidden="0" w:uiPriority="72" w:unhideWhenUsed="0"/>
-    <w:lsdException w:name="Colorful Grid Accent 2" w:semiHidden="0" w:uiPriority="73" w:unhideWhenUsed="0"/>
-    <w:lsdException w:name="Light Shading Accent 3" w:semiHidden="0" w:uiPriority="60" w:unhideWhenUsed="0"/>
-    <w:lsdException w:name="Light List Accent 3" w:semiHidden="0" w:uiPriority="61" w:unhideWhenUsed="0"/>
-    <w:lsdException w:name="Light Grid Accent 3" w:semiHidden="0" w:uiPriority="62" w:unhideWhenUsed="0"/>
-    <w:lsdException w:name="Medium Shading 1 Accent 3" w:semiHidden="0" w:uiPriority="63" w:unhideWhenUsed="0"/>
-    <w:lsdException w:name="Medium Shading 2 Accent 3" w:semiHidden="0" w:uiPriority="64" w:unhideWhenUsed="0"/>
-    <w:lsdException w:name="Medium List 1 Accent 3" w:semiHidden="0" w:uiPriority="65" w:unhideWhenUsed="0"/>
-    <w:lsdException w:name="Medium List 2 Accent 3" w:semiHidden="0" w:uiPriority="66" w:unhideWhenUsed="0"/>
-    <w:lsdException w:name="Medium Grid 1 Accent 3" w:semiHidden="0" w:uiPriority="67" w:unhideWhenUsed="0"/>
-    <w:lsdException w:name="Medium Grid 2 Accent 3" w:semiHidden="0" w:uiPriority="68" w:unhideWhenUsed="0"/>
-    <w:lsdException w:name="Medium Grid 3 Accent 3" w:semiHidden="0" w:uiPriority="69" w:unhideWhenUsed="0"/>
-    <w:lsdException w:name="Dark List Accent 3" w:semiHidden="0" w:uiPriority="70" w:unhideWhenUsed="0"/>
-    <w:lsdException w:name="Colorful Shading Accent 3" w:semiHidden="0" w:uiPriority="71" w:unhideWhenUsed="0"/>
-    <w:lsdException w:name="Colorful List Accent 3" w:semiHidden="0" w:uiPriority="72" w:unhideWhenUsed="0"/>
-    <w:lsdException w:name="Colorful Grid Accent 3" w:semiHidden="0" w:uiPriority="73" w:unhideWhenUsed="0"/>
-    <w:lsdException w:name="Light Shading Accent 4" w:semiHidden="0" w:uiPriority="60" w:unhideWhenUsed="0"/>
-    <w:lsdException w:name="Light List Accent 4" w:semiHidden="0" w:uiPriority="61" w:unhideWhenUsed="0"/>
-    <w:lsdException w:name="Light Grid Accent 4" w:semiHidden="0" w:uiPriority="62" w:unhideWhenUsed="0"/>
-    <w:lsdException w:name="Medium Shading 1 Accent 4" w:semiHidden="0" w:uiPriority="63" w:unhideWhenUsed="0"/>
-    <w:lsdException w:name="Medium Shading 2 Accent 4" w:semiHidden="0" w:uiPriority="64" w:unhideWhenUsed="0"/>
-    <w:lsdException w:name="Medium List 1 Accent 4" w:semiHidden="0" w:uiPriority="65" w:unhideWhenUsed="0"/>
-    <w:lsdException w:name="Medium List 2 Accent 4" w:semiHidden="0" w:uiPriority="66" w:unhideWhenUsed="0"/>
-    <w:lsdException w:name="Medium Grid 1 Accent 4" w:semiHidden="0" w:uiPriority="67" w:unhideWhenUsed="0"/>
-    <w:lsdException w:name="Medium Grid 2 Accent 4" w:semiHidden="0" w:uiPriority="68" w:unhideWhenUsed="0"/>
-    <w:lsdException w:name="Medium Grid 3 Accent 4" w:semiHidden="0" w:uiPriority="69" w:unhideWhenUsed="0"/>
-    <w:lsdException w:name="Dark List Accent 4" w:semiHidden="0" w:uiPriority="70" w:unhideWhenUsed="0"/>
-    <w:lsdException w:name="Colorful Shading Accent 4" w:semiHidden="0" w:uiPriority="71" w:unhideWhenUsed="0"/>
-    <w:lsdException w:name="Colorful List Accent 4" w:semiHidden="0" w:uiPriority="72" w:unhideWhenUsed="0"/>
-    <w:lsdException w:name="Colorful Grid Accent 4" w:semiHidden="0" w:uiPriority="73" w:unhideWhenUsed="0"/>
-    <w:lsdException w:name="Light Shading Accent 5" w:semiHidden="0" w:uiPriority="60" w:unhideWhenUsed="0"/>
-    <w:lsdException w:name="Light List Accent 5" w:semiHidden="0" w:uiPriority="61" w:unhideWhenUsed="0"/>
-    <w:lsdException w:name="Light Grid Accent 5" w:semiHidden="0" w:uiPriority="62" w:unhideWhenUsed="0"/>
-    <w:lsdException w:name="Medium Shading 1 Accent 5" w:semiHidden="0" w:uiPriority="63" w:unhideWhenUsed="0"/>
-    <w:lsdException w:name="Medium Shading 2 Accent 5" w:semiHidden="0" w:uiPriority="64" w:unhideWhenUsed="0"/>
-    <w:lsdException w:name="Medium List 1 Accent 5" w:semiHidden="0" w:uiPriority="65" w:unhideWhenUsed="0"/>
-    <w:lsdException w:name="Medium List 2 Accent 5" w:semiHidden="0" w:uiPriority="66" w:unhideWhenUsed="0"/>
-    <w:lsdException w:name="Medium Grid 1 Accent 5" w:semiHidden="0" w:uiPriority="67" w:unhideWhenUsed="0"/>
-    <w:lsdException w:name="Medium Grid 2 Accent 5" w:semiHidden="0" w:uiPriority="68" w:unhideWhenUsed="0"/>
-    <w:lsdException w:name="Medium Grid 3 Accent 5" w:semiHidden="0" w:uiPriority="69" w:unhideWhenUsed="0"/>
-    <w:lsdException w:name="Dark List Accent 5" w:semiHidden="0" w:uiPriority="70" w:unhideWhenUsed="0"/>
-    <w:lsdException w:name="Colorful Shading Accent 5" w:semiHidden="0" w:uiPriority="71" w:unhideWhenUsed="0"/>
-    <w:lsdException w:name="Colorful List Accent 5" w:semiHidden="0" w:uiPriority="72" w:unhideWhenUsed="0"/>
-    <w:lsdException w:name="Colorful Grid Accent 5" w:semiHidden="0" w:uiPriority="73" w:unhideWhenUsed="0"/>
-    <w:lsdException w:name="Light Shading Accent 6" w:semiHidden="0" w:uiPriority="60" w:unhideWhenUsed="0"/>
-    <w:lsdException w:name="Light List Accent 6" w:semiHidden="0" w:uiPriority="61" w:unhideWhenUsed="0"/>
-    <w:lsdException w:name="Light Grid Accent 6" w:semiHidden="0" w:uiPriority="62" w:unhideWhenUsed="0"/>
-    <w:lsdException w:name="Medium Shading 1 Accent 6" w:semiHidden="0" w:uiPriority="63" w:unhideWhenUsed="0"/>
-    <w:lsdException w:name="Medium Shading 2 Accent 6" w:semiHidden="0" w:uiPriority="64" w:unhideWhenUsed="0"/>
-    <w:lsdException w:name="Medium List 1 Accent 6" w:semiHidden="0" w:uiPriority="65" w:unhideWhenUsed="0"/>
-    <w:lsdException w:name="Medium List 2 Accent 6" w:semiHidden="0" w:uiPriority="66" w:unhideWhenUsed="0"/>
-    <w:lsdException w:name="Medium Grid 1 Accent 6" w:semiHidden="0" w:uiPriority="67" w:unhideWhenUsed="0"/>
-    <w:lsdException w:name="Medium Grid 2 Accent 6" w:semiHidden="0" w:uiPriority="68" w:unhideWhenUsed="0"/>
-    <w:lsdException w:name="Medium Grid 3 Accent 6" w:semiHidden="0" w:uiPriority="69" w:unhideWhenUsed="0"/>
-    <w:lsdException w:name="Dark List Accent 6" w:semiHidden="0" w:uiPriority="70" w:unhideWhenUsed="0"/>
-    <w:lsdException w:name="Colorful Shading Accent 6" w:semiHidden="0" w:uiPriority="71" w:unhideWhenUsed="0"/>
-    <w:lsdException w:name="Colorful List Accent 6" w:semiHidden="0" w:uiPriority="72" w:unhideWhenUsed="0"/>
-    <w:lsdException w:name="Colorful Grid Accent 6" w:semiHidden="0" w:uiPriority="73" w:unhideWhenUsed="0"/>
-    <w:lsdException w:name="Subtle Emphasis" w:semiHidden="0" w:uiPriority="19" w:unhideWhenUsed="0" w:qFormat="1"/>
-    <w:lsdException w:name="Intense Emphasis" w:semiHidden="0" w:uiPriority="21" w:unhideWhenUsed="0" w:qFormat="1"/>
-    <w:lsdException w:name="Subtle Reference" w:semiHidden="0" w:uiPriority="31" w:unhideWhenUsed="0" w:qFormat="1"/>
-    <w:lsdException w:name="Intense Reference" w:semiHidden="0" w:uiPriority="32" w:unhideWhenUsed="0" w:qFormat="1"/>
-    <w:lsdException w:name="Book Title" w:semiHidden="0" w:uiPriority="33" w:unhideWhenUsed="0" w:qFormat="1"/>
-    <w:lsdException w:name="Bibliography" w:uiPriority="37"/>
-    <w:lsdException w:name="TOC Heading" w:uiPriority="39" w:qFormat="1"/>
+  <w:latentStyles w:defLockedState="0" w:defUIPriority="99" w:defSemiHidden="0" w:defUnhideWhenUsed="0" w:defQFormat="0" w:count="376">
+    <w:lsdException w:name="Normal" w:uiPriority="0" w:qFormat="1"/>
+    <w:lsdException w:name="heading 1" w:uiPriority="9" w:qFormat="1"/>
+    <w:lsdException w:name="heading 2" w:semiHidden="1" w:uiPriority="9" w:unhideWhenUsed="1" w:qFormat="1"/>
+    <w:lsdException w:name="heading 3" w:semiHidden="1" w:uiPriority="9" w:unhideWhenUsed="1" w:qFormat="1"/>
+    <w:lsdException w:name="heading 4" w:semiHidden="1" w:uiPriority="9" w:unhideWhenUsed="1" w:qFormat="1"/>
+    <w:lsdException w:name="heading 5" w:semiHidden="1" w:uiPriority="9" w:unhideWhenUsed="1" w:qFormat="1"/>
+    <w:lsdException w:name="heading 6" w:semiHidden="1" w:uiPriority="9" w:unhideWhenUsed="1" w:qFormat="1"/>
+    <w:lsdException w:name="heading 7" w:semiHidden="1" w:uiPriority="9" w:unhideWhenUsed="1" w:qFormat="1"/>
+    <w:lsdException w:name="heading 8" w:semiHidden="1" w:uiPriority="9" w:unhideWhenUsed="1" w:qFormat="1"/>
+    <w:lsdException w:name="heading 9" w:semiHidden="1" w:uiPriority="9" w:unhideWhenUsed="1" w:qFormat="1"/>
+    <w:lsdException w:name="index 1" w:semiHidden="1" w:unhideWhenUsed="1"/>
+    <w:lsdException w:name="index 2" w:semiHidden="1" w:unhideWhenUsed="1"/>
+    <w:lsdException w:name="index 3" w:semiHidden="1" w:unhideWhenUsed="1"/>
+    <w:lsdException w:name="index 4" w:semiHidden="1" w:unhideWhenUsed="1"/>
+    <w:lsdException w:name="index 5" w:semiHidden="1" w:unhideWhenUsed="1"/>
+    <w:lsdException w:name="index 6" w:semiHidden="1" w:unhideWhenUsed="1"/>
+    <w:lsdException w:name="index 7" w:semiHidden="1" w:unhideWhenUsed="1"/>
+    <w:lsdException w:name="index 8" w:semiHidden="1" w:unhideWhenUsed="1"/>
+    <w:lsdException w:name="index 9" w:semiHidden="1" w:unhideWhenUsed="1"/>
+    <w:lsdException w:name="toc 1" w:semiHidden="1" w:uiPriority="39" w:unhideWhenUsed="1"/>
+    <w:lsdException w:name="toc 2" w:semiHidden="1" w:uiPriority="39" w:unhideWhenUsed="1"/>
+    <w:lsdException w:name="toc 3" w:semiHidden="1" w:uiPriority="39" w:unhideWhenUsed="1"/>
+    <w:lsdException w:name="toc 4" w:semiHidden="1" w:uiPriority="39" w:unhideWhenUsed="1"/>
+    <w:lsdException w:name="toc 5" w:semiHidden="1" w:uiPriority="39" w:unhideWhenUsed="1"/>
+    <w:lsdException w:name="toc 6" w:semiHidden="1" w:uiPriority="39" w:unhideWhenUsed="1"/>
+    <w:lsdException w:name="toc 7" w:semiHidden="1" w:uiPriority="39" w:unhideWhenUsed="1"/>
+    <w:lsdException w:name="toc 8" w:semiHidden="1" w:uiPriority="39" w:unhideWhenUsed="1"/>
+    <w:lsdException w:name="toc 9" w:semiHidden="1" w:uiPriority="39" w:unhideWhenUsed="1"/>
+    <w:lsdException w:name="Normal Indent" w:semiHidden="1" w:unhideWhenUsed="1"/>
+    <w:lsdException w:name="footnote text" w:semiHidden="1" w:unhideWhenUsed="1"/>
+    <w:lsdException w:name="annotation text" w:semiHidden="1" w:unhideWhenUsed="1"/>
+    <w:lsdException w:name="header" w:semiHidden="1" w:unhideWhenUsed="1"/>
+    <w:lsdException w:name="footer" w:semiHidden="1" w:unhideWhenUsed="1"/>
+    <w:lsdException w:name="index heading" w:semiHidden="1" w:unhideWhenUsed="1"/>
+    <w:lsdException w:name="caption" w:semiHidden="1" w:uiPriority="35" w:unhideWhenUsed="1" w:qFormat="1"/>
+    <w:lsdException w:name="table of figures" w:semiHidden="1" w:unhideWhenUsed="1"/>
+    <w:lsdException w:name="envelope address" w:semiHidden="1" w:unhideWhenUsed="1"/>
+    <w:lsdException w:name="envelope return" w:semiHidden="1" w:unhideWhenUsed="1"/>
+    <w:lsdException w:name="footnote reference" w:semiHidden="1" w:unhideWhenUsed="1"/>
+    <w:lsdException w:name="annotation reference" w:semiHidden="1" w:unhideWhenUsed="1"/>
+    <w:lsdException w:name="line number" w:semiHidden="1" w:unhideWhenUsed="1"/>
+    <w:lsdException w:name="page number" w:semiHidden="1" w:unhideWhenUsed="1"/>
+    <w:lsdException w:name="endnote reference" w:semiHidden="1" w:unhideWhenUsed="1"/>
+    <w:lsdException w:name="endnote text" w:semiHidden="1" w:unhideWhenUsed="1"/>
+    <w:lsdException w:name="table of authorities" w:semiHidden="1" w:unhideWhenUsed="1"/>
+    <w:lsdException w:name="macro" w:semiHidden="1" w:unhideWhenUsed="1"/>
+    <w:lsdException w:name="toa heading" w:semiHidden="1" w:unhideWhenUsed="1"/>
+    <w:lsdException w:name="List" w:semiHidden="1" w:unhideWhenUsed="1"/>
+    <w:lsdException w:name="List Bullet" w:semiHidden="1" w:unhideWhenUsed="1"/>
+    <w:lsdException w:name="List Number" w:semiHidden="1" w:unhideWhenUsed="1"/>
+    <w:lsdException w:name="List 2" w:semiHidden="1" w:unhideWhenUsed="1"/>
+    <w:lsdException w:name="List 3" w:semiHidden="1" w:unhideWhenUsed="1"/>
+    <w:lsdException w:name="List 4" w:semiHidden="1" w:unhideWhenUsed="1"/>
+    <w:lsdException w:name="List 5" w:semiHidden="1" w:unhideWhenUsed="1"/>
+    <w:lsdException w:name="List Bullet 2" w:semiHidden="1" w:unhideWhenUsed="1"/>
+    <w:lsdException w:name="List Bullet 3" w:semiHidden="1" w:unhideWhenUsed="1"/>
+    <w:lsdException w:name="List Bullet 4" w:semiHidden="1" w:unhideWhenUsed="1"/>
+    <w:lsdException w:name="List Bullet 5" w:semiHidden="1" w:unhideWhenUsed="1"/>
+    <w:lsdException w:name="List Number 2" w:semiHidden="1" w:unhideWhenUsed="1"/>
+    <w:lsdException w:name="List Number 3" w:semiHidden="1" w:unhideWhenUsed="1"/>
+    <w:lsdException w:name="List Number 4" w:semiHidden="1" w:unhideWhenUsed="1"/>
+    <w:lsdException w:name="List Number 5" w:semiHidden="1" w:unhideWhenUsed="1"/>
+    <w:lsdException w:name="Title" w:uiPriority="10" w:qFormat="1"/>
+    <w:lsdException w:name="Closing" w:semiHidden="1" w:unhideWhenUsed="1"/>
+    <w:lsdException w:name="Signature" w:semiHidden="1" w:unhideWhenUsed="1"/>
+    <w:lsdException w:name="Default Paragraph Font" w:semiHidden="1" w:uiPriority="1" w:unhideWhenUsed="1"/>
+    <w:lsdException w:name="Body Text" w:semiHidden="1" w:unhideWhenUsed="1"/>
+    <w:lsdException w:name="Body Text Indent" w:semiHidden="1" w:unhideWhenUsed="1"/>
+    <w:lsdException w:name="List Continue" w:semiHidden="1" w:unhideWhenUsed="1"/>
+    <w:lsdException w:name="List Continue 2" w:semiHidden="1" w:unhideWhenUsed="1"/>
+    <w:lsdException w:name="List Continue 3" w:semiHidden="1" w:unhideWhenUsed="1"/>
+    <w:lsdException w:name="List Continue 4" w:semiHidden="1" w:unhideWhenUsed="1"/>
+    <w:lsdException w:name="List Continue 5" w:semiHidden="1" w:unhideWhenUsed="1"/>
+    <w:lsdException w:name="Message Header" w:semiHidden="1" w:unhideWhenUsed="1"/>
+    <w:lsdException w:name="Subtitle" w:uiPriority="11" w:qFormat="1"/>
+    <w:lsdException w:name="Salutation" w:semiHidden="1" w:unhideWhenUsed="1"/>
+    <w:lsdException w:name="Date" w:semiHidden="1" w:unhideWhenUsed="1"/>
+    <w:lsdException w:name="Body Text First Indent" w:semiHidden="1" w:unhideWhenUsed="1"/>
+    <w:lsdException w:name="Body Text First Indent 2" w:semiHidden="1" w:unhideWhenUsed="1"/>
+    <w:lsdException w:name="Note Heading" w:semiHidden="1" w:unhideWhenUsed="1"/>
+    <w:lsdException w:name="Body Text 2" w:semiHidden="1" w:unhideWhenUsed="1"/>
+    <w:lsdException w:name="Body Text 3" w:semiHidden="1" w:unhideWhenUsed="1"/>
+    <w:lsdException w:name="Body Text Indent 2" w:semiHidden="1" w:unhideWhenUsed="1"/>
+    <w:lsdException w:name="Body Text Indent 3" w:semiHidden="1" w:unhideWhenUsed="1"/>
+    <w:lsdException w:name="Block Text" w:semiHidden="1" w:unhideWhenUsed="1"/>
+    <w:lsdException w:name="Hyperlink" w:semiHidden="1" w:unhideWhenUsed="1"/>
+    <w:lsdException w:name="FollowedHyperlink" w:semiHidden="1" w:unhideWhenUsed="1"/>
+    <w:lsdException w:name="Strong" w:uiPriority="22" w:qFormat="1"/>
+    <w:lsdException w:name="Emphasis" w:uiPriority="20" w:qFormat="1"/>
+    <w:lsdException w:name="Document Map" w:semiHidden="1" w:unhideWhenUsed="1"/>
+    <w:lsdException w:name="Plain Text" w:semiHidden="1" w:unhideWhenUsed="1"/>
+    <w:lsdException w:name="E-mail Signature" w:semiHidden="1" w:unhideWhenUsed="1"/>
+    <w:lsdException w:name="HTML Top of Form" w:semiHidden="1" w:unhideWhenUsed="1"/>
+    <w:lsdException w:name="HTML Bottom of Form" w:semiHidden="1" w:unhideWhenUsed="1"/>
+    <w:lsdException w:name="Normal (Web)" w:semiHidden="1" w:unhideWhenUsed="1"/>
+    <w:lsdException w:name="HTML Acronym" w:semiHidden="1" w:unhideWhenUsed="1"/>
+    <w:lsdException w:name="HTML Address" w:semiHidden="1" w:unhideWhenUsed="1"/>
+    <w:lsdException w:name="HTML Cite" w:semiHidden="1" w:unhideWhenUsed="1"/>
+    <w:lsdException w:name="HTML Code" w:semiHidden="1" w:unhideWhenUsed="1"/>
+    <w:lsdException w:name="HTML Definition" w:semiHidden="1" w:unhideWhenUsed="1"/>
+    <w:lsdException w:name="HTML Keyboard" w:semiHidden="1" w:unhideWhenUsed="1"/>
+    <w:lsdException w:name="HTML Preformatted" w:semiHidden="1" w:unhideWhenUsed="1"/>
+    <w:lsdException w:name="HTML Sample" w:semiHidden="1" w:unhideWhenUsed="1"/>
+    <w:lsdException w:name="HTML Typewriter" w:semiHidden="1" w:unhideWhenUsed="1"/>
+    <w:lsdException w:name="HTML Variable" w:semiHidden="1" w:unhideWhenUsed="1"/>
+    <w:lsdException w:name="Normal Table" w:semiHidden="1" w:unhideWhenUsed="1"/>
+    <w:lsdException w:name="annotation subject" w:semiHidden="1" w:unhideWhenUsed="1"/>
+    <w:lsdException w:name="No List" w:semiHidden="1" w:unhideWhenUsed="1"/>
+    <w:lsdException w:name="Outline List 1" w:semiHidden="1" w:unhideWhenUsed="1"/>
+    <w:lsdException w:name="Outline List 2" w:semiHidden="1" w:unhideWhenUsed="1"/>
+    <w:lsdException w:name="Outline List 3" w:semiHidden="1" w:unhideWhenUsed="1"/>
+    <w:lsdException w:name="Table Simple 1" w:semiHidden="1" w:unhideWhenUsed="1"/>
+    <w:lsdException w:name="Table Simple 2" w:semiHidden="1" w:unhideWhenUsed="1"/>
+    <w:lsdException w:name="Table Simple 3" w:semiHidden="1" w:unhideWhenUsed="1"/>
+    <w:lsdException w:name="Table Classic 1" w:semiHidden="1" w:unhideWhenUsed="1"/>
+    <w:lsdException w:name="Table Classic 2" w:semiHidden="1" w:unhideWhenUsed="1"/>
+    <w:lsdException w:name="Table Classic 3" w:semiHidden="1" w:unhideWhenUsed="1"/>
+    <w:lsdException w:name="Table Classic 4" w:semiHidden="1" w:unhideWhenUsed="1"/>
+    <w:lsdException w:name="Table Colorful 1" w:semiHidden="1" w:unhideWhenUsed="1"/>
+    <w:lsdException w:name="Table Colorful 2" w:semiHidden="1" w:unhideWhenUsed="1"/>
+    <w:lsdException w:name="Table Colorful 3" w:semiHidden="1" w:unhideWhenUsed="1"/>
+    <w:lsdException w:name="Table Columns 1" w:semiHidden="1" w:unhideWhenUsed="1"/>
+    <w:lsdException w:name="Table Columns 2" w:semiHidden="1" w:unhideWhenUsed="1"/>
+    <w:lsdException w:name="Table Columns 3" w:semiHidden="1" w:unhideWhenUsed="1"/>
+    <w:lsdException w:name="Table Columns 4" w:semiHidden="1" w:unhideWhenUsed="1"/>
+    <w:lsdException w:name="Table Columns 5" w:semiHidden="1" w:unhideWhenUsed="1"/>
+    <w:lsdException w:name="Table Grid 1" w:semiHidden="1" w:unhideWhenUsed="1"/>
+    <w:lsdException w:name="Table Grid 2" w:semiHidden="1" w:unhideWhenUsed="1"/>
+    <w:lsdException w:name="Table Grid 3" w:semiHidden="1" w:unhideWhenUsed="1"/>
+    <w:lsdException w:name="Table Grid 4" w:semiHidden="1" w:unhideWhenUsed="1"/>
+    <w:lsdException w:name="Table Grid 5" w:semiHidden="1" w:unhideWhenUsed="1"/>
+    <w:lsdException w:name="Table Grid 6" w:semiHidden="1" w:unhideWhenUsed="1"/>
+    <w:lsdException w:name="Table Grid 7" w:semiHidden="1" w:unhideWhenUsed="1"/>
+    <w:lsdException w:name="Table Grid 8" w:semiHidden="1" w:unhideWhenUsed="1"/>
+    <w:lsdException w:name="Table List 1" w:semiHidden="1" w:unhideWhenUsed="1"/>
+    <w:lsdException w:name="Table List 2" w:semiHidden="1" w:unhideWhenUsed="1"/>
+    <w:lsdException w:name="Table List 3" w:semiHidden="1" w:unhideWhenUsed="1"/>
+    <w:lsdException w:name="Table List 4" w:semiHidden="1" w:unhideWhenUsed="1"/>
+    <w:lsdException w:name="Table List 5" w:semiHidden="1" w:unhideWhenUsed="1"/>
+    <w:lsdException w:name="Table List 6" w:semiHidden="1" w:unhideWhenUsed="1"/>
+    <w:lsdException w:name="Table List 7" w:semiHidden="1" w:unhideWhenUsed="1"/>
+    <w:lsdException w:name="Table List 8" w:semiHidden="1" w:unhideWhenUsed="1"/>
+    <w:lsdException w:name="Table 3D effects 1" w:semiHidden="1" w:unhideWhenUsed="1"/>
+    <w:lsdException w:name="Table 3D effects 2" w:semiHidden="1" w:unhideWhenUsed="1"/>
+    <w:lsdException w:name="Table 3D effects 3" w:semiHidden="1" w:unhideWhenUsed="1"/>
+    <w:lsdException w:name="Table Contemporary" w:semiHidden="1" w:unhideWhenUsed="1"/>
+    <w:lsdException w:name="Table Elegant" w:semiHidden="1" w:unhideWhenUsed="1"/>
+    <w:lsdException w:name="Table Professional" w:semiHidden="1" w:unhideWhenUsed="1"/>
+    <w:lsdException w:name="Table Subtle 1" w:semiHidden="1" w:unhideWhenUsed="1"/>
+    <w:lsdException w:name="Table Subtle 2" w:semiHidden="1" w:unhideWhenUsed="1"/>
+    <w:lsdException w:name="Table Web 1" w:semiHidden="1" w:unhideWhenUsed="1"/>
+    <w:lsdException w:name="Table Web 2" w:semiHidden="1" w:unhideWhenUsed="1"/>
+    <w:lsdException w:name="Table Web 3" w:semiHidden="1" w:unhideWhenUsed="1"/>
+    <w:lsdException w:name="Balloon Text" w:semiHidden="1" w:unhideWhenUsed="1"/>
+    <w:lsdException w:name="Table Grid" w:uiPriority="39"/>
+    <w:lsdException w:name="Table Theme" w:semiHidden="1" w:unhideWhenUsed="1"/>
+    <w:lsdException w:name="Placeholder Text" w:semiHidden="1"/>
+    <w:lsdException w:name="No Spacing" w:uiPriority="1" w:qFormat="1"/>
+    <w:lsdException w:name="Light Shading" w:uiPriority="60"/>
+    <w:lsdException w:name="Light List" w:uiPriority="61"/>
+    <w:lsdException w:name="Light Grid" w:uiPriority="62"/>
+    <w:lsdException w:name="Medium Shading 1" w:uiPriority="63"/>
+    <w:lsdException w:name="Medium Shading 2" w:uiPriority="64"/>
+    <w:lsdException w:name="Medium List 1" w:uiPriority="65"/>
+    <w:lsdException w:name="Medium List 2" w:uiPriority="66"/>
+    <w:lsdException w:name="Medium Grid 1" w:uiPriority="67"/>
+    <w:lsdException w:name="Medium Grid 2" w:uiPriority="68"/>
+    <w:lsdException w:name="Medium Grid 3" w:uiPriority="69"/>
+    <w:lsdException w:name="Dark List" w:uiPriority="70"/>
+    <w:lsdException w:name="Colorful Shading" w:uiPriority="71"/>
+    <w:lsdException w:name="Colorful List" w:uiPriority="72"/>
+    <w:lsdException w:name="Colorful Grid" w:uiPriority="73"/>
+    <w:lsdException w:name="Light Shading Accent 1" w:uiPriority="60"/>
+    <w:lsdException w:name="Light List Accent 1" w:uiPriority="61"/>
+    <w:lsdException w:name="Light Grid Accent 1" w:uiPriority="62"/>
+    <w:lsdException w:name="Medium Shading 1 Accent 1" w:uiPriority="63"/>
+    <w:lsdException w:name="Medium Shading 2 Accent 1" w:uiPriority="64"/>
+    <w:lsdException w:name="Medium List 1 Accent 1" w:uiPriority="65"/>
+    <w:lsdException w:name="Revision" w:semiHidden="1"/>
+    <w:lsdException w:name="List Paragraph" w:uiPriority="34" w:qFormat="1"/>
+    <w:lsdException w:name="Quote" w:uiPriority="29" w:qFormat="1"/>
+    <w:lsdException w:name="Intense Quote" w:uiPriority="30" w:qFormat="1"/>
+    <w:lsdException w:name="Medium List 2 Accent 1" w:uiPriority="66"/>
+    <w:lsdException w:name="Medium Grid 1 Accent 1" w:uiPriority="67"/>
+    <w:lsdException w:name="Medium Grid 2 Accent 1" w:uiPriority="68"/>
+    <w:lsdException w:name="Medium Grid 3 Accent 1" w:uiPriority="69"/>
+    <w:lsdException w:name="Dark List Accent 1" w:uiPriority="70"/>
+    <w:lsdException w:name="Colorful Shading Accent 1" w:uiPriority="71"/>
+    <w:lsdException w:name="Colorful List Accent 1" w:uiPriority="72"/>
+    <w:lsdException w:name="Colorful Grid Accent 1" w:uiPriority="73"/>
+    <w:lsdException w:name="Light Shading Accent 2" w:uiPriority="60"/>
+    <w:lsdException w:name="Light List Accent 2" w:uiPriority="61"/>
+    <w:lsdException w:name="Light Grid Accent 2" w:uiPriority="62"/>
+    <w:lsdException w:name="Medium Shading 1 Accent 2" w:uiPriority="63"/>
+    <w:lsdException w:name="Medium Shading 2 Accent 2" w:uiPriority="64"/>
+    <w:lsdException w:name="Medium List 1 Accent 2" w:uiPriority="65"/>
+    <w:lsdException w:name="Medium List 2 Accent 2" w:uiPriority="66"/>
+    <w:lsdException w:name="Medium Grid 1 Accent 2" w:uiPriority="67"/>
+    <w:lsdException w:name="Medium Grid 2 Accent 2" w:uiPriority="68"/>
+    <w:lsdException w:name="Medium Grid 3 Accent 2" w:uiPriority="69"/>
+    <w:lsdException w:name="Dark List Accent 2" w:uiPriority="70"/>
+    <w:lsdException w:name="Colorful Shading Accent 2" w:uiPriority="71"/>
+    <w:lsdException w:name="Colorful List Accent 2" w:uiPriority="72"/>
+    <w:lsdException w:name="Colorful Grid Accent 2" w:uiPriority="73"/>
+    <w:lsdException w:name="Light Shading Accent 3" w:uiPriority="60"/>
+    <w:lsdException w:name="Light List Accent 3" w:uiPriority="61"/>
+    <w:lsdException w:name="Light Grid Accent 3" w:uiPriority="62"/>
+    <w:lsdException w:name="Medium Shading 1 Accent 3" w:uiPriority="63"/>
+    <w:lsdException w:name="Medium Shading 2 Accent 3" w:uiPriority="64"/>
+    <w:lsdException w:name="Medium List 1 Accent 3" w:uiPriority="65"/>
+    <w:lsdException w:name="Medium List 2 Accent 3" w:uiPriority="66"/>
+    <w:lsdException w:name="Medium Grid 1 Accent 3" w:uiPriority="67"/>
+    <w:lsdException w:name="Medium Grid 2 Accent 3" w:uiPriority="68"/>
+    <w:lsdException w:name="Medium Grid 3 Accent 3" w:uiPriority="69"/>
+    <w:lsdException w:name="Dark List Accent 3" w:uiPriority="70"/>
+    <w:lsdException w:name="Colorful Shading Accent 3" w:uiPriority="71"/>
+    <w:lsdException w:name="Colorful List Accent 3" w:uiPriority="72"/>
+    <w:lsdException w:name="Colorful Grid Accent 3" w:uiPriority="73"/>
+    <w:lsdException w:name="Light Shading Accent 4" w:uiPriority="60"/>
+    <w:lsdException w:name="Light List Accent 4" w:uiPriority="61"/>
+    <w:lsdException w:name="Light Grid Accent 4" w:uiPriority="62"/>
+    <w:lsdException w:name="Medium Shading 1 Accent 4" w:uiPriority="63"/>
+    <w:lsdException w:name="Medium Shading 2 Accent 4" w:uiPriority="64"/>
+    <w:lsdException w:name="Medium List 1 Accent 4" w:uiPriority="65"/>
+    <w:lsdException w:name="Medium List 2 Accent 4" w:uiPriority="66"/>
+    <w:lsdException w:name="Medium Grid 1 Accent 4" w:uiPriority="67"/>
+    <w:lsdException w:name="Medium Grid 2 Accent 4" w:uiPriority="68"/>
+    <w:lsdException w:name="Medium Grid 3 Accent 4" w:uiPriority="69"/>
+    <w:lsdException w:name="Dark List Accent 4" w:uiPriority="70"/>
+    <w:lsdException w:name="Colorful Shading Accent 4" w:uiPriority="71"/>
+    <w:lsdException w:name="Colorful List Accent 4" w:uiPriority="72"/>
+    <w:lsdException w:name="Colorful Grid Accent 4" w:uiPriority="73"/>
+    <w:lsdException w:name="Light Shading Accent 5" w:uiPriority="60"/>
+    <w:lsdException w:name="Light List Accent 5" w:uiPriority="61"/>
+    <w:lsdException w:name="Light Grid Accent 5" w:uiPriority="62"/>
+    <w:lsdException w:name="Medium Shading 1 Accent 5" w:uiPriority="63"/>
+    <w:lsdException w:name="Medium Shading 2 Accent 5" w:uiPriority="64"/>
+    <w:lsdException w:name="Medium List 1 Accent 5" w:uiPriority="65"/>
+    <w:lsdException w:name="Medium List 2 Accent 5" w:uiPriority="66"/>
+    <w:lsdException w:name="Medium Grid 1 Accent 5" w:uiPriority="67"/>
+    <w:lsdException w:name="Medium Grid 2 Accent 5" w:uiPriority="68"/>
+    <w:lsdException w:name="Medium Grid 3 Accent 5" w:uiPriority="69"/>
+    <w:lsdException w:name="Dark List Accent 5" w:uiPriority="70"/>
+    <w:lsdException w:name="Colorful Shading Accent 5" w:uiPriority="71"/>
+    <w:lsdException w:name="Colorful List Accent 5" w:uiPriority="72"/>
+    <w:lsdException w:name="Colorful Grid Accent 5" w:uiPriority="73"/>
+    <w:lsdException w:name="Light Shading Accent 6" w:uiPriority="60"/>
+    <w:lsdException w:name="Light List Accent 6" w:uiPriority="61"/>
+    <w:lsdException w:name="Light Grid Accent 6" w:uiPriority="62"/>
+    <w:lsdException w:name="Medium Shading 1 Accent 6" w:uiPriority="63"/>
+    <w:lsdException w:name="Medium Shading 2 Accent 6" w:uiPriority="64"/>
+    <w:lsdException w:name="Medium List 1 Accent 6" w:uiPriority="65"/>
+    <w:lsdException w:name="Medium List 2 Accent 6" w:uiPriority="66"/>
+    <w:lsdException w:name="Medium Grid 1 Accent 6" w:uiPriority="67"/>
+    <w:lsdException w:name="Medium Grid 2 Accent 6" w:uiPriority="68"/>
+    <w:lsdException w:name="Medium Grid 3 Accent 6" w:uiPriority="69"/>
+    <w:lsdException w:name="Dark List Accent 6" w:uiPriority="70"/>
+    <w:lsdException w:name="Colorful Shading Accent 6" w:uiPriority="71"/>
+    <w:lsdException w:name="Colorful List Accent 6" w:uiPriority="72"/>
+    <w:lsdException w:name="Colorful Grid Accent 6" w:uiPriority="73"/>
+    <w:lsdException w:name="Subtle Emphasis" w:uiPriority="19" w:qFormat="1"/>
+    <w:lsdException w:name="Intense Emphasis" w:uiPriority="21" w:qFormat="1"/>
+    <w:lsdException w:name="Subtle Reference" w:uiPriority="31" w:qFormat="1"/>
+    <w:lsdException w:name="Intense Reference" w:uiPriority="32" w:qFormat="1"/>
+    <w:lsdException w:name="Book Title" w:uiPriority="33" w:qFormat="1"/>
+    <w:lsdException w:name="Bibliography" w:semiHidden="1" w:uiPriority="37" w:unhideWhenUsed="1"/>
+    <w:lsdException w:name="TOC Heading" w:semiHidden="1" w:uiPriority="39" w:unhideWhenUsed="1" w:qFormat="1"/>
+    <w:lsdException w:name="Plain Table 1" w:uiPriority="41"/>
+    <w:lsdException w:name="Plain Table 2" w:uiPriority="42"/>
+    <w:lsdException w:name="Plain Table 3" w:uiPriority="43"/>
+    <w:lsdException w:name="Plain Table 4" w:uiPriority="44"/>
+    <w:lsdException w:name="Plain Table 5" w:uiPriority="45"/>
+    <w:lsdException w:name="Grid Table Light" w:uiPriority="40"/>
+    <w:lsdException w:name="Grid Table 1 Light" w:uiPriority="46"/>
+    <w:lsdException w:name="Grid Table 2" w:uiPriority="47"/>
+    <w:lsdException w:name="Grid Table 3" w:uiPriority="48"/>
+    <w:lsdException w:name="Grid Table 4" w:uiPriority="49"/>
+    <w:lsdException w:name="Grid Table 5 Dark" w:uiPriority="50"/>
+    <w:lsdException w:name="Grid Table 6 Colorful" w:uiPriority="51"/>
+    <w:lsdException w:name="Grid Table 7 Colorful" w:uiPriority="52"/>
+    <w:lsdException w:name="Grid Table 1 Light Accent 1" w:uiPriority="46"/>
+    <w:lsdException w:name="Grid Table 2 Accent 1" w:uiPriority="47"/>
+    <w:lsdException w:name="Grid Table 3 Accent 1" w:uiPriority="48"/>
+    <w:lsdException w:name="Grid Table 4 Accent 1" w:uiPriority="49"/>
+    <w:lsdException w:name="Grid Table 5 Dark Accent 1" w:uiPriority="50"/>
+    <w:lsdException w:name="Grid Table 6 Colorful Accent 1" w:uiPriority="51"/>
+    <w:lsdException w:name="Grid Table 7 Colorful Accent 1" w:uiPriority="52"/>
+    <w:lsdException w:name="Grid Table 1 Light Accent 2" w:uiPriority="46"/>
+    <w:lsdException w:name="Grid Table 2 Accent 2" w:uiPriority="47"/>
+    <w:lsdException w:name="Grid Table 3 Accent 2" w:uiPriority="48"/>
+    <w:lsdException w:name="Grid Table 4 Accent 2" w:uiPriority="49"/>
+    <w:lsdException w:name="Grid Table 5 Dark Accent 2" w:uiPriority="50"/>
+    <w:lsdException w:name="Grid Table 6 Colorful Accent 2" w:uiPriority="51"/>
+    <w:lsdException w:name="Grid Table 7 Colorful Accent 2" w:uiPriority="52"/>
+    <w:lsdException w:name="Grid Table 1 Light Accent 3" w:uiPriority="46"/>
+    <w:lsdException w:name="Grid Table 2 Accent 3" w:uiPriority="47"/>
+    <w:lsdException w:name="Grid Table 3 Accent 3" w:uiPriority="48"/>
+    <w:lsdException w:name="Grid Table 4 Accent 3" w:uiPriority="49"/>
+    <w:lsdException w:name="Grid Table 5 Dark Accent 3" w:uiPriority="50"/>
+    <w:lsdException w:name="Grid Table 6 Colorful Accent 3" w:uiPriority="51"/>
+    <w:lsdException w:name="Grid Table 7 Colorful Accent 3" w:uiPriority="52"/>
+    <w:lsdException w:name="Grid Table 1 Light Accent 4" w:uiPriority="46"/>
+    <w:lsdException w:name="Grid Table 2 Accent 4" w:uiPriority="47"/>
+    <w:lsdException w:name="Grid Table 3 Accent 4" w:uiPriority="48"/>
+    <w:lsdException w:name="Grid Table 4 Accent 4" w:uiPriority="49"/>
+    <w:lsdException w:name="Grid Table 5 Dark Accent 4" w:uiPriority="50"/>
+    <w:lsdException w:name="Grid Table 6 Colorful Accent 4" w:uiPriority="51"/>
+    <w:lsdException w:name="Grid Table 7 Colorful Accent 4" w:uiPriority="52"/>
+    <w:lsdException w:name="Grid Table 1 Light Accent 5" w:uiPriority="46"/>
+    <w:lsdException w:name="Grid Table 2 Accent 5" w:uiPriority="47"/>
+    <w:lsdException w:name="Grid Table 3 Accent 5" w:uiPriority="48"/>
+    <w:lsdException w:name="Grid Table 4 Accent 5" w:uiPriority="49"/>
+    <w:lsdException w:name="Grid Table 5 Dark Accent 5" w:uiPriority="50"/>
+    <w:lsdException w:name="Grid Table 6 Colorful Accent 5" w:uiPriority="51"/>
+    <w:lsdException w:name="Grid Table 7 Colorful Accent 5" w:uiPriority="52"/>
+    <w:lsdException w:name="Grid Table 1 Light Accent 6" w:uiPriority="46"/>
+    <w:lsdException w:name="Grid Table 2 Accent 6" w:uiPriority="47"/>
+    <w:lsdException w:name="Grid Table 3 Accent 6" w:uiPriority="48"/>
+    <w:lsdException w:name="Grid Table 4 Accent 6" w:uiPriority="49"/>
+    <w:lsdException w:name="Grid Table 5 Dark Accent 6" w:uiPriority="50"/>
+    <w:lsdException w:name="Grid Table 6 Colorful Accent 6" w:uiPriority="51"/>
+    <w:lsdException w:name="Grid Table 7 Colorful Accent 6" w:uiPriority="52"/>
+    <w:lsdException w:name="List Table 1 Light" w:uiPriority="46"/>
+    <w:lsdException w:name="List Table 2" w:uiPriority="47"/>
+    <w:lsdException w:name="List Table 3" w:uiPriority="48"/>
+    <w:lsdException w:name="List Table 4" w:uiPriority="49"/>
+    <w:lsdException w:name="List Table 5 Dark" w:uiPriority="50"/>
+    <w:lsdException w:name="List Table 6 Colorful" w:uiPriority="51"/>
+    <w:lsdException w:name="List Table 7 Colorful" w:uiPriority="52"/>
+    <w:lsdException w:name="List Table 1 Light Accent 1" w:uiPriority="46"/>
+    <w:lsdException w:name="List Table 2 Accent 1" w:uiPriority="47"/>
+    <w:lsdException w:name="List Table 3 Accent 1" w:uiPriority="48"/>
+    <w:lsdException w:name="List Table 4 Accent 1" w:uiPriority="49"/>
+    <w:lsdException w:name="List Table 5 Dark Accent 1" w:uiPriority="50"/>
+    <w:lsdException w:name="List Table 6 Colorful Accent 1" w:uiPriority="51"/>
+    <w:lsdException w:name="List Table 7 Colorful Accent 1" w:uiPriority="52"/>
+    <w:lsdException w:name="List Table 1 Light Accent 2" w:uiPriority="46"/>
+    <w:lsdException w:name="List Table 2 Accent 2" w:uiPriority="47"/>
+    <w:lsdException w:name="List Table 3 Accent 2" w:uiPriority="48"/>
+    <w:lsdException w:name="List Table 4 Accent 2" w:uiPriority="49"/>
+    <w:lsdException w:name="List Table 5 Dark Accent 2" w:uiPriority="50"/>
+    <w:lsdException w:name="List Table 6 Colorful Accent 2" w:uiPriority="51"/>
+    <w:lsdException w:name="List Table 7 Colorful Accent 2" w:uiPriority="52"/>
+    <w:lsdException w:name="List Table 1 Light Accent 3" w:uiPriority="46"/>
+    <w:lsdException w:name="List Table 2 Accent 3" w:uiPriority="47"/>
+    <w:lsdException w:name="List Table 3 Accent 3" w:uiPriority="48"/>
+    <w:lsdException w:name="List Table 4 Accent 3" w:uiPriority="49"/>
+    <w:lsdException w:name="List Table 5 Dark Accent 3" w:uiPriority="50"/>
+    <w:lsdException w:name="List Table 6 Colorful Accent 3" w:uiPriority="51"/>
+    <w:lsdException w:name="List Table 7 Colorful Accent 3" w:uiPriority="52"/>
+    <w:lsdException w:name="List Table 1 Light Accent 4" w:uiPriority="46"/>
+    <w:lsdException w:name="List Table 2 Accent 4" w:uiPriority="47"/>
+    <w:lsdException w:name="List Table 3 Accent 4" w:uiPriority="48"/>
+    <w:lsdException w:name="List Table 4 Accent 4" w:uiPriority="49"/>
+    <w:lsdException w:name="List Table 5 Dark Accent 4" w:uiPriority="50"/>
+    <w:lsdException w:name="List Table 6 Colorful Accent 4" w:uiPriority="51"/>
+    <w:lsdException w:name="List Table 7 Colorful Accent 4" w:uiPriority="52"/>
+    <w:lsdException w:name="List Table 1 Light Accent 5" w:uiPriority="46"/>
+    <w:lsdException w:name="List Table 2 Accent 5" w:uiPriority="47"/>
+    <w:lsdException w:name="List Table 3 Accent 5" w:uiPriority="48"/>
+    <w:lsdException w:name="List Table 4 Accent 5" w:uiPriority="49"/>
+    <w:lsdException w:name="List Table 5 Dark Accent 5" w:uiPriority="50"/>
+    <w:lsdException w:name="List Table 6 Colorful Accent 5" w:uiPriority="51"/>
+    <w:lsdException w:name="List Table 7 Colorful Accent 5" w:uiPriority="52"/>
+    <w:lsdException w:name="List Table 1 Light Accent 6" w:uiPriority="46"/>
+    <w:lsdException w:name="List Table 2 Accent 6" w:uiPriority="47"/>
+    <w:lsdException w:name="List Table 3 Accent 6" w:uiPriority="48"/>
+    <w:lsdException w:name="List Table 4 Accent 6" w:uiPriority="49"/>
+    <w:lsdException w:name="List Table 5 Dark Accent 6" w:uiPriority="50"/>
+    <w:lsdException w:name="List Table 6 Colorful Accent 6" w:uiPriority="51"/>
+    <w:lsdException w:name="List Table 7 Colorful Accent 6" w:uiPriority="52"/>
+    <w:lsdException w:name="Mention" w:semiHidden="1" w:unhideWhenUsed="1"/>
+    <w:lsdException w:name="Smart Hyperlink" w:semiHidden="1" w:unhideWhenUsed="1"/>
+    <w:lsdException w:name="Hashtag" w:semiHidden="1" w:unhideWhenUsed="1"/>
+    <w:lsdException w:name="Unresolved Mention" w:semiHidden="1" w:unhideWhenUsed="1"/>
+    <w:lsdException w:name="Smart Link" w:semiHidden="1" w:unhideWhenUsed="1"/>
   </w:latentStyles>
   <w:style w:type="paragraph" w:default="1" w:styleId="Standard">
     <w:name w:val="Normal"/>
@@ -6115,7 +6762,6 @@
     <w:next w:val="Standard"/>
     <w:link w:val="berschrift4Zchn"/>
     <w:uiPriority w:val="9"/>
-    <w:semiHidden/>
     <w:unhideWhenUsed/>
     <w:qFormat/>
     <w:rsid w:val="006849E1"/>
@@ -6314,7 +6960,6 @@
     <w:basedOn w:val="Absatz-Standardschriftart"/>
     <w:link w:val="berschrift4"/>
     <w:uiPriority w:val="9"/>
-    <w:semiHidden/>
     <w:rsid w:val="006849E1"/>
     <w:rPr>
       <w:rFonts w:eastAsiaTheme="majorEastAsia" w:cstheme="majorBidi"/>
@@ -6578,802 +7223,8 @@
       <w:u w:val="single"/>
     </w:rPr>
   </w:style>
-  <w:style w:type="character" w:customStyle="1" w:styleId="UnresolvedMention">
-    <w:name w:val="Unresolved Mention"/>
-    <w:basedOn w:val="Absatz-Standardschriftart"/>
-    <w:uiPriority w:val="99"/>
-    <w:semiHidden/>
-    <w:unhideWhenUsed/>
-    <w:rsid w:val="00162472"/>
-    <w:rPr>
-      <w:color w:val="605E5C"/>
-      <w:shd w:val="clear" w:color="auto" w:fill="E1DFDD"/>
-    </w:rPr>
-  </w:style>
-  <w:style w:type="paragraph" w:styleId="StandardWeb">
-    <w:name w:val="Normal (Web)"/>
-    <w:basedOn w:val="Standard"/>
-    <w:uiPriority w:val="99"/>
-    <w:semiHidden/>
-    <w:unhideWhenUsed/>
-    <w:rsid w:val="00DF39A8"/>
-    <w:pPr>
-      <w:spacing w:before="100" w:beforeAutospacing="1" w:after="100" w:afterAutospacing="1" w:line="240" w:lineRule="auto"/>
-    </w:pPr>
-    <w:rPr>
-      <w:rFonts w:ascii="Times New Roman" w:eastAsia="Times New Roman" w:hAnsi="Times New Roman" w:cs="Times New Roman"/>
-      <w:sz w:val="24"/>
-      <w:szCs w:val="24"/>
-      <w:lang w:val="de-DE" w:eastAsia="de-DE"/>
-    </w:rPr>
-  </w:style>
-  <w:style w:type="character" w:styleId="Hervorhebung">
-    <w:name w:val="Emphasis"/>
-    <w:basedOn w:val="Absatz-Standardschriftart"/>
-    <w:uiPriority w:val="20"/>
-    <w:qFormat/>
-    <w:rsid w:val="00DF39A8"/>
-    <w:rPr>
-      <w:i/>
-      <w:iCs/>
-    </w:rPr>
-  </w:style>
-  <w:style w:type="character" w:styleId="Fett">
-    <w:name w:val="Strong"/>
-    <w:basedOn w:val="Absatz-Standardschriftart"/>
-    <w:uiPriority w:val="22"/>
-    <w:qFormat/>
-    <w:rsid w:val="00DF39A8"/>
-    <w:rPr>
-      <w:b/>
-      <w:bCs/>
-    </w:rPr>
-  </w:style>
-  <w:style w:type="character" w:styleId="HTMLCode">
-    <w:name w:val="HTML Code"/>
-    <w:basedOn w:val="Absatz-Standardschriftart"/>
-    <w:uiPriority w:val="99"/>
-    <w:semiHidden/>
-    <w:unhideWhenUsed/>
-    <w:rsid w:val="00DF39A8"/>
-    <w:rPr>
-      <w:rFonts w:ascii="Courier New" w:eastAsia="Times New Roman" w:hAnsi="Courier New" w:cs="Courier New"/>
-      <w:sz w:val="20"/>
-      <w:szCs w:val="20"/>
-    </w:rPr>
-  </w:style>
-  <w:style w:type="paragraph" w:styleId="Sprechblasentext">
-    <w:name w:val="Balloon Text"/>
-    <w:basedOn w:val="Standard"/>
-    <w:link w:val="SprechblasentextZchn"/>
-    <w:uiPriority w:val="99"/>
-    <w:semiHidden/>
-    <w:unhideWhenUsed/>
-    <w:rsid w:val="00537BC3"/>
-    <w:pPr>
-      <w:spacing w:after="0" w:line="240" w:lineRule="auto"/>
-    </w:pPr>
-    <w:rPr>
-      <w:rFonts w:ascii="Tahoma" w:hAnsi="Tahoma" w:cs="Tahoma"/>
-      <w:sz w:val="16"/>
-      <w:szCs w:val="16"/>
-    </w:rPr>
-  </w:style>
-  <w:style w:type="character" w:customStyle="1" w:styleId="SprechblasentextZchn">
-    <w:name w:val="Sprechblasentext Zchn"/>
-    <w:basedOn w:val="Absatz-Standardschriftart"/>
-    <w:link w:val="Sprechblasentext"/>
-    <w:uiPriority w:val="99"/>
-    <w:semiHidden/>
-    <w:rsid w:val="00537BC3"/>
-    <w:rPr>
-      <w:rFonts w:ascii="Tahoma" w:hAnsi="Tahoma" w:cs="Tahoma"/>
-      <w:sz w:val="16"/>
-      <w:szCs w:val="16"/>
-    </w:rPr>
-  </w:style>
-</w:styles>
-</file>
-
-<file path=word/stylesWithEffects.xml><?xml version="1.0" encoding="utf-8"?>
-<w:styles xmlns:wpc="http://schemas.microsoft.com/office/word/2010/wordprocessingCanvas" xmlns:mc="http://schemas.openxmlformats.org/markup-compatibility/2006" xmlns:o="urn:schemas-microsoft-com:office:office" xmlns:r="http://schemas.openxmlformats.org/officeDocument/2006/relationships" xmlns:m="http://schemas.openxmlformats.org/officeDocument/2006/math" xmlns:v="urn:schemas-microsoft-com:vml" xmlns:wp14="http://schemas.microsoft.com/office/word/2010/wordprocessingDrawing" xmlns:wp="http://schemas.openxmlformats.org/drawingml/2006/wordprocessingDrawing" xmlns:w10="urn:schemas-microsoft-com:office:word" xmlns:w="http://schemas.openxmlformats.org/wordprocessingml/2006/main" xmlns:w14="http://schemas.microsoft.com/office/word/2010/wordml" xmlns:wpg="http://schemas.microsoft.com/office/word/2010/wordprocessingGroup" xmlns:wpi="http://schemas.microsoft.com/office/word/2010/wordprocessingInk" xmlns:wne="http://schemas.microsoft.com/office/word/2006/wordml" xmlns:wps="http://schemas.microsoft.com/office/word/2010/wordprocessingShape" mc:Ignorable="w14 wp14">
-  <w:docDefaults>
-    <w:rPrDefault>
-      <w:rPr>
-        <w:rFonts w:asciiTheme="minorHAnsi" w:eastAsiaTheme="minorHAnsi" w:hAnsiTheme="minorHAnsi" w:cstheme="minorBidi"/>
-        <w:sz w:val="22"/>
-        <w:szCs w:val="22"/>
-        <w:lang w:val="de-AT" w:eastAsia="en-US" w:bidi="ar-SA"/>
-      </w:rPr>
-    </w:rPrDefault>
-    <w:pPrDefault>
-      <w:pPr>
-        <w:spacing w:after="160" w:line="259" w:lineRule="auto"/>
-      </w:pPr>
-    </w:pPrDefault>
-  </w:docDefaults>
-  <w:latentStyles w:defLockedState="0" w:defUIPriority="99" w:defSemiHidden="1" w:defUnhideWhenUsed="1" w:defQFormat="0" w:count="267">
-    <w:lsdException w:name="Normal" w:semiHidden="0" w:uiPriority="0" w:unhideWhenUsed="0" w:qFormat="1"/>
-    <w:lsdException w:name="heading 1" w:semiHidden="0" w:uiPriority="9" w:unhideWhenUsed="0" w:qFormat="1"/>
-    <w:lsdException w:name="heading 2" w:uiPriority="9" w:qFormat="1"/>
-    <w:lsdException w:name="heading 3" w:uiPriority="9" w:qFormat="1"/>
-    <w:lsdException w:name="heading 4" w:uiPriority="9" w:qFormat="1"/>
-    <w:lsdException w:name="heading 5" w:uiPriority="9" w:qFormat="1"/>
-    <w:lsdException w:name="heading 6" w:uiPriority="9" w:qFormat="1"/>
-    <w:lsdException w:name="heading 7" w:uiPriority="9" w:qFormat="1"/>
-    <w:lsdException w:name="heading 8" w:uiPriority="9" w:qFormat="1"/>
-    <w:lsdException w:name="heading 9" w:uiPriority="9" w:qFormat="1"/>
-    <w:lsdException w:name="toc 1" w:uiPriority="39"/>
-    <w:lsdException w:name="toc 2" w:uiPriority="39"/>
-    <w:lsdException w:name="toc 3" w:uiPriority="39"/>
-    <w:lsdException w:name="toc 4" w:uiPriority="39"/>
-    <w:lsdException w:name="toc 5" w:uiPriority="39"/>
-    <w:lsdException w:name="toc 6" w:uiPriority="39"/>
-    <w:lsdException w:name="toc 7" w:uiPriority="39"/>
-    <w:lsdException w:name="toc 8" w:uiPriority="39"/>
-    <w:lsdException w:name="toc 9" w:uiPriority="39"/>
-    <w:lsdException w:name="caption" w:uiPriority="35" w:qFormat="1"/>
-    <w:lsdException w:name="Title" w:semiHidden="0" w:uiPriority="10" w:unhideWhenUsed="0" w:qFormat="1"/>
-    <w:lsdException w:name="Default Paragraph Font" w:uiPriority="1"/>
-    <w:lsdException w:name="Subtitle" w:semiHidden="0" w:uiPriority="11" w:unhideWhenUsed="0" w:qFormat="1"/>
-    <w:lsdException w:name="Strong" w:semiHidden="0" w:uiPriority="22" w:unhideWhenUsed="0" w:qFormat="1"/>
-    <w:lsdException w:name="Emphasis" w:semiHidden="0" w:uiPriority="20" w:unhideWhenUsed="0" w:qFormat="1"/>
-    <w:lsdException w:name="Table Grid" w:semiHidden="0" w:uiPriority="39" w:unhideWhenUsed="0"/>
-    <w:lsdException w:name="Placeholder Text" w:unhideWhenUsed="0"/>
-    <w:lsdException w:name="No Spacing" w:semiHidden="0" w:uiPriority="1" w:unhideWhenUsed="0" w:qFormat="1"/>
-    <w:lsdException w:name="Light Shading" w:semiHidden="0" w:uiPriority="60" w:unhideWhenUsed="0"/>
-    <w:lsdException w:name="Light List" w:semiHidden="0" w:uiPriority="61" w:unhideWhenUsed="0"/>
-    <w:lsdException w:name="Light Grid" w:semiHidden="0" w:uiPriority="62" w:unhideWhenUsed="0"/>
-    <w:lsdException w:name="Medium Shading 1" w:semiHidden="0" w:uiPriority="63" w:unhideWhenUsed="0"/>
-    <w:lsdException w:name="Medium Shading 2" w:semiHidden="0" w:uiPriority="64" w:unhideWhenUsed="0"/>
-    <w:lsdException w:name="Medium List 1" w:semiHidden="0" w:uiPriority="65" w:unhideWhenUsed="0"/>
-    <w:lsdException w:name="Medium List 2" w:semiHidden="0" w:uiPriority="66" w:unhideWhenUsed="0"/>
-    <w:lsdException w:name="Medium Grid 1" w:semiHidden="0" w:uiPriority="67" w:unhideWhenUsed="0"/>
-    <w:lsdException w:name="Medium Grid 2" w:semiHidden="0" w:uiPriority="68" w:unhideWhenUsed="0"/>
-    <w:lsdException w:name="Medium Grid 3" w:semiHidden="0" w:uiPriority="69" w:unhideWhenUsed="0"/>
-    <w:lsdException w:name="Dark List" w:semiHidden="0" w:uiPriority="70" w:unhideWhenUsed="0"/>
-    <w:lsdException w:name="Colorful Shading" w:semiHidden="0" w:uiPriority="71" w:unhideWhenUsed="0"/>
-    <w:lsdException w:name="Colorful List" w:semiHidden="0" w:uiPriority="72" w:unhideWhenUsed="0"/>
-    <w:lsdException w:name="Colorful Grid" w:semiHidden="0" w:uiPriority="73" w:unhideWhenUsed="0"/>
-    <w:lsdException w:name="Light Shading Accent 1" w:semiHidden="0" w:uiPriority="60" w:unhideWhenUsed="0"/>
-    <w:lsdException w:name="Light List Accent 1" w:semiHidden="0" w:uiPriority="61" w:unhideWhenUsed="0"/>
-    <w:lsdException w:name="Light Grid Accent 1" w:semiHidden="0" w:uiPriority="62" w:unhideWhenUsed="0"/>
-    <w:lsdException w:name="Medium Shading 1 Accent 1" w:semiHidden="0" w:uiPriority="63" w:unhideWhenUsed="0"/>
-    <w:lsdException w:name="Medium Shading 2 Accent 1" w:semiHidden="0" w:uiPriority="64" w:unhideWhenUsed="0"/>
-    <w:lsdException w:name="Medium List 1 Accent 1" w:semiHidden="0" w:uiPriority="65" w:unhideWhenUsed="0"/>
-    <w:lsdException w:name="Revision" w:unhideWhenUsed="0"/>
-    <w:lsdException w:name="List Paragraph" w:semiHidden="0" w:uiPriority="34" w:unhideWhenUsed="0" w:qFormat="1"/>
-    <w:lsdException w:name="Quote" w:semiHidden="0" w:uiPriority="29" w:unhideWhenUsed="0" w:qFormat="1"/>
-    <w:lsdException w:name="Intense Quote" w:semiHidden="0" w:uiPriority="30" w:unhideWhenUsed="0" w:qFormat="1"/>
-    <w:lsdException w:name="Medium List 2 Accent 1" w:semiHidden="0" w:uiPriority="66" w:unhideWhenUsed="0"/>
-    <w:lsdException w:name="Medium Grid 1 Accent 1" w:semiHidden="0" w:uiPriority="67" w:unhideWhenUsed="0"/>
-    <w:lsdException w:name="Medium Grid 2 Accent 1" w:semiHidden="0" w:uiPriority="68" w:unhideWhenUsed="0"/>
-    <w:lsdException w:name="Medium Grid 3 Accent 1" w:semiHidden="0" w:uiPriority="69" w:unhideWhenUsed="0"/>
-    <w:lsdException w:name="Dark List Accent 1" w:semiHidden="0" w:uiPriority="70" w:unhideWhenUsed="0"/>
-    <w:lsdException w:name="Colorful Shading Accent 1" w:semiHidden="0" w:uiPriority="71" w:unhideWhenUsed="0"/>
-    <w:lsdException w:name="Colorful List Accent 1" w:semiHidden="0" w:uiPriority="72" w:unhideWhenUsed="0"/>
-    <w:lsdException w:name="Colorful Grid Accent 1" w:semiHidden="0" w:uiPriority="73" w:unhideWhenUsed="0"/>
-    <w:lsdException w:name="Light Shading Accent 2" w:semiHidden="0" w:uiPriority="60" w:unhideWhenUsed="0"/>
-    <w:lsdException w:name="Light List Accent 2" w:semiHidden="0" w:uiPriority="61" w:unhideWhenUsed="0"/>
-    <w:lsdException w:name="Light Grid Accent 2" w:semiHidden="0" w:uiPriority="62" w:unhideWhenUsed="0"/>
-    <w:lsdException w:name="Medium Shading 1 Accent 2" w:semiHidden="0" w:uiPriority="63" w:unhideWhenUsed="0"/>
-    <w:lsdException w:name="Medium Shading 2 Accent 2" w:semiHidden="0" w:uiPriority="64" w:unhideWhenUsed="0"/>
-    <w:lsdException w:name="Medium List 1 Accent 2" w:semiHidden="0" w:uiPriority="65" w:unhideWhenUsed="0"/>
-    <w:lsdException w:name="Medium List 2 Accent 2" w:semiHidden="0" w:uiPriority="66" w:unhideWhenUsed="0"/>
-    <w:lsdException w:name="Medium Grid 1 Accent 2" w:semiHidden="0" w:uiPriority="67" w:unhideWhenUsed="0"/>
-    <w:lsdException w:name="Medium Grid 2 Accent 2" w:semiHidden="0" w:uiPriority="68" w:unhideWhenUsed="0"/>
-    <w:lsdException w:name="Medium Grid 3 Accent 2" w:semiHidden="0" w:uiPriority="69" w:unhideWhenUsed="0"/>
-    <w:lsdException w:name="Dark List Accent 2" w:semiHidden="0" w:uiPriority="70" w:unhideWhenUsed="0"/>
-    <w:lsdException w:name="Colorful Shading Accent 2" w:semiHidden="0" w:uiPriority="71" w:unhideWhenUsed="0"/>
-    <w:lsdException w:name="Colorful List Accent 2" w:semiHidden="0" w:uiPriority="72" w:unhideWhenUsed="0"/>
-    <w:lsdException w:name="Colorful Grid Accent 2" w:semiHidden="0" w:uiPriority="73" w:unhideWhenUsed="0"/>
-    <w:lsdException w:name="Light Shading Accent 3" w:semiHidden="0" w:uiPriority="60" w:unhideWhenUsed="0"/>
-    <w:lsdException w:name="Light List Accent 3" w:semiHidden="0" w:uiPriority="61" w:unhideWhenUsed="0"/>
-    <w:lsdException w:name="Light Grid Accent 3" w:semiHidden="0" w:uiPriority="62" w:unhideWhenUsed="0"/>
-    <w:lsdException w:name="Medium Shading 1 Accent 3" w:semiHidden="0" w:uiPriority="63" w:unhideWhenUsed="0"/>
-    <w:lsdException w:name="Medium Shading 2 Accent 3" w:semiHidden="0" w:uiPriority="64" w:unhideWhenUsed="0"/>
-    <w:lsdException w:name="Medium List 1 Accent 3" w:semiHidden="0" w:uiPriority="65" w:unhideWhenUsed="0"/>
-    <w:lsdException w:name="Medium List 2 Accent 3" w:semiHidden="0" w:uiPriority="66" w:unhideWhenUsed="0"/>
-    <w:lsdException w:name="Medium Grid 1 Accent 3" w:semiHidden="0" w:uiPriority="67" w:unhideWhenUsed="0"/>
-    <w:lsdException w:name="Medium Grid 2 Accent 3" w:semiHidden="0" w:uiPriority="68" w:unhideWhenUsed="0"/>
-    <w:lsdException w:name="Medium Grid 3 Accent 3" w:semiHidden="0" w:uiPriority="69" w:unhideWhenUsed="0"/>
-    <w:lsdException w:name="Dark List Accent 3" w:semiHidden="0" w:uiPriority="70" w:unhideWhenUsed="0"/>
-    <w:lsdException w:name="Colorful Shading Accent 3" w:semiHidden="0" w:uiPriority="71" w:unhideWhenUsed="0"/>
-    <w:lsdException w:name="Colorful List Accent 3" w:semiHidden="0" w:uiPriority="72" w:unhideWhenUsed="0"/>
-    <w:lsdException w:name="Colorful Grid Accent 3" w:semiHidden="0" w:uiPriority="73" w:unhideWhenUsed="0"/>
-    <w:lsdException w:name="Light Shading Accent 4" w:semiHidden="0" w:uiPriority="60" w:unhideWhenUsed="0"/>
-    <w:lsdException w:name="Light List Accent 4" w:semiHidden="0" w:uiPriority="61" w:unhideWhenUsed="0"/>
-    <w:lsdException w:name="Light Grid Accent 4" w:semiHidden="0" w:uiPriority="62" w:unhideWhenUsed="0"/>
-    <w:lsdException w:name="Medium Shading 1 Accent 4" w:semiHidden="0" w:uiPriority="63" w:unhideWhenUsed="0"/>
-    <w:lsdException w:name="Medium Shading 2 Accent 4" w:semiHidden="0" w:uiPriority="64" w:unhideWhenUsed="0"/>
-    <w:lsdException w:name="Medium List 1 Accent 4" w:semiHidden="0" w:uiPriority="65" w:unhideWhenUsed="0"/>
-    <w:lsdException w:name="Medium List 2 Accent 4" w:semiHidden="0" w:uiPriority="66" w:unhideWhenUsed="0"/>
-    <w:lsdException w:name="Medium Grid 1 Accent 4" w:semiHidden="0" w:uiPriority="67" w:unhideWhenUsed="0"/>
-    <w:lsdException w:name="Medium Grid 2 Accent 4" w:semiHidden="0" w:uiPriority="68" w:unhideWhenUsed="0"/>
-    <w:lsdException w:name="Medium Grid 3 Accent 4" w:semiHidden="0" w:uiPriority="69" w:unhideWhenUsed="0"/>
-    <w:lsdException w:name="Dark List Accent 4" w:semiHidden="0" w:uiPriority="70" w:unhideWhenUsed="0"/>
-    <w:lsdException w:name="Colorful Shading Accent 4" w:semiHidden="0" w:uiPriority="71" w:unhideWhenUsed="0"/>
-    <w:lsdException w:name="Colorful List Accent 4" w:semiHidden="0" w:uiPriority="72" w:unhideWhenUsed="0"/>
-    <w:lsdException w:name="Colorful Grid Accent 4" w:semiHidden="0" w:uiPriority="73" w:unhideWhenUsed="0"/>
-    <w:lsdException w:name="Light Shading Accent 5" w:semiHidden="0" w:uiPriority="60" w:unhideWhenUsed="0"/>
-    <w:lsdException w:name="Light List Accent 5" w:semiHidden="0" w:uiPriority="61" w:unhideWhenUsed="0"/>
-    <w:lsdException w:name="Light Grid Accent 5" w:semiHidden="0" w:uiPriority="62" w:unhideWhenUsed="0"/>
-    <w:lsdException w:name="Medium Shading 1 Accent 5" w:semiHidden="0" w:uiPriority="63" w:unhideWhenUsed="0"/>
-    <w:lsdException w:name="Medium Shading 2 Accent 5" w:semiHidden="0" w:uiPriority="64" w:unhideWhenUsed="0"/>
-    <w:lsdException w:name="Medium List 1 Accent 5" w:semiHidden="0" w:uiPriority="65" w:unhideWhenUsed="0"/>
-    <w:lsdException w:name="Medium List 2 Accent 5" w:semiHidden="0" w:uiPriority="66" w:unhideWhenUsed="0"/>
-    <w:lsdException w:name="Medium Grid 1 Accent 5" w:semiHidden="0" w:uiPriority="67" w:unhideWhenUsed="0"/>
-    <w:lsdException w:name="Medium Grid 2 Accent 5" w:semiHidden="0" w:uiPriority="68" w:unhideWhenUsed="0"/>
-    <w:lsdException w:name="Medium Grid 3 Accent 5" w:semiHidden="0" w:uiPriority="69" w:unhideWhenUsed="0"/>
-    <w:lsdException w:name="Dark List Accent 5" w:semiHidden="0" w:uiPriority="70" w:unhideWhenUsed="0"/>
-    <w:lsdException w:name="Colorful Shading Accent 5" w:semiHidden="0" w:uiPriority="71" w:unhideWhenUsed="0"/>
-    <w:lsdException w:name="Colorful List Accent 5" w:semiHidden="0" w:uiPriority="72" w:unhideWhenUsed="0"/>
-    <w:lsdException w:name="Colorful Grid Accent 5" w:semiHidden="0" w:uiPriority="73" w:unhideWhenUsed="0"/>
-    <w:lsdException w:name="Light Shading Accent 6" w:semiHidden="0" w:uiPriority="60" w:unhideWhenUsed="0"/>
-    <w:lsdException w:name="Light List Accent 6" w:semiHidden="0" w:uiPriority="61" w:unhideWhenUsed="0"/>
-    <w:lsdException w:name="Light Grid Accent 6" w:semiHidden="0" w:uiPriority="62" w:unhideWhenUsed="0"/>
-    <w:lsdException w:name="Medium Shading 1 Accent 6" w:semiHidden="0" w:uiPriority="63" w:unhideWhenUsed="0"/>
-    <w:lsdException w:name="Medium Shading 2 Accent 6" w:semiHidden="0" w:uiPriority="64" w:unhideWhenUsed="0"/>
-    <w:lsdException w:name="Medium List 1 Accent 6" w:semiHidden="0" w:uiPriority="65" w:unhideWhenUsed="0"/>
-    <w:lsdException w:name="Medium List 2 Accent 6" w:semiHidden="0" w:uiPriority="66" w:unhideWhenUsed="0"/>
-    <w:lsdException w:name="Medium Grid 1 Accent 6" w:semiHidden="0" w:uiPriority="67" w:unhideWhenUsed="0"/>
-    <w:lsdException w:name="Medium Grid 2 Accent 6" w:semiHidden="0" w:uiPriority="68" w:unhideWhenUsed="0"/>
-    <w:lsdException w:name="Medium Grid 3 Accent 6" w:semiHidden="0" w:uiPriority="69" w:unhideWhenUsed="0"/>
-    <w:lsdException w:name="Dark List Accent 6" w:semiHidden="0" w:uiPriority="70" w:unhideWhenUsed="0"/>
-    <w:lsdException w:name="Colorful Shading Accent 6" w:semiHidden="0" w:uiPriority="71" w:unhideWhenUsed="0"/>
-    <w:lsdException w:name="Colorful List Accent 6" w:semiHidden="0" w:uiPriority="72" w:unhideWhenUsed="0"/>
-    <w:lsdException w:name="Colorful Grid Accent 6" w:semiHidden="0" w:uiPriority="73" w:unhideWhenUsed="0"/>
-    <w:lsdException w:name="Subtle Emphasis" w:semiHidden="0" w:uiPriority="19" w:unhideWhenUsed="0" w:qFormat="1"/>
-    <w:lsdException w:name="Intense Emphasis" w:semiHidden="0" w:uiPriority="21" w:unhideWhenUsed="0" w:qFormat="1"/>
-    <w:lsdException w:name="Subtle Reference" w:semiHidden="0" w:uiPriority="31" w:unhideWhenUsed="0" w:qFormat="1"/>
-    <w:lsdException w:name="Intense Reference" w:semiHidden="0" w:uiPriority="32" w:unhideWhenUsed="0" w:qFormat="1"/>
-    <w:lsdException w:name="Book Title" w:semiHidden="0" w:uiPriority="33" w:unhideWhenUsed="0" w:qFormat="1"/>
-    <w:lsdException w:name="Bibliography" w:uiPriority="37"/>
-    <w:lsdException w:name="TOC Heading" w:uiPriority="39" w:qFormat="1"/>
-  </w:latentStyles>
-  <w:style w:type="paragraph" w:default="1" w:styleId="Standard">
-    <w:name w:val="Normal"/>
-    <w:qFormat/>
-    <w:rsid w:val="00141876"/>
-  </w:style>
-  <w:style w:type="paragraph" w:styleId="berschrift1">
-    <w:name w:val="heading 1"/>
-    <w:basedOn w:val="Standard"/>
-    <w:next w:val="Standard"/>
-    <w:link w:val="berschrift1Zchn"/>
-    <w:uiPriority w:val="9"/>
-    <w:qFormat/>
-    <w:rsid w:val="006849E1"/>
-    <w:pPr>
-      <w:keepNext/>
-      <w:keepLines/>
-      <w:spacing w:before="360" w:after="80"/>
-      <w:outlineLvl w:val="0"/>
-    </w:pPr>
-    <w:rPr>
-      <w:rFonts w:asciiTheme="majorHAnsi" w:eastAsiaTheme="majorEastAsia" w:hAnsiTheme="majorHAnsi" w:cstheme="majorBidi"/>
-      <w:color w:val="2F5496" w:themeColor="accent1" w:themeShade="BF"/>
-      <w:sz w:val="40"/>
-      <w:szCs w:val="40"/>
-    </w:rPr>
-  </w:style>
-  <w:style w:type="paragraph" w:styleId="berschrift2">
-    <w:name w:val="heading 2"/>
-    <w:basedOn w:val="Standard"/>
-    <w:next w:val="Standard"/>
-    <w:link w:val="berschrift2Zchn"/>
-    <w:uiPriority w:val="9"/>
-    <w:semiHidden/>
-    <w:unhideWhenUsed/>
-    <w:qFormat/>
-    <w:rsid w:val="006849E1"/>
-    <w:pPr>
-      <w:keepNext/>
-      <w:keepLines/>
-      <w:spacing w:before="160" w:after="80"/>
-      <w:outlineLvl w:val="1"/>
-    </w:pPr>
-    <w:rPr>
-      <w:rFonts w:asciiTheme="majorHAnsi" w:eastAsiaTheme="majorEastAsia" w:hAnsiTheme="majorHAnsi" w:cstheme="majorBidi"/>
-      <w:color w:val="2F5496" w:themeColor="accent1" w:themeShade="BF"/>
-      <w:sz w:val="32"/>
-      <w:szCs w:val="32"/>
-    </w:rPr>
-  </w:style>
-  <w:style w:type="paragraph" w:styleId="berschrift3">
-    <w:name w:val="heading 3"/>
-    <w:basedOn w:val="Standard"/>
-    <w:next w:val="Standard"/>
-    <w:link w:val="berschrift3Zchn"/>
-    <w:uiPriority w:val="9"/>
-    <w:semiHidden/>
-    <w:unhideWhenUsed/>
-    <w:qFormat/>
-    <w:rsid w:val="006849E1"/>
-    <w:pPr>
-      <w:keepNext/>
-      <w:keepLines/>
-      <w:spacing w:before="160" w:after="80"/>
-      <w:outlineLvl w:val="2"/>
-    </w:pPr>
-    <w:rPr>
-      <w:rFonts w:eastAsiaTheme="majorEastAsia" w:cstheme="majorBidi"/>
-      <w:color w:val="2F5496" w:themeColor="accent1" w:themeShade="BF"/>
-      <w:sz w:val="28"/>
-      <w:szCs w:val="28"/>
-    </w:rPr>
-  </w:style>
-  <w:style w:type="paragraph" w:styleId="berschrift4">
-    <w:name w:val="heading 4"/>
-    <w:basedOn w:val="Standard"/>
-    <w:next w:val="Standard"/>
-    <w:link w:val="berschrift4Zchn"/>
-    <w:uiPriority w:val="9"/>
-    <w:semiHidden/>
-    <w:unhideWhenUsed/>
-    <w:qFormat/>
-    <w:rsid w:val="006849E1"/>
-    <w:pPr>
-      <w:keepNext/>
-      <w:keepLines/>
-      <w:spacing w:before="80" w:after="40"/>
-      <w:outlineLvl w:val="3"/>
-    </w:pPr>
-    <w:rPr>
-      <w:rFonts w:eastAsiaTheme="majorEastAsia" w:cstheme="majorBidi"/>
-      <w:i/>
-      <w:iCs/>
-      <w:color w:val="2F5496" w:themeColor="accent1" w:themeShade="BF"/>
-    </w:rPr>
-  </w:style>
-  <w:style w:type="paragraph" w:styleId="berschrift5">
-    <w:name w:val="heading 5"/>
-    <w:basedOn w:val="Standard"/>
-    <w:next w:val="Standard"/>
-    <w:link w:val="berschrift5Zchn"/>
-    <w:uiPriority w:val="9"/>
-    <w:semiHidden/>
-    <w:unhideWhenUsed/>
-    <w:qFormat/>
-    <w:rsid w:val="006849E1"/>
-    <w:pPr>
-      <w:keepNext/>
-      <w:keepLines/>
-      <w:spacing w:before="80" w:after="40"/>
-      <w:outlineLvl w:val="4"/>
-    </w:pPr>
-    <w:rPr>
-      <w:rFonts w:eastAsiaTheme="majorEastAsia" w:cstheme="majorBidi"/>
-      <w:color w:val="2F5496" w:themeColor="accent1" w:themeShade="BF"/>
-    </w:rPr>
-  </w:style>
-  <w:style w:type="paragraph" w:styleId="berschrift6">
-    <w:name w:val="heading 6"/>
-    <w:basedOn w:val="Standard"/>
-    <w:next w:val="Standard"/>
-    <w:link w:val="berschrift6Zchn"/>
-    <w:uiPriority w:val="9"/>
-    <w:semiHidden/>
-    <w:unhideWhenUsed/>
-    <w:qFormat/>
-    <w:rsid w:val="006849E1"/>
-    <w:pPr>
-      <w:keepNext/>
-      <w:keepLines/>
-      <w:spacing w:before="40" w:after="0"/>
-      <w:outlineLvl w:val="5"/>
-    </w:pPr>
-    <w:rPr>
-      <w:rFonts w:eastAsiaTheme="majorEastAsia" w:cstheme="majorBidi"/>
-      <w:i/>
-      <w:iCs/>
-      <w:color w:val="595959" w:themeColor="text1" w:themeTint="A6"/>
-    </w:rPr>
-  </w:style>
-  <w:style w:type="paragraph" w:styleId="berschrift7">
-    <w:name w:val="heading 7"/>
-    <w:basedOn w:val="Standard"/>
-    <w:next w:val="Standard"/>
-    <w:link w:val="berschrift7Zchn"/>
-    <w:uiPriority w:val="9"/>
-    <w:semiHidden/>
-    <w:unhideWhenUsed/>
-    <w:qFormat/>
-    <w:rsid w:val="006849E1"/>
-    <w:pPr>
-      <w:keepNext/>
-      <w:keepLines/>
-      <w:spacing w:before="40" w:after="0"/>
-      <w:outlineLvl w:val="6"/>
-    </w:pPr>
-    <w:rPr>
-      <w:rFonts w:eastAsiaTheme="majorEastAsia" w:cstheme="majorBidi"/>
-      <w:color w:val="595959" w:themeColor="text1" w:themeTint="A6"/>
-    </w:rPr>
-  </w:style>
-  <w:style w:type="paragraph" w:styleId="berschrift8">
-    <w:name w:val="heading 8"/>
-    <w:basedOn w:val="Standard"/>
-    <w:next w:val="Standard"/>
-    <w:link w:val="berschrift8Zchn"/>
-    <w:uiPriority w:val="9"/>
-    <w:semiHidden/>
-    <w:unhideWhenUsed/>
-    <w:qFormat/>
-    <w:rsid w:val="006849E1"/>
-    <w:pPr>
-      <w:keepNext/>
-      <w:keepLines/>
-      <w:spacing w:after="0"/>
-      <w:outlineLvl w:val="7"/>
-    </w:pPr>
-    <w:rPr>
-      <w:rFonts w:eastAsiaTheme="majorEastAsia" w:cstheme="majorBidi"/>
-      <w:i/>
-      <w:iCs/>
-      <w:color w:val="272727" w:themeColor="text1" w:themeTint="D8"/>
-    </w:rPr>
-  </w:style>
-  <w:style w:type="paragraph" w:styleId="berschrift9">
-    <w:name w:val="heading 9"/>
-    <w:basedOn w:val="Standard"/>
-    <w:next w:val="Standard"/>
-    <w:link w:val="berschrift9Zchn"/>
-    <w:uiPriority w:val="9"/>
-    <w:semiHidden/>
-    <w:unhideWhenUsed/>
-    <w:qFormat/>
-    <w:rsid w:val="006849E1"/>
-    <w:pPr>
-      <w:keepNext/>
-      <w:keepLines/>
-      <w:spacing w:after="0"/>
-      <w:outlineLvl w:val="8"/>
-    </w:pPr>
-    <w:rPr>
-      <w:rFonts w:eastAsiaTheme="majorEastAsia" w:cstheme="majorBidi"/>
-      <w:color w:val="272727" w:themeColor="text1" w:themeTint="D8"/>
-    </w:rPr>
-  </w:style>
-  <w:style w:type="character" w:default="1" w:styleId="Absatz-Standardschriftart">
-    <w:name w:val="Default Paragraph Font"/>
-    <w:uiPriority w:val="1"/>
-    <w:semiHidden/>
-    <w:unhideWhenUsed/>
-  </w:style>
-  <w:style w:type="table" w:default="1" w:styleId="NormaleTabelle">
-    <w:name w:val="Normal Table"/>
-    <w:uiPriority w:val="99"/>
-    <w:semiHidden/>
-    <w:unhideWhenUsed/>
-    <w:tblPr>
-      <w:tblInd w:w="0" w:type="dxa"/>
-      <w:tblCellMar>
-        <w:top w:w="0" w:type="dxa"/>
-        <w:left w:w="108" w:type="dxa"/>
-        <w:bottom w:w="0" w:type="dxa"/>
-        <w:right w:w="108" w:type="dxa"/>
-      </w:tblCellMar>
-    </w:tblPr>
-  </w:style>
-  <w:style w:type="numbering" w:default="1" w:styleId="KeineListe">
-    <w:name w:val="No List"/>
-    <w:uiPriority w:val="99"/>
-    <w:semiHidden/>
-    <w:unhideWhenUsed/>
-  </w:style>
-  <w:style w:type="character" w:customStyle="1" w:styleId="berschrift1Zchn">
-    <w:name w:val="Überschrift 1 Zchn"/>
-    <w:basedOn w:val="Absatz-Standardschriftart"/>
-    <w:link w:val="berschrift1"/>
-    <w:uiPriority w:val="9"/>
-    <w:rsid w:val="006849E1"/>
-    <w:rPr>
-      <w:rFonts w:asciiTheme="majorHAnsi" w:eastAsiaTheme="majorEastAsia" w:hAnsiTheme="majorHAnsi" w:cstheme="majorBidi"/>
-      <w:color w:val="2F5496" w:themeColor="accent1" w:themeShade="BF"/>
-      <w:sz w:val="40"/>
-      <w:szCs w:val="40"/>
-    </w:rPr>
-  </w:style>
-  <w:style w:type="character" w:customStyle="1" w:styleId="berschrift2Zchn">
-    <w:name w:val="Überschrift 2 Zchn"/>
-    <w:basedOn w:val="Absatz-Standardschriftart"/>
-    <w:link w:val="berschrift2"/>
-    <w:uiPriority w:val="9"/>
-    <w:semiHidden/>
-    <w:rsid w:val="006849E1"/>
-    <w:rPr>
-      <w:rFonts w:asciiTheme="majorHAnsi" w:eastAsiaTheme="majorEastAsia" w:hAnsiTheme="majorHAnsi" w:cstheme="majorBidi"/>
-      <w:color w:val="2F5496" w:themeColor="accent1" w:themeShade="BF"/>
-      <w:sz w:val="32"/>
-      <w:szCs w:val="32"/>
-    </w:rPr>
-  </w:style>
-  <w:style w:type="character" w:customStyle="1" w:styleId="berschrift3Zchn">
-    <w:name w:val="Überschrift 3 Zchn"/>
-    <w:basedOn w:val="Absatz-Standardschriftart"/>
-    <w:link w:val="berschrift3"/>
-    <w:uiPriority w:val="9"/>
-    <w:semiHidden/>
-    <w:rsid w:val="006849E1"/>
-    <w:rPr>
-      <w:rFonts w:eastAsiaTheme="majorEastAsia" w:cstheme="majorBidi"/>
-      <w:color w:val="2F5496" w:themeColor="accent1" w:themeShade="BF"/>
-      <w:sz w:val="28"/>
-      <w:szCs w:val="28"/>
-    </w:rPr>
-  </w:style>
-  <w:style w:type="character" w:customStyle="1" w:styleId="berschrift4Zchn">
-    <w:name w:val="Überschrift 4 Zchn"/>
-    <w:basedOn w:val="Absatz-Standardschriftart"/>
-    <w:link w:val="berschrift4"/>
-    <w:uiPriority w:val="9"/>
-    <w:semiHidden/>
-    <w:rsid w:val="006849E1"/>
-    <w:rPr>
-      <w:rFonts w:eastAsiaTheme="majorEastAsia" w:cstheme="majorBidi"/>
-      <w:i/>
-      <w:iCs/>
-      <w:color w:val="2F5496" w:themeColor="accent1" w:themeShade="BF"/>
-    </w:rPr>
-  </w:style>
-  <w:style w:type="character" w:customStyle="1" w:styleId="berschrift5Zchn">
-    <w:name w:val="Überschrift 5 Zchn"/>
-    <w:basedOn w:val="Absatz-Standardschriftart"/>
-    <w:link w:val="berschrift5"/>
-    <w:uiPriority w:val="9"/>
-    <w:semiHidden/>
-    <w:rsid w:val="006849E1"/>
-    <w:rPr>
-      <w:rFonts w:eastAsiaTheme="majorEastAsia" w:cstheme="majorBidi"/>
-      <w:color w:val="2F5496" w:themeColor="accent1" w:themeShade="BF"/>
-    </w:rPr>
-  </w:style>
-  <w:style w:type="character" w:customStyle="1" w:styleId="berschrift6Zchn">
-    <w:name w:val="Überschrift 6 Zchn"/>
-    <w:basedOn w:val="Absatz-Standardschriftart"/>
-    <w:link w:val="berschrift6"/>
-    <w:uiPriority w:val="9"/>
-    <w:semiHidden/>
-    <w:rsid w:val="006849E1"/>
-    <w:rPr>
-      <w:rFonts w:eastAsiaTheme="majorEastAsia" w:cstheme="majorBidi"/>
-      <w:i/>
-      <w:iCs/>
-      <w:color w:val="595959" w:themeColor="text1" w:themeTint="A6"/>
-    </w:rPr>
-  </w:style>
-  <w:style w:type="character" w:customStyle="1" w:styleId="berschrift7Zchn">
-    <w:name w:val="Überschrift 7 Zchn"/>
-    <w:basedOn w:val="Absatz-Standardschriftart"/>
-    <w:link w:val="berschrift7"/>
-    <w:uiPriority w:val="9"/>
-    <w:semiHidden/>
-    <w:rsid w:val="006849E1"/>
-    <w:rPr>
-      <w:rFonts w:eastAsiaTheme="majorEastAsia" w:cstheme="majorBidi"/>
-      <w:color w:val="595959" w:themeColor="text1" w:themeTint="A6"/>
-    </w:rPr>
-  </w:style>
-  <w:style w:type="character" w:customStyle="1" w:styleId="berschrift8Zchn">
-    <w:name w:val="Überschrift 8 Zchn"/>
-    <w:basedOn w:val="Absatz-Standardschriftart"/>
-    <w:link w:val="berschrift8"/>
-    <w:uiPriority w:val="9"/>
-    <w:semiHidden/>
-    <w:rsid w:val="006849E1"/>
-    <w:rPr>
-      <w:rFonts w:eastAsiaTheme="majorEastAsia" w:cstheme="majorBidi"/>
-      <w:i/>
-      <w:iCs/>
-      <w:color w:val="272727" w:themeColor="text1" w:themeTint="D8"/>
-    </w:rPr>
-  </w:style>
-  <w:style w:type="character" w:customStyle="1" w:styleId="berschrift9Zchn">
-    <w:name w:val="Überschrift 9 Zchn"/>
-    <w:basedOn w:val="Absatz-Standardschriftart"/>
-    <w:link w:val="berschrift9"/>
-    <w:uiPriority w:val="9"/>
-    <w:semiHidden/>
-    <w:rsid w:val="006849E1"/>
-    <w:rPr>
-      <w:rFonts w:eastAsiaTheme="majorEastAsia" w:cstheme="majorBidi"/>
-      <w:color w:val="272727" w:themeColor="text1" w:themeTint="D8"/>
-    </w:rPr>
-  </w:style>
-  <w:style w:type="paragraph" w:styleId="Titel">
-    <w:name w:val="Title"/>
-    <w:basedOn w:val="Standard"/>
-    <w:next w:val="Standard"/>
-    <w:link w:val="TitelZchn"/>
-    <w:uiPriority w:val="10"/>
-    <w:qFormat/>
-    <w:rsid w:val="006849E1"/>
-    <w:pPr>
-      <w:spacing w:after="80" w:line="240" w:lineRule="auto"/>
-      <w:contextualSpacing/>
-    </w:pPr>
-    <w:rPr>
-      <w:rFonts w:asciiTheme="majorHAnsi" w:eastAsiaTheme="majorEastAsia" w:hAnsiTheme="majorHAnsi" w:cstheme="majorBidi"/>
-      <w:spacing w:val="-10"/>
-      <w:kern w:val="28"/>
-      <w:sz w:val="56"/>
-      <w:szCs w:val="56"/>
-    </w:rPr>
-  </w:style>
-  <w:style w:type="character" w:customStyle="1" w:styleId="TitelZchn">
-    <w:name w:val="Titel Zchn"/>
-    <w:basedOn w:val="Absatz-Standardschriftart"/>
-    <w:link w:val="Titel"/>
-    <w:uiPriority w:val="10"/>
-    <w:rsid w:val="006849E1"/>
-    <w:rPr>
-      <w:rFonts w:asciiTheme="majorHAnsi" w:eastAsiaTheme="majorEastAsia" w:hAnsiTheme="majorHAnsi" w:cstheme="majorBidi"/>
-      <w:spacing w:val="-10"/>
-      <w:kern w:val="28"/>
-      <w:sz w:val="56"/>
-      <w:szCs w:val="56"/>
-    </w:rPr>
-  </w:style>
-  <w:style w:type="paragraph" w:styleId="Untertitel">
-    <w:name w:val="Subtitle"/>
-    <w:basedOn w:val="Standard"/>
-    <w:next w:val="Standard"/>
-    <w:link w:val="UntertitelZchn"/>
-    <w:uiPriority w:val="11"/>
-    <w:qFormat/>
-    <w:rsid w:val="006849E1"/>
-    <w:pPr>
-      <w:numPr>
-        <w:ilvl w:val="1"/>
-      </w:numPr>
-    </w:pPr>
-    <w:rPr>
-      <w:rFonts w:eastAsiaTheme="majorEastAsia" w:cstheme="majorBidi"/>
-      <w:color w:val="595959" w:themeColor="text1" w:themeTint="A6"/>
-      <w:spacing w:val="15"/>
-      <w:sz w:val="28"/>
-      <w:szCs w:val="28"/>
-    </w:rPr>
-  </w:style>
-  <w:style w:type="character" w:customStyle="1" w:styleId="UntertitelZchn">
-    <w:name w:val="Untertitel Zchn"/>
-    <w:basedOn w:val="Absatz-Standardschriftart"/>
-    <w:link w:val="Untertitel"/>
-    <w:uiPriority w:val="11"/>
-    <w:rsid w:val="006849E1"/>
-    <w:rPr>
-      <w:rFonts w:eastAsiaTheme="majorEastAsia" w:cstheme="majorBidi"/>
-      <w:color w:val="595959" w:themeColor="text1" w:themeTint="A6"/>
-      <w:spacing w:val="15"/>
-      <w:sz w:val="28"/>
-      <w:szCs w:val="28"/>
-    </w:rPr>
-  </w:style>
-  <w:style w:type="paragraph" w:styleId="Zitat">
-    <w:name w:val="Quote"/>
-    <w:basedOn w:val="Standard"/>
-    <w:next w:val="Standard"/>
-    <w:link w:val="ZitatZchn"/>
-    <w:uiPriority w:val="29"/>
-    <w:qFormat/>
-    <w:rsid w:val="006849E1"/>
-    <w:pPr>
-      <w:spacing w:before="160"/>
-      <w:jc w:val="center"/>
-    </w:pPr>
-    <w:rPr>
-      <w:i/>
-      <w:iCs/>
-      <w:color w:val="404040" w:themeColor="text1" w:themeTint="BF"/>
-    </w:rPr>
-  </w:style>
-  <w:style w:type="character" w:customStyle="1" w:styleId="ZitatZchn">
-    <w:name w:val="Zitat Zchn"/>
-    <w:basedOn w:val="Absatz-Standardschriftart"/>
-    <w:link w:val="Zitat"/>
-    <w:uiPriority w:val="29"/>
-    <w:rsid w:val="006849E1"/>
-    <w:rPr>
-      <w:i/>
-      <w:iCs/>
-      <w:color w:val="404040" w:themeColor="text1" w:themeTint="BF"/>
-    </w:rPr>
-  </w:style>
-  <w:style w:type="paragraph" w:styleId="Listenabsatz">
-    <w:name w:val="List Paragraph"/>
-    <w:basedOn w:val="Standard"/>
-    <w:uiPriority w:val="34"/>
-    <w:qFormat/>
-    <w:rsid w:val="006849E1"/>
-    <w:pPr>
-      <w:ind w:left="720"/>
-      <w:contextualSpacing/>
-    </w:pPr>
-  </w:style>
-  <w:style w:type="character" w:styleId="IntensiveHervorhebung">
-    <w:name w:val="Intense Emphasis"/>
-    <w:basedOn w:val="Absatz-Standardschriftart"/>
-    <w:uiPriority w:val="21"/>
-    <w:qFormat/>
-    <w:rsid w:val="006849E1"/>
-    <w:rPr>
-      <w:i/>
-      <w:iCs/>
-      <w:color w:val="2F5496" w:themeColor="accent1" w:themeShade="BF"/>
-    </w:rPr>
-  </w:style>
-  <w:style w:type="paragraph" w:styleId="IntensivesZitat">
-    <w:name w:val="Intense Quote"/>
-    <w:basedOn w:val="Standard"/>
-    <w:next w:val="Standard"/>
-    <w:link w:val="IntensivesZitatZchn"/>
-    <w:uiPriority w:val="30"/>
-    <w:qFormat/>
-    <w:rsid w:val="006849E1"/>
-    <w:pPr>
-      <w:pBdr>
-        <w:top w:val="single" w:sz="4" w:space="10" w:color="2F5496" w:themeColor="accent1" w:themeShade="BF"/>
-        <w:bottom w:val="single" w:sz="4" w:space="10" w:color="2F5496" w:themeColor="accent1" w:themeShade="BF"/>
-      </w:pBdr>
-      <w:spacing w:before="360" w:after="360"/>
-      <w:ind w:left="864" w:right="864"/>
-      <w:jc w:val="center"/>
-    </w:pPr>
-    <w:rPr>
-      <w:i/>
-      <w:iCs/>
-      <w:color w:val="2F5496" w:themeColor="accent1" w:themeShade="BF"/>
-    </w:rPr>
-  </w:style>
-  <w:style w:type="character" w:customStyle="1" w:styleId="IntensivesZitatZchn">
-    <w:name w:val="Intensives Zitat Zchn"/>
-    <w:basedOn w:val="Absatz-Standardschriftart"/>
-    <w:link w:val="IntensivesZitat"/>
-    <w:uiPriority w:val="30"/>
-    <w:rsid w:val="006849E1"/>
-    <w:rPr>
-      <w:i/>
-      <w:iCs/>
-      <w:color w:val="2F5496" w:themeColor="accent1" w:themeShade="BF"/>
-    </w:rPr>
-  </w:style>
-  <w:style w:type="character" w:styleId="IntensiverVerweis">
-    <w:name w:val="Intense Reference"/>
-    <w:basedOn w:val="Absatz-Standardschriftart"/>
-    <w:uiPriority w:val="32"/>
-    <w:qFormat/>
-    <w:rsid w:val="006849E1"/>
-    <w:rPr>
-      <w:b/>
-      <w:bCs/>
-      <w:smallCaps/>
-      <w:color w:val="2F5496" w:themeColor="accent1" w:themeShade="BF"/>
-      <w:spacing w:val="5"/>
-    </w:rPr>
-  </w:style>
-  <w:style w:type="paragraph" w:styleId="KeinLeerraum">
-    <w:name w:val="No Spacing"/>
-    <w:uiPriority w:val="1"/>
-    <w:qFormat/>
-    <w:rsid w:val="000C6D58"/>
-    <w:pPr>
-      <w:spacing w:after="0" w:line="240" w:lineRule="auto"/>
-    </w:pPr>
-  </w:style>
-  <w:style w:type="character" w:styleId="Hyperlink">
-    <w:name w:val="Hyperlink"/>
-    <w:basedOn w:val="Absatz-Standardschriftart"/>
-    <w:uiPriority w:val="99"/>
-    <w:unhideWhenUsed/>
-    <w:rsid w:val="00162472"/>
-    <w:rPr>
-      <w:color w:val="0563C1" w:themeColor="hyperlink"/>
-      <w:u w:val="single"/>
-    </w:rPr>
-  </w:style>
-  <w:style w:type="character" w:customStyle="1" w:styleId="UnresolvedMention">
-    <w:name w:val="Unresolved Mention"/>
+  <w:style w:type="character" w:customStyle="1" w:styleId="NichtaufgelsteErwhnung1">
+    <w:name w:val="Nicht aufgelöste Erwähnung1"/>
     <w:basedOn w:val="Absatz-Standardschriftart"/>
     <w:uiPriority w:val="99"/>
     <w:semiHidden/>
@@ -7758,7 +7609,7 @@
   <a:extraClrSchemeLst/>
   <a:extLst>
     <a:ext uri="{05A4C25C-085E-4340-85A3-A5531E510DB2}">
-      <thm15:themeFamily xmlns:thm15="http://schemas.microsoft.com/office/thememl/2012/main" xmlns="" name="Office Theme" id="{62F939B6-93AF-4DB8-9C6B-D6C7DFDC589F}" vid="{4A3C46E8-61CC-4603-A589-7422A47A8E4A}"/>
+      <thm15:themeFamily xmlns:thm15="http://schemas.microsoft.com/office/thememl/2012/main" name="Office Theme" id="{62F939B6-93AF-4DB8-9C6B-D6C7DFDC589F}" vid="{4A3C46E8-61CC-4603-A589-7422A47A8E4A}"/>
     </a:ext>
   </a:extLst>
 </a:theme>

</xml_diff>

<commit_message>
Updated RandomMovement to consider min and max values for a more dynamic check.
</commit_message>
<xml_diff>
--- a/documentation/Game_Design_Document.docx
+++ b/documentation/Game_Design_Document.docx
@@ -1666,25 +1666,6 @@
           <w:szCs w:val="28"/>
         </w:rPr>
       </w:pPr>
-      <w:r>
-        <w:rPr>
-          <w:rFonts w:asciiTheme="majorHAnsi" w:hAnsiTheme="majorHAnsi" w:cstheme="majorHAnsi"/>
-          <w:sz w:val="28"/>
-          <w:szCs w:val="28"/>
-        </w:rPr>
-        <w:t xml:space="preserve"> </w:t>
-      </w:r>
-    </w:p>
-    <w:p>
-      <w:pPr>
-        <w:pStyle w:val="KeinLeerraum"/>
-        <w:jc w:val="both"/>
-        <w:rPr>
-          <w:rFonts w:asciiTheme="majorHAnsi" w:hAnsiTheme="majorHAnsi" w:cstheme="majorHAnsi"/>
-          <w:sz w:val="28"/>
-          <w:szCs w:val="28"/>
-        </w:rPr>
-      </w:pPr>
     </w:p>
     <w:p>
       <w:pPr>
@@ -1705,6 +1686,197 @@
         <w:t>Technical Details</w:t>
       </w:r>
     </w:p>
+    <w:p>
+      <w:pPr>
+        <w:pStyle w:val="berschrift3"/>
+        <w:rPr>
+          <w:rStyle w:val="Fett"/>
+          <w:rFonts w:asciiTheme="majorHAnsi" w:hAnsiTheme="majorHAnsi" w:cstheme="majorHAnsi"/>
+          <w:bCs w:val="0"/>
+          <w:color w:val="auto"/>
+          <w:sz w:val="32"/>
+          <w:szCs w:val="32"/>
+        </w:rPr>
+      </w:pPr>
+      <w:proofErr w:type="spellStart"/>
+      <w:r>
+        <w:rPr>
+          <w:rStyle w:val="Fett"/>
+          <w:rFonts w:asciiTheme="majorHAnsi" w:hAnsiTheme="majorHAnsi" w:cstheme="majorHAnsi"/>
+          <w:bCs w:val="0"/>
+          <w:color w:val="auto"/>
+          <w:sz w:val="32"/>
+          <w:szCs w:val="32"/>
+        </w:rPr>
+        <w:t>Keybindings</w:t>
+      </w:r>
+      <w:proofErr w:type="spellEnd"/>
+    </w:p>
+    <w:p>
+      <w:pPr>
+        <w:pStyle w:val="Listenabsatz"/>
+        <w:numPr>
+          <w:ilvl w:val="0"/>
+          <w:numId w:val="19"/>
+        </w:numPr>
+        <w:rPr>
+          <w:lang w:val="en-US"/>
+        </w:rPr>
+      </w:pPr>
+      <w:r>
+        <w:rPr>
+          <w:lang w:val="en-US"/>
+        </w:rPr>
+        <w:t>„m“</w:t>
+      </w:r>
+      <w:r>
+        <w:rPr>
+          <w:lang w:val="en-US"/>
+        </w:rPr>
+        <w:t xml:space="preserve">   </w:t>
+      </w:r>
+      <w:r>
+        <w:rPr>
+          <w:lang w:val="en-US"/>
+        </w:rPr>
+        <w:t xml:space="preserve"> : </w:t>
+      </w:r>
+      <w:r>
+        <w:rPr>
+          <w:lang w:val="en-US"/>
+        </w:rPr>
+        <w:t>Zeigen</w:t>
+      </w:r>
+      <w:r>
+        <w:rPr>
+          <w:lang w:val="en-US"/>
+        </w:rPr>
+        <w:t xml:space="preserve"> </w:t>
+      </w:r>
+      <w:r>
+        <w:rPr>
+          <w:lang w:val="en-US"/>
+        </w:rPr>
+        <w:t>Spiel</w:t>
+      </w:r>
+      <w:r>
+        <w:rPr>
+          <w:lang w:val="en-US"/>
+        </w:rPr>
+        <w:t xml:space="preserve"> </w:t>
+      </w:r>
+      <w:r>
+        <w:rPr>
+          <w:lang w:val="en-US"/>
+        </w:rPr>
+        <w:t xml:space="preserve">functional </w:t>
+      </w:r>
+      <w:proofErr w:type="spellStart"/>
+      <w:r>
+        <w:rPr>
+          <w:lang w:val="en-US"/>
+        </w:rPr>
+        <w:t>Informationen</w:t>
+      </w:r>
+      <w:proofErr w:type="spellEnd"/>
+      <w:r>
+        <w:rPr>
+          <w:lang w:val="en-US"/>
+        </w:rPr>
+        <w:t xml:space="preserve"> an, </w:t>
+      </w:r>
+      <w:proofErr w:type="spellStart"/>
+      <w:r>
+        <w:rPr>
+          <w:lang w:val="en-US"/>
+        </w:rPr>
+        <w:t>wie</w:t>
+      </w:r>
+      <w:proofErr w:type="spellEnd"/>
+      <w:r>
+        <w:rPr>
+          <w:lang w:val="en-US"/>
+        </w:rPr>
+        <w:t xml:space="preserve"> Fps, Frames drawn, running time.</w:t>
+      </w:r>
+    </w:p>
+    <w:p>
+      <w:pPr>
+        <w:pStyle w:val="Listenabsatz"/>
+        <w:numPr>
+          <w:ilvl w:val="0"/>
+          <w:numId w:val="19"/>
+        </w:numPr>
+      </w:pPr>
+      <w:r>
+        <w:t xml:space="preserve">“b”      : Zeigen die </w:t>
+      </w:r>
+      <w:proofErr w:type="spellStart"/>
+      <w:r>
+        <w:t>Bounding</w:t>
+      </w:r>
+      <w:proofErr w:type="spellEnd"/>
+      <w:r>
+        <w:t xml:space="preserve"> Boxes, die die Entitäten umsch</w:t>
+      </w:r>
+      <w:r>
+        <w:t>lingen.</w:t>
+      </w:r>
+    </w:p>
+    <w:p>
+      <w:pPr>
+        <w:pStyle w:val="Listenabsatz"/>
+        <w:numPr>
+          <w:ilvl w:val="0"/>
+          <w:numId w:val="19"/>
+        </w:numPr>
+      </w:pPr>
+      <w:r>
+        <w:t xml:space="preserve">„i“       : Zeigen Informationen bezüglich den Spieler, wie Position und </w:t>
+      </w:r>
+      <w:proofErr w:type="spellStart"/>
+      <w:r>
+        <w:t>Bewegungrichtung</w:t>
+      </w:r>
+      <w:proofErr w:type="spellEnd"/>
+    </w:p>
+    <w:p>
+      <w:pPr>
+        <w:pStyle w:val="Listenabsatz"/>
+        <w:numPr>
+          <w:ilvl w:val="0"/>
+          <w:numId w:val="19"/>
+        </w:numPr>
+      </w:pPr>
+      <w:r>
+        <w:t xml:space="preserve"> „k“     : Wenn in </w:t>
+      </w:r>
+      <w:proofErr w:type="spellStart"/>
+      <w:r>
+        <w:t>BattleManager</w:t>
+      </w:r>
+      <w:proofErr w:type="spellEnd"/>
+      <w:r>
+        <w:t xml:space="preserve"> </w:t>
+      </w:r>
+      <w:proofErr w:type="spellStart"/>
+      <w:r>
+        <w:t>Kapmffenster</w:t>
+      </w:r>
+      <w:proofErr w:type="spellEnd"/>
+      <w:r>
+        <w:t xml:space="preserve">, tötet sofort den Feind und beenden den </w:t>
+      </w:r>
+    </w:p>
+    <w:p>
+      <w:pPr>
+        <w:pStyle w:val="Listenabsatz"/>
+      </w:pPr>
+      <w:r>
+        <w:t xml:space="preserve">              Kampf.</w:t>
+      </w:r>
+    </w:p>
+    <w:p/>
     <w:p>
       <w:pPr>
         <w:pStyle w:val="berschrift3"/>
@@ -1925,6 +2097,7 @@
           <w:sz w:val="28"/>
           <w:szCs w:val="28"/>
         </w:rPr>
+        <w:lastRenderedPageBreak/>
         <w:t>Multiplikation mit Skalar</w:t>
       </w:r>
     </w:p>
@@ -2033,7 +2206,6 @@
           <w:sz w:val="28"/>
           <w:szCs w:val="28"/>
         </w:rPr>
-        <w:lastRenderedPageBreak/>
         <w:t>Vec2d min</w:t>
       </w:r>
       <w:r>
@@ -2655,6 +2827,7 @@
           <w:szCs w:val="28"/>
           <w:u w:val="single"/>
         </w:rPr>
+        <w:lastRenderedPageBreak/>
         <w:t>RandomNumberGenerator</w:t>
       </w:r>
       <w:proofErr w:type="spellEnd"/>
@@ -2699,7 +2872,6 @@
         </w:rPr>
       </w:pPr>
       <w:proofErr w:type="spellStart"/>
-      <w:proofErr w:type="gramStart"/>
       <w:r>
         <w:rPr>
           <w:rFonts w:asciiTheme="majorHAnsi" w:hAnsiTheme="majorHAnsi" w:cstheme="majorHAnsi"/>
@@ -2718,7 +2890,6 @@
         <w:t>(</w:t>
       </w:r>
       <w:proofErr w:type="spellStart"/>
-      <w:proofErr w:type="gramEnd"/>
       <w:r>
         <w:rPr>
           <w:rFonts w:asciiTheme="majorHAnsi" w:hAnsiTheme="majorHAnsi" w:cstheme="majorHAnsi"/>
@@ -2781,7 +2952,6 @@
           <w:szCs w:val="28"/>
           <w:u w:val="single"/>
         </w:rPr>
-        <w:lastRenderedPageBreak/>
         <w:t>MersenneTwister</w:t>
       </w:r>
       <w:proofErr w:type="spellEnd"/>
@@ -2822,7 +2992,6 @@
         <w:t xml:space="preserve"> Klasse und deklariert die Methode </w:t>
       </w:r>
       <w:proofErr w:type="spellStart"/>
-      <w:proofErr w:type="gramStart"/>
       <w:r>
         <w:rPr>
           <w:rFonts w:asciiTheme="majorHAnsi" w:hAnsiTheme="majorHAnsi" w:cstheme="majorHAnsi"/>
@@ -2841,7 +3010,6 @@
         <w:t>(</w:t>
       </w:r>
       <w:proofErr w:type="spellStart"/>
-      <w:proofErr w:type="gramEnd"/>
       <w:r>
         <w:rPr>
           <w:rFonts w:asciiTheme="majorHAnsi" w:hAnsiTheme="majorHAnsi" w:cstheme="majorHAnsi"/>
@@ -2893,25 +3061,7 @@
           <w:sz w:val="28"/>
           <w:szCs w:val="28"/>
         </w:rPr>
-        <w:t xml:space="preserve">). Gibt ein </w:t>
-      </w:r>
-      <w:proofErr w:type="gramStart"/>
-      <w:r>
-        <w:rPr>
-          <w:rFonts w:asciiTheme="majorHAnsi" w:hAnsiTheme="majorHAnsi" w:cstheme="majorHAnsi"/>
-          <w:sz w:val="28"/>
-          <w:szCs w:val="28"/>
-        </w:rPr>
-        <w:t>Integer</w:t>
-      </w:r>
-      <w:proofErr w:type="gramEnd"/>
-      <w:r>
-        <w:rPr>
-          <w:rFonts w:asciiTheme="majorHAnsi" w:hAnsiTheme="majorHAnsi" w:cstheme="majorHAnsi"/>
-          <w:sz w:val="28"/>
-          <w:szCs w:val="28"/>
-        </w:rPr>
-        <w:t xml:space="preserve"> zwischen min und </w:t>
+        <w:t xml:space="preserve">). Gibt ein Integer zwischen min und </w:t>
       </w:r>
       <w:proofErr w:type="spellStart"/>
       <w:r>
@@ -3063,25 +3213,7 @@
           <w:sz w:val="28"/>
           <w:szCs w:val="28"/>
         </w:rPr>
-        <w:t xml:space="preserve"> </w:t>
-      </w:r>
-      <w:proofErr w:type="gramStart"/>
-      <w:r>
-        <w:rPr>
-          <w:rFonts w:asciiTheme="majorHAnsi" w:hAnsiTheme="majorHAnsi" w:cstheme="majorHAnsi"/>
-          <w:sz w:val="28"/>
-          <w:szCs w:val="28"/>
-        </w:rPr>
-        <w:t>Klasse</w:t>
-      </w:r>
-      <w:proofErr w:type="gramEnd"/>
-      <w:r>
-        <w:rPr>
-          <w:rFonts w:asciiTheme="majorHAnsi" w:hAnsiTheme="majorHAnsi" w:cstheme="majorHAnsi"/>
-          <w:sz w:val="28"/>
-          <w:szCs w:val="28"/>
-        </w:rPr>
-        <w:t xml:space="preserve"> um zufällige Werte für die Kindklassen verfügbar zu stellen.</w:t>
+        <w:t xml:space="preserve"> Klasse um zufällige Werte für die Kindklassen verfügbar zu stellen.</w:t>
       </w:r>
     </w:p>
     <w:p>
@@ -3491,6 +3623,7 @@
           <w:sz w:val="28"/>
           <w:szCs w:val="28"/>
         </w:rPr>
+        <w:lastRenderedPageBreak/>
         <w:drawing>
           <wp:inline distT="0" distB="0" distL="0" distR="0" wp14:anchorId="2C941A41" wp14:editId="4E8C884A">
             <wp:extent cx="5760720" cy="1642595"/>
@@ -6120,6 +6253,119 @@
     </w:lvl>
   </w:abstractNum>
   <w:abstractNum w:abstractNumId="17" w15:restartNumberingAfterBreak="0">
+    <w:nsid w:val="6D52304C"/>
+    <w:multiLevelType w:val="hybridMultilevel"/>
+    <w:tmpl w:val="1C487A24"/>
+    <w:lvl w:ilvl="0" w:tplc="0C070001">
+      <w:start w:val="1"/>
+      <w:numFmt w:val="bullet"/>
+      <w:lvlText w:val=""/>
+      <w:lvlJc w:val="left"/>
+      <w:pPr>
+        <w:ind w:left="720" w:hanging="360"/>
+      </w:pPr>
+      <w:rPr>
+        <w:rFonts w:ascii="Symbol" w:hAnsi="Symbol" w:hint="default"/>
+      </w:rPr>
+    </w:lvl>
+    <w:lvl w:ilvl="1" w:tplc="0C070003" w:tentative="1">
+      <w:start w:val="1"/>
+      <w:numFmt w:val="bullet"/>
+      <w:lvlText w:val="o"/>
+      <w:lvlJc w:val="left"/>
+      <w:pPr>
+        <w:ind w:left="1440" w:hanging="360"/>
+      </w:pPr>
+      <w:rPr>
+        <w:rFonts w:ascii="Courier New" w:hAnsi="Courier New" w:cs="Courier New" w:hint="default"/>
+      </w:rPr>
+    </w:lvl>
+    <w:lvl w:ilvl="2" w:tplc="0C070005" w:tentative="1">
+      <w:start w:val="1"/>
+      <w:numFmt w:val="bullet"/>
+      <w:lvlText w:val=""/>
+      <w:lvlJc w:val="left"/>
+      <w:pPr>
+        <w:ind w:left="2160" w:hanging="360"/>
+      </w:pPr>
+      <w:rPr>
+        <w:rFonts w:ascii="Wingdings" w:hAnsi="Wingdings" w:hint="default"/>
+      </w:rPr>
+    </w:lvl>
+    <w:lvl w:ilvl="3" w:tplc="0C070001" w:tentative="1">
+      <w:start w:val="1"/>
+      <w:numFmt w:val="bullet"/>
+      <w:lvlText w:val=""/>
+      <w:lvlJc w:val="left"/>
+      <w:pPr>
+        <w:ind w:left="2880" w:hanging="360"/>
+      </w:pPr>
+      <w:rPr>
+        <w:rFonts w:ascii="Symbol" w:hAnsi="Symbol" w:hint="default"/>
+      </w:rPr>
+    </w:lvl>
+    <w:lvl w:ilvl="4" w:tplc="0C070003" w:tentative="1">
+      <w:start w:val="1"/>
+      <w:numFmt w:val="bullet"/>
+      <w:lvlText w:val="o"/>
+      <w:lvlJc w:val="left"/>
+      <w:pPr>
+        <w:ind w:left="3600" w:hanging="360"/>
+      </w:pPr>
+      <w:rPr>
+        <w:rFonts w:ascii="Courier New" w:hAnsi="Courier New" w:cs="Courier New" w:hint="default"/>
+      </w:rPr>
+    </w:lvl>
+    <w:lvl w:ilvl="5" w:tplc="0C070005" w:tentative="1">
+      <w:start w:val="1"/>
+      <w:numFmt w:val="bullet"/>
+      <w:lvlText w:val=""/>
+      <w:lvlJc w:val="left"/>
+      <w:pPr>
+        <w:ind w:left="4320" w:hanging="360"/>
+      </w:pPr>
+      <w:rPr>
+        <w:rFonts w:ascii="Wingdings" w:hAnsi="Wingdings" w:hint="default"/>
+      </w:rPr>
+    </w:lvl>
+    <w:lvl w:ilvl="6" w:tplc="0C070001" w:tentative="1">
+      <w:start w:val="1"/>
+      <w:numFmt w:val="bullet"/>
+      <w:lvlText w:val=""/>
+      <w:lvlJc w:val="left"/>
+      <w:pPr>
+        <w:ind w:left="5040" w:hanging="360"/>
+      </w:pPr>
+      <w:rPr>
+        <w:rFonts w:ascii="Symbol" w:hAnsi="Symbol" w:hint="default"/>
+      </w:rPr>
+    </w:lvl>
+    <w:lvl w:ilvl="7" w:tplc="0C070003" w:tentative="1">
+      <w:start w:val="1"/>
+      <w:numFmt w:val="bullet"/>
+      <w:lvlText w:val="o"/>
+      <w:lvlJc w:val="left"/>
+      <w:pPr>
+        <w:ind w:left="5760" w:hanging="360"/>
+      </w:pPr>
+      <w:rPr>
+        <w:rFonts w:ascii="Courier New" w:hAnsi="Courier New" w:cs="Courier New" w:hint="default"/>
+      </w:rPr>
+    </w:lvl>
+    <w:lvl w:ilvl="8" w:tplc="0C070005" w:tentative="1">
+      <w:start w:val="1"/>
+      <w:numFmt w:val="bullet"/>
+      <w:lvlText w:val=""/>
+      <w:lvlJc w:val="left"/>
+      <w:pPr>
+        <w:ind w:left="6480" w:hanging="360"/>
+      </w:pPr>
+      <w:rPr>
+        <w:rFonts w:ascii="Wingdings" w:hAnsi="Wingdings" w:hint="default"/>
+      </w:rPr>
+    </w:lvl>
+  </w:abstractNum>
+  <w:abstractNum w:abstractNumId="18" w15:restartNumberingAfterBreak="0">
     <w:nsid w:val="7F814B37"/>
     <w:multiLevelType w:val="hybridMultilevel"/>
     <w:tmpl w:val="64267058"/>
@@ -6233,7 +6479,7 @@
     </w:lvl>
   </w:abstractNum>
   <w:num w:numId="1" w16cid:durableId="889152929">
-    <w:abstractNumId w:val="17"/>
+    <w:abstractNumId w:val="18"/>
   </w:num>
   <w:num w:numId="2" w16cid:durableId="1550409964">
     <w:abstractNumId w:val="8"/>
@@ -6285,6 +6531,9 @@
   </w:num>
   <w:num w:numId="18" w16cid:durableId="1420909237">
     <w:abstractNumId w:val="1"/>
+  </w:num>
+  <w:num w:numId="19" w16cid:durableId="177892678">
+    <w:abstractNumId w:val="17"/>
   </w:num>
 </w:numbering>
 </file>
@@ -7239,7 +7488,6 @@
     <w:name w:val="Normal (Web)"/>
     <w:basedOn w:val="Standard"/>
     <w:uiPriority w:val="99"/>
-    <w:semiHidden/>
     <w:unhideWhenUsed/>
     <w:rsid w:val="00DF39A8"/>
     <w:pPr>

</xml_diff>

<commit_message>
Changed Terrain ASCII. Implemented a Quit dialog.
"Merged main to development. Development is now in most recent state."
</commit_message>
<xml_diff>
--- a/documentation/Game_Design_Document.docx
+++ b/documentation/Game_Design_Document.docx
@@ -80,7 +80,6 @@
           <w:lang w:val="en-US"/>
         </w:rPr>
       </w:pPr>
-      <w:proofErr w:type="spellStart"/>
       <w:r>
         <w:rPr>
           <w:rFonts w:asciiTheme="majorHAnsi" w:hAnsiTheme="majorHAnsi" w:cstheme="majorHAnsi"/>
@@ -91,7 +90,6 @@
         </w:rPr>
         <w:t>RetroBattle</w:t>
       </w:r>
-      <w:proofErr w:type="spellEnd"/>
     </w:p>
     <w:p>
       <w:pPr>
@@ -350,27 +348,7 @@
           <w:szCs w:val="28"/>
           <w:lang w:val="en-US"/>
         </w:rPr>
-        <w:t>Karabacek-</w:t>
-      </w:r>
-      <w:proofErr w:type="spellStart"/>
-      <w:r>
-        <w:rPr>
-          <w:rFonts w:asciiTheme="majorHAnsi" w:hAnsiTheme="majorHAnsi" w:cstheme="majorHAnsi"/>
-          <w:sz w:val="28"/>
-          <w:szCs w:val="28"/>
-          <w:lang w:val="en-US"/>
-        </w:rPr>
-        <w:t>Shahri</w:t>
-      </w:r>
-      <w:proofErr w:type="spellEnd"/>
-      <w:r>
-        <w:rPr>
-          <w:rFonts w:asciiTheme="majorHAnsi" w:hAnsiTheme="majorHAnsi" w:cstheme="majorHAnsi"/>
-          <w:sz w:val="28"/>
-          <w:szCs w:val="28"/>
-          <w:lang w:val="en-US"/>
-        </w:rPr>
-        <w:t xml:space="preserve"> Niloufar if25b137@technikum-wien.at</w:t>
+        <w:t>Karabacek-Shahri Niloufar if25b137@technikum-wien.at</w:t>
       </w:r>
     </w:p>
     <w:p>
@@ -413,23 +391,13 @@
           <w:szCs w:val="28"/>
         </w:rPr>
       </w:pPr>
-      <w:proofErr w:type="spellStart"/>
-      <w:r>
-        <w:rPr>
-          <w:rFonts w:asciiTheme="majorHAnsi" w:hAnsiTheme="majorHAnsi" w:cstheme="majorHAnsi"/>
-          <w:sz w:val="28"/>
-          <w:szCs w:val="28"/>
-        </w:rPr>
-        <w:t>Ermylos</w:t>
-      </w:r>
-      <w:proofErr w:type="spellEnd"/>
-      <w:r>
-        <w:rPr>
-          <w:rFonts w:asciiTheme="majorHAnsi" w:hAnsiTheme="majorHAnsi" w:cstheme="majorHAnsi"/>
-          <w:sz w:val="28"/>
-          <w:szCs w:val="28"/>
-        </w:rPr>
-        <w:t xml:space="preserve"> Schubart </w:t>
+      <w:r>
+        <w:rPr>
+          <w:rFonts w:asciiTheme="majorHAnsi" w:hAnsiTheme="majorHAnsi" w:cstheme="majorHAnsi"/>
+          <w:sz w:val="28"/>
+          <w:szCs w:val="28"/>
+        </w:rPr>
+        <w:t xml:space="preserve">Ermylos Schubart </w:t>
       </w:r>
       <w:r>
         <w:rPr>
@@ -986,18 +954,8 @@
           <w:sz w:val="48"/>
           <w:szCs w:val="48"/>
         </w:rPr>
-        <w:t xml:space="preserve">Game </w:t>
-      </w:r>
-      <w:proofErr w:type="spellStart"/>
-      <w:r>
-        <w:rPr>
-          <w:rFonts w:asciiTheme="majorHAnsi" w:hAnsiTheme="majorHAnsi" w:cstheme="majorHAnsi"/>
-          <w:sz w:val="48"/>
-          <w:szCs w:val="48"/>
-        </w:rPr>
-        <w:t>Mechanics</w:t>
-      </w:r>
-      <w:proofErr w:type="spellEnd"/>
+        <w:t>Game Mechanics</w:t>
+      </w:r>
     </w:p>
     <w:p>
       <w:pPr>
@@ -1698,7 +1656,6 @@
           <w:szCs w:val="32"/>
         </w:rPr>
       </w:pPr>
-      <w:proofErr w:type="spellStart"/>
       <w:r>
         <w:rPr>
           <w:rStyle w:val="Fett"/>
@@ -1710,7 +1667,6 @@
         </w:rPr>
         <w:t>Keybindings</w:t>
       </w:r>
-      <w:proofErr w:type="spellEnd"/>
     </w:p>
     <w:p>
       <w:pPr>
@@ -1769,35 +1725,7 @@
         <w:rPr>
           <w:lang w:val="en-US"/>
         </w:rPr>
-        <w:t xml:space="preserve">functional </w:t>
-      </w:r>
-      <w:proofErr w:type="spellStart"/>
-      <w:r>
-        <w:rPr>
-          <w:lang w:val="en-US"/>
-        </w:rPr>
-        <w:t>Informationen</w:t>
-      </w:r>
-      <w:proofErr w:type="spellEnd"/>
-      <w:r>
-        <w:rPr>
-          <w:lang w:val="en-US"/>
-        </w:rPr>
-        <w:t xml:space="preserve"> an, </w:t>
-      </w:r>
-      <w:proofErr w:type="spellStart"/>
-      <w:r>
-        <w:rPr>
-          <w:lang w:val="en-US"/>
-        </w:rPr>
-        <w:t>wie</w:t>
-      </w:r>
-      <w:proofErr w:type="spellEnd"/>
-      <w:r>
-        <w:rPr>
-          <w:lang w:val="en-US"/>
-        </w:rPr>
-        <w:t xml:space="preserve"> Fps, Frames drawn, running time.</w:t>
+        <w:t>functional Informationen an, wie Fps, Frames drawn, running time.</w:t>
       </w:r>
     </w:p>
     <w:p>
@@ -1809,15 +1737,7 @@
         </w:numPr>
       </w:pPr>
       <w:r>
-        <w:t xml:space="preserve">“b”      : Zeigen die </w:t>
-      </w:r>
-      <w:proofErr w:type="spellStart"/>
-      <w:r>
-        <w:t>Bounding</w:t>
-      </w:r>
-      <w:proofErr w:type="spellEnd"/>
-      <w:r>
-        <w:t xml:space="preserve"> Boxes, die die Entitäten umsch</w:t>
+        <w:t>“b”      : Zeigen die Bounding Boxes, die die Entitäten umsch</w:t>
       </w:r>
       <w:r>
         <w:t>lingen.</w:t>
@@ -1832,13 +1752,8 @@
         </w:numPr>
       </w:pPr>
       <w:r>
-        <w:t xml:space="preserve">„i“       : Zeigen Informationen bezüglich den Spieler, wie Position und </w:t>
-      </w:r>
-      <w:proofErr w:type="spellStart"/>
-      <w:r>
-        <w:t>Bewegungrichtung</w:t>
-      </w:r>
-      <w:proofErr w:type="spellEnd"/>
+        <w:t>„i“       : Zeigen Informationen bezüglich den Spieler, wie Position und Bewegungrichtung</w:t>
+      </w:r>
     </w:p>
     <w:p>
       <w:pPr>
@@ -1849,23 +1764,7 @@
         </w:numPr>
       </w:pPr>
       <w:r>
-        <w:t xml:space="preserve"> „k“     : Wenn in </w:t>
-      </w:r>
-      <w:proofErr w:type="spellStart"/>
-      <w:r>
-        <w:t>BattleManager</w:t>
-      </w:r>
-      <w:proofErr w:type="spellEnd"/>
-      <w:r>
-        <w:t xml:space="preserve"> </w:t>
-      </w:r>
-      <w:proofErr w:type="spellStart"/>
-      <w:r>
-        <w:t>Kapmffenster</w:t>
-      </w:r>
-      <w:proofErr w:type="spellEnd"/>
-      <w:r>
-        <w:t xml:space="preserve">, tötet sofort den Feind und beenden den </w:t>
+        <w:t xml:space="preserve"> „k“     : Wenn in BattleManager Kapmffenster, tötet sofort den Feind und beenden den </w:t>
       </w:r>
     </w:p>
     <w:p>
@@ -1874,6 +1773,39 @@
       </w:pPr>
       <w:r>
         <w:t xml:space="preserve">              Kampf.</w:t>
+      </w:r>
+    </w:p>
+    <w:p>
+      <w:pPr>
+        <w:pStyle w:val="Listenabsatz"/>
+        <w:numPr>
+          <w:ilvl w:val="0"/>
+          <w:numId w:val="19"/>
+        </w:numPr>
+      </w:pPr>
+      <w:r>
+        <w:t>„</w:t>
+      </w:r>
+      <w:r>
+        <w:t>l</w:t>
+      </w:r>
+      <w:r>
+        <w:t xml:space="preserve">“     : Wenn in BattleManager Kapmffenster, </w:t>
+      </w:r>
+      <w:r>
+        <w:t>der Feind gewinnt den Kampf.</w:t>
+      </w:r>
+    </w:p>
+    <w:p>
+      <w:pPr>
+        <w:pStyle w:val="Listenabsatz"/>
+        <w:numPr>
+          <w:ilvl w:val="0"/>
+          <w:numId w:val="19"/>
+        </w:numPr>
+      </w:pPr>
+      <w:r>
+        <w:t>„x“     : Beendet das Spiel.</w:t>
       </w:r>
     </w:p>
     <w:p/>
@@ -2053,6 +1985,7 @@
           <w:sz w:val="28"/>
           <w:szCs w:val="28"/>
         </w:rPr>
+        <w:lastRenderedPageBreak/>
         <w:t>Betrag</w:t>
       </w:r>
     </w:p>
@@ -2097,7 +2030,6 @@
           <w:sz w:val="28"/>
           <w:szCs w:val="28"/>
         </w:rPr>
-        <w:lastRenderedPageBreak/>
         <w:t>Multiplikation mit Skalar</w:t>
       </w:r>
     </w:p>
@@ -2164,19 +2096,8 @@
           <w:sz w:val="28"/>
           <w:szCs w:val="28"/>
         </w:rPr>
-        <w:t xml:space="preserve">Vec2d </w:t>
-      </w:r>
-      <w:proofErr w:type="spellStart"/>
-      <w:r>
-        <w:rPr>
-          <w:rStyle w:val="HTMLCode"/>
-          <w:rFonts w:asciiTheme="majorHAnsi" w:eastAsiaTheme="majorEastAsia" w:hAnsiTheme="majorHAnsi" w:cstheme="majorHAnsi"/>
-          <w:sz w:val="28"/>
-          <w:szCs w:val="28"/>
-        </w:rPr>
-        <w:t>pos</w:t>
-      </w:r>
-      <w:proofErr w:type="spellEnd"/>
+        <w:t>Vec2d pos</w:t>
+      </w:r>
       <w:r>
         <w:rPr>
           <w:rFonts w:asciiTheme="majorHAnsi" w:hAnsiTheme="majorHAnsi" w:cstheme="majorHAnsi"/>
@@ -2216,7 +2137,6 @@
         </w:rPr>
         <w:t xml:space="preserve">, </w:t>
       </w:r>
-      <w:proofErr w:type="spellStart"/>
       <w:r>
         <w:rPr>
           <w:rStyle w:val="HTMLCode"/>
@@ -2226,32 +2146,13 @@
         </w:rPr>
         <w:t>max</w:t>
       </w:r>
-      <w:proofErr w:type="spellEnd"/>
-      <w:r>
-        <w:rPr>
-          <w:rFonts w:asciiTheme="majorHAnsi" w:hAnsiTheme="majorHAnsi" w:cstheme="majorHAnsi"/>
-          <w:sz w:val="28"/>
-          <w:szCs w:val="28"/>
-        </w:rPr>
-        <w:t xml:space="preserve"> – </w:t>
-      </w:r>
-      <w:proofErr w:type="spellStart"/>
-      <w:r>
-        <w:rPr>
-          <w:rFonts w:asciiTheme="majorHAnsi" w:hAnsiTheme="majorHAnsi" w:cstheme="majorHAnsi"/>
-          <w:sz w:val="28"/>
-          <w:szCs w:val="28"/>
-        </w:rPr>
-        <w:t>Bounding</w:t>
-      </w:r>
-      <w:proofErr w:type="spellEnd"/>
-      <w:r>
-        <w:rPr>
-          <w:rFonts w:asciiTheme="majorHAnsi" w:hAnsiTheme="majorHAnsi" w:cstheme="majorHAnsi"/>
-          <w:sz w:val="28"/>
-          <w:szCs w:val="28"/>
-        </w:rPr>
-        <w:t xml:space="preserve"> Box</w:t>
+      <w:r>
+        <w:rPr>
+          <w:rFonts w:asciiTheme="majorHAnsi" w:hAnsiTheme="majorHAnsi" w:cstheme="majorHAnsi"/>
+          <w:sz w:val="28"/>
+          <w:szCs w:val="28"/>
+        </w:rPr>
+        <w:t xml:space="preserve"> – Bounding Box</w:t>
       </w:r>
     </w:p>
     <w:p>
@@ -2282,18 +2183,8 @@
           <w:sz w:val="28"/>
           <w:szCs w:val="28"/>
         </w:rPr>
-        <w:t xml:space="preserve"> – eindeutige </w:t>
-      </w:r>
-      <w:proofErr w:type="spellStart"/>
-      <w:r>
-        <w:rPr>
-          <w:rFonts w:asciiTheme="majorHAnsi" w:hAnsiTheme="majorHAnsi" w:cstheme="majorHAnsi"/>
-          <w:sz w:val="28"/>
-          <w:szCs w:val="28"/>
-        </w:rPr>
-        <w:t>Instanzkennung</w:t>
-      </w:r>
-      <w:proofErr w:type="spellEnd"/>
+        <w:t xml:space="preserve"> – eindeutige Instanzkennung</w:t>
+      </w:r>
     </w:p>
     <w:p>
       <w:pPr>
@@ -2308,7 +2199,6 @@
           <w:szCs w:val="28"/>
         </w:rPr>
       </w:pPr>
-      <w:proofErr w:type="spellStart"/>
       <w:r>
         <w:rPr>
           <w:rStyle w:val="HTMLCode"/>
@@ -2316,17 +2206,7 @@
           <w:sz w:val="28"/>
           <w:szCs w:val="28"/>
         </w:rPr>
-        <w:t>drawSelf</w:t>
-      </w:r>
-      <w:proofErr w:type="spellEnd"/>
-      <w:r>
-        <w:rPr>
-          <w:rStyle w:val="HTMLCode"/>
-          <w:rFonts w:asciiTheme="majorHAnsi" w:eastAsiaTheme="majorEastAsia" w:hAnsiTheme="majorHAnsi" w:cstheme="majorHAnsi"/>
-          <w:sz w:val="28"/>
-          <w:szCs w:val="28"/>
-        </w:rPr>
-        <w:t>()</w:t>
+        <w:t>drawSelf()</w:t>
       </w:r>
       <w:r>
         <w:rPr>
@@ -2562,7 +2442,6 @@
           <w:rFonts w:asciiTheme="majorHAnsi" w:hAnsiTheme="majorHAnsi" w:cstheme="majorHAnsi"/>
         </w:rPr>
       </w:pPr>
-      <w:proofErr w:type="spellStart"/>
       <w:r>
         <w:rPr>
           <w:rStyle w:val="Fett"/>
@@ -2576,7 +2455,6 @@
         </w:rPr>
         <w:t>BattleManager</w:t>
       </w:r>
-      <w:proofErr w:type="spellEnd"/>
     </w:p>
     <w:p>
       <w:pPr>
@@ -2673,7 +2551,6 @@
           <w:u w:val="single"/>
         </w:rPr>
       </w:pPr>
-      <w:proofErr w:type="spellStart"/>
       <w:r>
         <w:rPr>
           <w:rStyle w:val="Fett"/>
@@ -2687,7 +2564,6 @@
         </w:rPr>
         <w:t>EntityManager</w:t>
       </w:r>
-      <w:proofErr w:type="spellEnd"/>
     </w:p>
     <w:p>
       <w:pPr>
@@ -2801,6 +2677,7 @@
           <w:sz w:val="28"/>
           <w:szCs w:val="28"/>
         </w:rPr>
+        <w:lastRenderedPageBreak/>
         <w:t>Kollisionserkennung</w:t>
       </w:r>
     </w:p>
@@ -2815,7 +2692,6 @@
           <w:u w:val="single"/>
         </w:rPr>
       </w:pPr>
-      <w:proofErr w:type="spellStart"/>
       <w:r>
         <w:rPr>
           <w:rStyle w:val="Fett"/>
@@ -2827,10 +2703,8 @@
           <w:szCs w:val="28"/>
           <w:u w:val="single"/>
         </w:rPr>
-        <w:lastRenderedPageBreak/>
         <w:t>RandomNumberGenerator</w:t>
       </w:r>
-      <w:proofErr w:type="spellEnd"/>
     </w:p>
     <w:p>
       <w:pPr>
@@ -2871,59 +2745,13 @@
           <w:szCs w:val="28"/>
         </w:rPr>
       </w:pPr>
-      <w:proofErr w:type="spellStart"/>
-      <w:r>
-        <w:rPr>
-          <w:rFonts w:asciiTheme="majorHAnsi" w:hAnsiTheme="majorHAnsi" w:cstheme="majorHAnsi"/>
-          <w:sz w:val="28"/>
-          <w:szCs w:val="28"/>
-        </w:rPr>
-        <w:t>getRandomNumber</w:t>
-      </w:r>
-      <w:proofErr w:type="spellEnd"/>
-      <w:r>
-        <w:rPr>
-          <w:rFonts w:asciiTheme="majorHAnsi" w:hAnsiTheme="majorHAnsi" w:cstheme="majorHAnsi"/>
-          <w:sz w:val="28"/>
-          <w:szCs w:val="28"/>
-        </w:rPr>
-        <w:t>(</w:t>
-      </w:r>
-      <w:proofErr w:type="spellStart"/>
-      <w:r>
-        <w:rPr>
-          <w:rFonts w:asciiTheme="majorHAnsi" w:hAnsiTheme="majorHAnsi" w:cstheme="majorHAnsi"/>
-          <w:sz w:val="28"/>
-          <w:szCs w:val="28"/>
-        </w:rPr>
-        <w:t>int</w:t>
-      </w:r>
-      <w:proofErr w:type="spellEnd"/>
-      <w:r>
-        <w:rPr>
-          <w:rFonts w:asciiTheme="majorHAnsi" w:hAnsiTheme="majorHAnsi" w:cstheme="majorHAnsi"/>
-          <w:sz w:val="28"/>
-          <w:szCs w:val="28"/>
-        </w:rPr>
-        <w:t xml:space="preserve"> von, </w:t>
-      </w:r>
-      <w:proofErr w:type="spellStart"/>
-      <w:r>
-        <w:rPr>
-          <w:rFonts w:asciiTheme="majorHAnsi" w:hAnsiTheme="majorHAnsi" w:cstheme="majorHAnsi"/>
-          <w:sz w:val="28"/>
-          <w:szCs w:val="28"/>
-        </w:rPr>
-        <w:t>int</w:t>
-      </w:r>
-      <w:proofErr w:type="spellEnd"/>
-      <w:r>
-        <w:rPr>
-          <w:rFonts w:asciiTheme="majorHAnsi" w:hAnsiTheme="majorHAnsi" w:cstheme="majorHAnsi"/>
-          <w:sz w:val="28"/>
-          <w:szCs w:val="28"/>
-        </w:rPr>
-        <w:t xml:space="preserve"> bis);</w:t>
+      <w:r>
+        <w:rPr>
+          <w:rFonts w:asciiTheme="majorHAnsi" w:hAnsiTheme="majorHAnsi" w:cstheme="majorHAnsi"/>
+          <w:sz w:val="28"/>
+          <w:szCs w:val="28"/>
+        </w:rPr>
+        <w:t>getRandomNumber(int von, int bis);</w:t>
       </w:r>
     </w:p>
     <w:p>
@@ -2940,7 +2768,6 @@
           <w:u w:val="single"/>
         </w:rPr>
       </w:pPr>
-      <w:proofErr w:type="spellStart"/>
       <w:r>
         <w:rPr>
           <w:rStyle w:val="Fett"/>
@@ -2954,7 +2781,6 @@
         </w:rPr>
         <w:t>MersenneTwister</w:t>
       </w:r>
-      <w:proofErr w:type="spellEnd"/>
     </w:p>
     <w:p>
       <w:pPr>
@@ -2971,124 +2797,7 @@
           <w:sz w:val="28"/>
           <w:szCs w:val="28"/>
         </w:rPr>
-        <w:t xml:space="preserve">Vererbt von der </w:t>
-      </w:r>
-      <w:proofErr w:type="spellStart"/>
-      <w:r>
-        <w:rPr>
-          <w:rFonts w:asciiTheme="majorHAnsi" w:hAnsiTheme="majorHAnsi" w:cstheme="majorHAnsi"/>
-          <w:sz w:val="28"/>
-          <w:szCs w:val="28"/>
-        </w:rPr>
-        <w:t>RandomNumberGenerator</w:t>
-      </w:r>
-      <w:proofErr w:type="spellEnd"/>
-      <w:r>
-        <w:rPr>
-          <w:rFonts w:asciiTheme="majorHAnsi" w:hAnsiTheme="majorHAnsi" w:cstheme="majorHAnsi"/>
-          <w:sz w:val="28"/>
-          <w:szCs w:val="28"/>
-        </w:rPr>
-        <w:t xml:space="preserve"> Klasse und deklariert die Methode </w:t>
-      </w:r>
-      <w:proofErr w:type="spellStart"/>
-      <w:r>
-        <w:rPr>
-          <w:rFonts w:asciiTheme="majorHAnsi" w:hAnsiTheme="majorHAnsi" w:cstheme="majorHAnsi"/>
-          <w:sz w:val="28"/>
-          <w:szCs w:val="28"/>
-        </w:rPr>
-        <w:t>getRandomNumber</w:t>
-      </w:r>
-      <w:proofErr w:type="spellEnd"/>
-      <w:r>
-        <w:rPr>
-          <w:rFonts w:asciiTheme="majorHAnsi" w:hAnsiTheme="majorHAnsi" w:cstheme="majorHAnsi"/>
-          <w:sz w:val="28"/>
-          <w:szCs w:val="28"/>
-        </w:rPr>
-        <w:t>(</w:t>
-      </w:r>
-      <w:proofErr w:type="spellStart"/>
-      <w:r>
-        <w:rPr>
-          <w:rFonts w:asciiTheme="majorHAnsi" w:hAnsiTheme="majorHAnsi" w:cstheme="majorHAnsi"/>
-          <w:sz w:val="28"/>
-          <w:szCs w:val="28"/>
-        </w:rPr>
-        <w:t>int</w:t>
-      </w:r>
-      <w:proofErr w:type="spellEnd"/>
-      <w:r>
-        <w:rPr>
-          <w:rFonts w:asciiTheme="majorHAnsi" w:hAnsiTheme="majorHAnsi" w:cstheme="majorHAnsi"/>
-          <w:sz w:val="28"/>
-          <w:szCs w:val="28"/>
-        </w:rPr>
-        <w:t xml:space="preserve"> min, </w:t>
-      </w:r>
-      <w:proofErr w:type="spellStart"/>
-      <w:r>
-        <w:rPr>
-          <w:rFonts w:asciiTheme="majorHAnsi" w:hAnsiTheme="majorHAnsi" w:cstheme="majorHAnsi"/>
-          <w:sz w:val="28"/>
-          <w:szCs w:val="28"/>
-        </w:rPr>
-        <w:t>int</w:t>
-      </w:r>
-      <w:proofErr w:type="spellEnd"/>
-      <w:r>
-        <w:rPr>
-          <w:rFonts w:asciiTheme="majorHAnsi" w:hAnsiTheme="majorHAnsi" w:cstheme="majorHAnsi"/>
-          <w:sz w:val="28"/>
-          <w:szCs w:val="28"/>
-        </w:rPr>
-        <w:t xml:space="preserve"> </w:t>
-      </w:r>
-      <w:proofErr w:type="spellStart"/>
-      <w:r>
-        <w:rPr>
-          <w:rFonts w:asciiTheme="majorHAnsi" w:hAnsiTheme="majorHAnsi" w:cstheme="majorHAnsi"/>
-          <w:sz w:val="28"/>
-          <w:szCs w:val="28"/>
-        </w:rPr>
-        <w:t>max</w:t>
-      </w:r>
-      <w:proofErr w:type="spellEnd"/>
-      <w:r>
-        <w:rPr>
-          <w:rFonts w:asciiTheme="majorHAnsi" w:hAnsiTheme="majorHAnsi" w:cstheme="majorHAnsi"/>
-          <w:sz w:val="28"/>
-          <w:szCs w:val="28"/>
-        </w:rPr>
-        <w:t xml:space="preserve">). Gibt ein Integer zwischen min und </w:t>
-      </w:r>
-      <w:proofErr w:type="spellStart"/>
-      <w:r>
-        <w:rPr>
-          <w:rFonts w:asciiTheme="majorHAnsi" w:hAnsiTheme="majorHAnsi" w:cstheme="majorHAnsi"/>
-          <w:sz w:val="28"/>
-          <w:szCs w:val="28"/>
-        </w:rPr>
-        <w:t>max</w:t>
-      </w:r>
-      <w:proofErr w:type="spellEnd"/>
-      <w:r>
-        <w:rPr>
-          <w:rFonts w:asciiTheme="majorHAnsi" w:hAnsiTheme="majorHAnsi" w:cstheme="majorHAnsi"/>
-          <w:sz w:val="28"/>
-          <w:szCs w:val="28"/>
-        </w:rPr>
-        <w:t xml:space="preserve"> </w:t>
-      </w:r>
-      <w:proofErr w:type="spellStart"/>
-      <w:r>
-        <w:rPr>
-          <w:rFonts w:asciiTheme="majorHAnsi" w:hAnsiTheme="majorHAnsi" w:cstheme="majorHAnsi"/>
-          <w:sz w:val="28"/>
-          <w:szCs w:val="28"/>
-        </w:rPr>
-        <w:t>zur</w:t>
+        <w:t>Vererbt von der RandomNumberGenerator Klasse und deklariert die Methode getRandomNumber(int min, int max). Gibt ein Integer zwischen min und max zur</w:t>
       </w:r>
       <w:r>
         <w:rPr>
@@ -3104,34 +2813,7 @@
           <w:sz w:val="28"/>
           <w:szCs w:val="28"/>
         </w:rPr>
-        <w:t>ück</w:t>
-      </w:r>
-      <w:proofErr w:type="spellEnd"/>
-      <w:r>
-        <w:rPr>
-          <w:rFonts w:asciiTheme="majorHAnsi" w:hAnsiTheme="majorHAnsi" w:cstheme="majorHAnsi"/>
-          <w:sz w:val="28"/>
-          <w:szCs w:val="28"/>
-        </w:rPr>
-        <w:t xml:space="preserve">, mit min und </w:t>
-      </w:r>
-      <w:proofErr w:type="spellStart"/>
-      <w:r>
-        <w:rPr>
-          <w:rFonts w:asciiTheme="majorHAnsi" w:hAnsiTheme="majorHAnsi" w:cstheme="majorHAnsi"/>
-          <w:sz w:val="28"/>
-          <w:szCs w:val="28"/>
-        </w:rPr>
-        <w:t>max</w:t>
-      </w:r>
-      <w:proofErr w:type="spellEnd"/>
-      <w:r>
-        <w:rPr>
-          <w:rFonts w:asciiTheme="majorHAnsi" w:hAnsiTheme="majorHAnsi" w:cstheme="majorHAnsi"/>
-          <w:sz w:val="28"/>
-          <w:szCs w:val="28"/>
-        </w:rPr>
-        <w:t xml:space="preserve"> auch inbegriffen.</w:t>
+        <w:t>ück, mit min und max auch inbegriffen.</w:t>
       </w:r>
     </w:p>
     <w:p>
@@ -3177,43 +2859,7 @@
           <w:sz w:val="28"/>
           <w:szCs w:val="28"/>
         </w:rPr>
-        <w:t xml:space="preserve">Basis Klasse um verschiedene Bewegungen zu </w:t>
-      </w:r>
-      <w:proofErr w:type="spellStart"/>
-      <w:r>
-        <w:rPr>
-          <w:rFonts w:asciiTheme="majorHAnsi" w:hAnsiTheme="majorHAnsi" w:cstheme="majorHAnsi"/>
-          <w:sz w:val="28"/>
-          <w:szCs w:val="28"/>
-        </w:rPr>
-        <w:t>kapsulieren</w:t>
-      </w:r>
-      <w:proofErr w:type="spellEnd"/>
-      <w:r>
-        <w:rPr>
-          <w:rFonts w:asciiTheme="majorHAnsi" w:hAnsiTheme="majorHAnsi" w:cstheme="majorHAnsi"/>
-          <w:sz w:val="28"/>
-          <w:szCs w:val="28"/>
-        </w:rPr>
-        <w:t xml:space="preserve">. Alle die Bewegungen erben von dieser Klasse. Enthält eine </w:t>
-      </w:r>
-      <w:proofErr w:type="spellStart"/>
-      <w:r>
-        <w:rPr>
-          <w:rFonts w:asciiTheme="majorHAnsi" w:hAnsiTheme="majorHAnsi" w:cstheme="majorHAnsi"/>
-          <w:sz w:val="28"/>
-          <w:szCs w:val="28"/>
-        </w:rPr>
-        <w:t>MerseneTwister</w:t>
-      </w:r>
-      <w:proofErr w:type="spellEnd"/>
-      <w:r>
-        <w:rPr>
-          <w:rFonts w:asciiTheme="majorHAnsi" w:hAnsiTheme="majorHAnsi" w:cstheme="majorHAnsi"/>
-          <w:sz w:val="28"/>
-          <w:szCs w:val="28"/>
-        </w:rPr>
-        <w:t xml:space="preserve"> Klasse um zufällige Werte für die Kindklassen verfügbar zu stellen.</w:t>
+        <w:t>Basis Klasse um verschiedene Bewegungen zu kapsulieren. Alle die Bewegungen erben von dieser Klasse. Enthält eine MerseneTwister Klasse um zufällige Werte für die Kindklassen verfügbar zu stellen.</w:t>
       </w:r>
     </w:p>
     <w:p>
@@ -3250,7 +2896,6 @@
           <w:szCs w:val="28"/>
         </w:rPr>
       </w:pPr>
-      <w:proofErr w:type="spellStart"/>
       <w:r>
         <w:rPr>
           <w:rStyle w:val="Fett"/>
@@ -3259,18 +2904,7 @@
           <w:sz w:val="28"/>
           <w:szCs w:val="28"/>
         </w:rPr>
-        <w:t>Bounding</w:t>
-      </w:r>
-      <w:proofErr w:type="spellEnd"/>
-      <w:r>
-        <w:rPr>
-          <w:rStyle w:val="Fett"/>
-          <w:rFonts w:asciiTheme="majorHAnsi" w:eastAsiaTheme="majorEastAsia" w:hAnsiTheme="majorHAnsi" w:cstheme="majorHAnsi"/>
-          <w:b w:val="0"/>
-          <w:sz w:val="28"/>
-          <w:szCs w:val="28"/>
-        </w:rPr>
-        <w:t xml:space="preserve"> Box</w:t>
+        <w:t>Bounding Box</w:t>
       </w:r>
     </w:p>
     <w:p>
@@ -3432,7 +3066,6 @@
           <w:szCs w:val="32"/>
         </w:rPr>
       </w:pPr>
-      <w:proofErr w:type="spellStart"/>
       <w:r>
         <w:rPr>
           <w:rStyle w:val="Fett"/>
@@ -3440,17 +3073,7 @@
           <w:sz w:val="32"/>
           <w:szCs w:val="32"/>
         </w:rPr>
-        <w:t>Ascii</w:t>
-      </w:r>
-      <w:proofErr w:type="spellEnd"/>
-      <w:r>
-        <w:rPr>
-          <w:rStyle w:val="Fett"/>
-          <w:color w:val="auto"/>
-          <w:sz w:val="32"/>
-          <w:szCs w:val="32"/>
-        </w:rPr>
-        <w:t xml:space="preserve"> Art Assets:</w:t>
+        <w:t>Ascii Art Assets:</w:t>
       </w:r>
     </w:p>
     <w:p>
@@ -3486,33 +3109,7 @@
           <w:szCs w:val="28"/>
         </w:rPr>
         <w:noBreakHyphen/>
-        <w:t>Art Rendering (</w:t>
-      </w:r>
-      <w:proofErr w:type="spellStart"/>
-      <w:r>
-        <w:rPr>
-          <w:rStyle w:val="Fett"/>
-          <w:rFonts w:cstheme="majorHAnsi"/>
-          <w:b w:val="0"/>
-          <w:bCs w:val="0"/>
-          <w:color w:val="auto"/>
-          <w:sz w:val="28"/>
-          <w:szCs w:val="28"/>
-        </w:rPr>
-        <w:t>PDCurses</w:t>
-      </w:r>
-      <w:proofErr w:type="spellEnd"/>
-      <w:r>
-        <w:rPr>
-          <w:rStyle w:val="Fett"/>
-          <w:rFonts w:cstheme="majorHAnsi"/>
-          <w:b w:val="0"/>
-          <w:bCs w:val="0"/>
-          <w:color w:val="auto"/>
-          <w:sz w:val="28"/>
-          <w:szCs w:val="28"/>
-        </w:rPr>
-        <w:t>)</w:t>
+        <w:t>Art Rendering (PDCurses)</w:t>
       </w:r>
     </w:p>
     <w:p>
@@ -3532,7 +3129,6 @@
         </w:rPr>
         <w:t xml:space="preserve">Die Darstellung erfolgt über </w:t>
       </w:r>
-      <w:proofErr w:type="spellStart"/>
       <w:r>
         <w:rPr>
           <w:rStyle w:val="HTMLCode"/>
@@ -3540,37 +3136,7 @@
           <w:sz w:val="28"/>
           <w:szCs w:val="28"/>
         </w:rPr>
-        <w:t>mvprintw</w:t>
-      </w:r>
-      <w:proofErr w:type="spellEnd"/>
-      <w:r>
-        <w:rPr>
-          <w:rStyle w:val="HTMLCode"/>
-          <w:rFonts w:asciiTheme="majorHAnsi" w:eastAsiaTheme="majorEastAsia" w:hAnsiTheme="majorHAnsi" w:cstheme="majorHAnsi"/>
-          <w:sz w:val="28"/>
-          <w:szCs w:val="28"/>
-        </w:rPr>
-        <w:t>(y, x, "</w:t>
-      </w:r>
-      <w:proofErr w:type="spellStart"/>
-      <w:r>
-        <w:rPr>
-          <w:rStyle w:val="HTMLCode"/>
-          <w:rFonts w:asciiTheme="majorHAnsi" w:eastAsiaTheme="majorEastAsia" w:hAnsiTheme="majorHAnsi" w:cstheme="majorHAnsi"/>
-          <w:sz w:val="28"/>
-          <w:szCs w:val="28"/>
-        </w:rPr>
-        <w:t>string</w:t>
-      </w:r>
-      <w:proofErr w:type="spellEnd"/>
-      <w:r>
-        <w:rPr>
-          <w:rStyle w:val="HTMLCode"/>
-          <w:rFonts w:asciiTheme="majorHAnsi" w:eastAsiaTheme="majorEastAsia" w:hAnsiTheme="majorHAnsi" w:cstheme="majorHAnsi"/>
-          <w:sz w:val="28"/>
-          <w:szCs w:val="28"/>
-        </w:rPr>
-        <w:t>")</w:t>
+        <w:t>mvprintw(y, x, "string")</w:t>
       </w:r>
       <w:r>
         <w:rPr>
@@ -3715,23 +3281,13 @@
           <w:szCs w:val="28"/>
         </w:rPr>
       </w:pPr>
-      <w:proofErr w:type="spellStart"/>
-      <w:r>
-        <w:rPr>
-          <w:rFonts w:asciiTheme="majorHAnsi" w:hAnsiTheme="majorHAnsi" w:cstheme="majorHAnsi"/>
-          <w:sz w:val="28"/>
-          <w:szCs w:val="28"/>
-        </w:rPr>
-        <w:t>RetroBattle</w:t>
-      </w:r>
-      <w:proofErr w:type="spellEnd"/>
-      <w:r>
-        <w:rPr>
-          <w:rFonts w:asciiTheme="majorHAnsi" w:hAnsiTheme="majorHAnsi" w:cstheme="majorHAnsi"/>
-          <w:sz w:val="28"/>
-          <w:szCs w:val="28"/>
-        </w:rPr>
-        <w:t xml:space="preserve"> ist ein 2D</w:t>
+      <w:r>
+        <w:rPr>
+          <w:rFonts w:asciiTheme="majorHAnsi" w:hAnsiTheme="majorHAnsi" w:cstheme="majorHAnsi"/>
+          <w:sz w:val="28"/>
+          <w:szCs w:val="28"/>
+        </w:rPr>
+        <w:t>RetroBattle ist ein 2D</w:t>
       </w:r>
       <w:r>
         <w:rPr>
@@ -6255,7 +5811,7 @@
   <w:abstractNum w:abstractNumId="17" w15:restartNumberingAfterBreak="0">
     <w:nsid w:val="6D52304C"/>
     <w:multiLevelType w:val="hybridMultilevel"/>
-    <w:tmpl w:val="1C487A24"/>
+    <w:tmpl w:val="5DD87A3A"/>
     <w:lvl w:ilvl="0" w:tplc="0C070001">
       <w:start w:val="1"/>
       <w:numFmt w:val="bullet"/>

</xml_diff>

<commit_message>
Design document BattleManager Class bulletpoints.
</commit_message>
<xml_diff>
--- a/documentation/Game_Design_Document.docx
+++ b/documentation/Game_Design_Document.docx
@@ -2479,7 +2479,7 @@
         <w:pStyle w:val="StandardWeb"/>
         <w:numPr>
           <w:ilvl w:val="0"/>
-          <w:numId w:val="14"/>
+          <w:numId w:val="20"/>
         </w:numPr>
         <w:rPr>
           <w:rFonts w:asciiTheme="majorHAnsi" w:hAnsiTheme="majorHAnsi" w:cstheme="majorHAnsi"/>
@@ -2501,7 +2501,7 @@
         <w:pStyle w:val="StandardWeb"/>
         <w:numPr>
           <w:ilvl w:val="0"/>
-          <w:numId w:val="14"/>
+          <w:numId w:val="20"/>
         </w:numPr>
         <w:rPr>
           <w:rFonts w:asciiTheme="majorHAnsi" w:hAnsiTheme="majorHAnsi" w:cstheme="majorHAnsi"/>
@@ -2523,7 +2523,7 @@
         <w:pStyle w:val="StandardWeb"/>
         <w:numPr>
           <w:ilvl w:val="0"/>
-          <w:numId w:val="14"/>
+          <w:numId w:val="20"/>
         </w:numPr>
         <w:rPr>
           <w:rFonts w:asciiTheme="majorHAnsi" w:hAnsiTheme="majorHAnsi" w:cstheme="majorHAnsi"/>
@@ -2537,27 +2537,124 @@
           <w:sz w:val="28"/>
           <w:szCs w:val="28"/>
         </w:rPr>
-        <w:t>Schadensberechnung</w:t>
-      </w:r>
-    </w:p>
-    <w:p>
-      <w:pPr>
-        <w:pStyle w:val="berschrift4"/>
-        <w:rPr>
-          <w:rStyle w:val="Fett"/>
-          <w:color w:val="auto"/>
-          <w:sz w:val="28"/>
-          <w:szCs w:val="28"/>
-          <w:u w:val="single"/>
-        </w:rPr>
-      </w:pPr>
-      <w:r>
+        <w:t>Schadensberechnung: DMG = PWR + ATK – DEF</w:t>
+      </w:r>
+    </w:p>
+    <w:p>
+      <w:pPr>
+        <w:pStyle w:val="StandardWeb"/>
+        <w:numPr>
+          <w:ilvl w:val="1"/>
+          <w:numId w:val="20"/>
+        </w:numPr>
+        <w:rPr>
+          <w:rFonts w:asciiTheme="majorHAnsi" w:hAnsiTheme="majorHAnsi" w:cstheme="majorHAnsi"/>
+          <w:sz w:val="28"/>
+          <w:szCs w:val="28"/>
+          <w:lang w:val="en-GB"/>
+        </w:rPr>
+      </w:pPr>
+      <w:r>
+        <w:rPr>
+          <w:rFonts w:asciiTheme="majorHAnsi" w:hAnsiTheme="majorHAnsi" w:cstheme="majorHAnsi"/>
+          <w:sz w:val="28"/>
+          <w:szCs w:val="28"/>
+          <w:lang w:val="en-GB"/>
+        </w:rPr>
+        <w:t>DMG = Damage Received</w:t>
+      </w:r>
+    </w:p>
+    <w:p>
+      <w:pPr>
+        <w:pStyle w:val="StandardWeb"/>
+        <w:numPr>
+          <w:ilvl w:val="1"/>
+          <w:numId w:val="20"/>
+        </w:numPr>
+        <w:rPr>
+          <w:rFonts w:asciiTheme="majorHAnsi" w:hAnsiTheme="majorHAnsi" w:cstheme="majorHAnsi"/>
+          <w:sz w:val="28"/>
+          <w:szCs w:val="28"/>
+          <w:lang w:val="en-GB"/>
+        </w:rPr>
+      </w:pPr>
+      <w:r>
+        <w:rPr>
+          <w:rFonts w:asciiTheme="majorHAnsi" w:hAnsiTheme="majorHAnsi" w:cstheme="majorHAnsi"/>
+          <w:sz w:val="28"/>
+          <w:szCs w:val="28"/>
+          <w:lang w:val="en-GB"/>
+        </w:rPr>
+        <w:t>PWR = Move Power</w:t>
+      </w:r>
+    </w:p>
+    <w:p>
+      <w:pPr>
+        <w:pStyle w:val="StandardWeb"/>
+        <w:numPr>
+          <w:ilvl w:val="1"/>
+          <w:numId w:val="20"/>
+        </w:numPr>
+        <w:rPr>
+          <w:rFonts w:asciiTheme="majorHAnsi" w:hAnsiTheme="majorHAnsi" w:cstheme="majorHAnsi"/>
+          <w:sz w:val="28"/>
+          <w:szCs w:val="28"/>
+          <w:lang w:val="en-GB"/>
+        </w:rPr>
+      </w:pPr>
+      <w:r>
+        <w:rPr>
+          <w:rFonts w:asciiTheme="majorHAnsi" w:hAnsiTheme="majorHAnsi" w:cstheme="majorHAnsi"/>
+          <w:sz w:val="28"/>
+          <w:szCs w:val="28"/>
+          <w:lang w:val="en-GB"/>
+        </w:rPr>
+        <w:t>ATK = Attacker's Final Attack after buffs</w:t>
+      </w:r>
+    </w:p>
+    <w:p>
+      <w:pPr>
+        <w:pStyle w:val="StandardWeb"/>
+        <w:numPr>
+          <w:ilvl w:val="1"/>
+          <w:numId w:val="20"/>
+        </w:numPr>
+        <w:rPr>
+          <w:rFonts w:asciiTheme="majorHAnsi" w:hAnsiTheme="majorHAnsi" w:cstheme="majorHAnsi"/>
+          <w:sz w:val="28"/>
+          <w:szCs w:val="28"/>
+          <w:lang w:val="en-GB"/>
+        </w:rPr>
+      </w:pPr>
+      <w:r>
+        <w:rPr>
+          <w:rFonts w:asciiTheme="majorHAnsi" w:hAnsiTheme="majorHAnsi" w:cstheme="majorHAnsi"/>
+          <w:sz w:val="28"/>
+          <w:szCs w:val="28"/>
+          <w:lang w:val="en-GB"/>
+        </w:rPr>
+        <w:t>DEF = Receiver's Final Defense after buffs</w:t>
+      </w:r>
+    </w:p>
+    <w:p>
+      <w:pPr>
+        <w:pStyle w:val="StandardWeb"/>
         <w:rPr>
           <w:rStyle w:val="Fett"/>
           <w:rFonts w:asciiTheme="majorHAnsi" w:hAnsiTheme="majorHAnsi" w:cstheme="majorHAnsi"/>
           <w:b w:val="0"/>
           <w:bCs w:val="0"/>
-          <w:color w:val="auto"/>
+          <w:sz w:val="28"/>
+          <w:szCs w:val="28"/>
+          <w:lang w:val="de-AT"/>
+        </w:rPr>
+      </w:pPr>
+      <w:r>
+        <w:rPr>
+          <w:rStyle w:val="Fett"/>
+          <w:rFonts w:asciiTheme="majorHAnsi" w:hAnsiTheme="majorHAnsi" w:cstheme="majorHAnsi"/>
+          <w:b w:val="0"/>
+          <w:bCs w:val="0"/>
           <w:sz w:val="28"/>
           <w:szCs w:val="28"/>
           <w:u w:val="single"/>
@@ -2572,6 +2669,7 @@
           <w:rFonts w:asciiTheme="majorHAnsi" w:hAnsiTheme="majorHAnsi" w:cstheme="majorHAnsi"/>
           <w:sz w:val="28"/>
           <w:szCs w:val="28"/>
+          <w:lang w:val="de-AT"/>
         </w:rPr>
       </w:pPr>
       <w:r>
@@ -2602,6 +2700,7 @@
           <w:sz w:val="28"/>
           <w:szCs w:val="28"/>
         </w:rPr>
+        <w:lastRenderedPageBreak/>
         <w:t>Erzeugen &amp; Löschen</w:t>
       </w:r>
     </w:p>
@@ -2677,7 +2776,6 @@
           <w:sz w:val="28"/>
           <w:szCs w:val="28"/>
         </w:rPr>
-        <w:lastRenderedPageBreak/>
         <w:t>Kollisionserkennung</w:t>
       </w:r>
     </w:p>
@@ -3189,7 +3287,6 @@
           <w:sz w:val="28"/>
           <w:szCs w:val="28"/>
         </w:rPr>
-        <w:lastRenderedPageBreak/>
         <w:drawing>
           <wp:inline distT="0" distB="0" distL="0" distR="0" wp14:anchorId="2C941A41" wp14:editId="4E8C884A">
             <wp:extent cx="5760720" cy="1642595"/>
@@ -5083,7 +5180,7 @@
         <w:sz w:val="20"/>
       </w:rPr>
     </w:lvl>
-    <w:lvl w:ilvl="1" w:tentative="1">
+    <w:lvl w:ilvl="1">
       <w:start w:val="1"/>
       <w:numFmt w:val="bullet"/>
       <w:lvlText w:val="o"/>
@@ -6090,6 +6187,18 @@
   </w:num>
   <w:num w:numId="19" w16cid:durableId="177892678">
     <w:abstractNumId w:val="17"/>
+  </w:num>
+  <w:num w:numId="20" w16cid:durableId="906577850">
+    <w:abstractNumId w:val="12"/>
+    <w:lvlOverride w:ilvl="0"/>
+    <w:lvlOverride w:ilvl="1"/>
+    <w:lvlOverride w:ilvl="2"/>
+    <w:lvlOverride w:ilvl="3"/>
+    <w:lvlOverride w:ilvl="4"/>
+    <w:lvlOverride w:ilvl="5"/>
+    <w:lvlOverride w:ilvl="6"/>
+    <w:lvlOverride w:ilvl="7"/>
+    <w:lvlOverride w:ilvl="8"/>
   </w:num>
 </w:numbering>
 </file>
@@ -6695,7 +6804,6 @@
   <w:style w:type="character" w:default="1" w:styleId="Absatz-Standardschriftart">
     <w:name w:val="Default Paragraph Font"/>
     <w:uiPriority w:val="1"/>
-    <w:semiHidden/>
     <w:unhideWhenUsed/>
   </w:style>
   <w:style w:type="table" w:default="1" w:styleId="NormaleTabelle">

</xml_diff>